<commit_message>
docs(f3): informe institucional final integrado, verificacion de 114 pruebas y figuras empiricas
</commit_message>
<xml_diff>
--- a/docs/f3_s02_grupo6.docx
+++ b/docs/f3_s02_grupo6.docx
@@ -10,7 +10,7 @@
         <w:rPr>
           <w:b/>
           <w:color w:val="003366"/>
-          <w:sz w:val="23"/>
+          <w:sz w:val="22"/>
         </w:rPr>
         <w:t>UNIVERSIDAD ANDRÉS BELLO · UNAB ONLINE</w:t>
         <w:br/>
@@ -33,7 +33,7 @@
         <w:rPr>
           <w:b/>
           <w:color w:val="003366"/>
-          <w:sz w:val="33"/>
+          <w:sz w:val="30"/>
         </w:rPr>
         <w:t>INFORME TÉCNICO DE AVANCE · FASE 3</w:t>
         <w:br/>
@@ -48,16 +48,16 @@
         <w:rPr>
           <w:i/>
           <w:color w:val="555555"/>
-          <w:sz w:val="24"/>
+          <w:sz w:val="22"/>
         </w:rPr>
         <w:t>Proyecto: Duración de la titulación en el pregrado universitario chileno (2025)</w:t>
         <w:br/>
-        <w:t>Evaluación Sumativa 2 · Semana 2</w:t>
+        <w:t>Evaluación Sumativa 2 · Unidad 2</w:t>
       </w:r>
     </w:p>
     <w:p>
       <w:pPr>
-        <w:spacing w:after="520"/>
+        <w:spacing w:after="480"/>
       </w:pPr>
     </w:p>
     <w:tbl>
@@ -68,18 +68,18 @@
         <w:tblLook w:firstColumn="1" w:firstRow="1" w:lastColumn="0" w:lastRow="0" w:noHBand="0" w:noVBand="1" w:val="04A0"/>
       </w:tblPr>
       <w:tblGrid>
-        <w:gridCol w:w="4680"/>
-        <w:gridCol w:w="4680"/>
+        <w:gridCol w:w="4824"/>
+        <w:gridCol w:w="4824"/>
       </w:tblGrid>
       <w:tr>
         <w:tc>
           <w:tcPr>
             <w:tcW w:type="dxa" w:w="3600"/>
             <w:tcMar>
-              <w:top w:w="35" w:type="dxa"/>
-              <w:bottom w:w="35" w:type="dxa"/>
-              <w:left w:w="70" w:type="dxa"/>
-              <w:right w:w="70" w:type="dxa"/>
+              <w:top w:w="40" w:type="dxa"/>
+              <w:bottom w:w="40" w:type="dxa"/>
+              <w:left w:w="60" w:type="dxa"/>
+              <w:right w:w="60" w:type="dxa"/>
             </w:tcMar>
             <w:shd w:fill="F0F4F8"/>
           </w:tcPr>
@@ -87,7 +87,7 @@
             <w:r>
               <w:rPr>
                 <w:b/>
-                <w:sz w:val="20"/>
+                <w:sz w:val="19"/>
               </w:rPr>
               <w:t>Integrantes (Grupo 6):</w:t>
             </w:r>
@@ -97,17 +97,17 @@
           <w:tcPr>
             <w:tcW w:type="dxa" w:w="5760"/>
             <w:tcMar>
-              <w:top w:w="35" w:type="dxa"/>
-              <w:bottom w:w="35" w:type="dxa"/>
-              <w:left w:w="70" w:type="dxa"/>
-              <w:right w:w="70" w:type="dxa"/>
+              <w:top w:w="40" w:type="dxa"/>
+              <w:bottom w:w="40" w:type="dxa"/>
+              <w:left w:w="60" w:type="dxa"/>
+              <w:right w:w="60" w:type="dxa"/>
             </w:tcMar>
             <w:shd w:fill="FAFAFA"/>
           </w:tcPr>
           <w:p>
             <w:r>
               <w:rPr>
-                <w:sz w:val="20"/>
+                <w:sz w:val="19"/>
               </w:rPr>
               <w:t>Fernanda Ovalle Román</w:t>
               <w:br/>
@@ -125,10 +125,10 @@
           <w:tcPr>
             <w:tcW w:type="dxa" w:w="3600"/>
             <w:tcMar>
-              <w:top w:w="35" w:type="dxa"/>
-              <w:bottom w:w="35" w:type="dxa"/>
-              <w:left w:w="70" w:type="dxa"/>
-              <w:right w:w="70" w:type="dxa"/>
+              <w:top w:w="40" w:type="dxa"/>
+              <w:bottom w:w="40" w:type="dxa"/>
+              <w:left w:w="60" w:type="dxa"/>
+              <w:right w:w="60" w:type="dxa"/>
             </w:tcMar>
             <w:shd w:fill="F0F4F8"/>
           </w:tcPr>
@@ -136,7 +136,7 @@
             <w:r>
               <w:rPr>
                 <w:b/>
-                <w:sz w:val="20"/>
+                <w:sz w:val="19"/>
               </w:rPr>
               <w:t>Docente responsable:</w:t>
             </w:r>
@@ -146,17 +146,17 @@
           <w:tcPr>
             <w:tcW w:type="dxa" w:w="5760"/>
             <w:tcMar>
-              <w:top w:w="35" w:type="dxa"/>
-              <w:bottom w:w="35" w:type="dxa"/>
-              <w:left w:w="70" w:type="dxa"/>
-              <w:right w:w="70" w:type="dxa"/>
+              <w:top w:w="40" w:type="dxa"/>
+              <w:bottom w:w="40" w:type="dxa"/>
+              <w:left w:w="60" w:type="dxa"/>
+              <w:right w:w="60" w:type="dxa"/>
             </w:tcMar>
             <w:shd w:fill="FAFAFA"/>
           </w:tcPr>
           <w:p>
             <w:r>
               <w:rPr>
-                <w:sz w:val="20"/>
+                <w:sz w:val="19"/>
               </w:rPr>
               <w:t>Dr. Omar Salinas Silva</w:t>
             </w:r>
@@ -168,10 +168,10 @@
           <w:tcPr>
             <w:tcW w:type="dxa" w:w="3600"/>
             <w:tcMar>
-              <w:top w:w="35" w:type="dxa"/>
-              <w:bottom w:w="35" w:type="dxa"/>
-              <w:left w:w="70" w:type="dxa"/>
-              <w:right w:w="70" w:type="dxa"/>
+              <w:top w:w="40" w:type="dxa"/>
+              <w:bottom w:w="40" w:type="dxa"/>
+              <w:left w:w="60" w:type="dxa"/>
+              <w:right w:w="60" w:type="dxa"/>
             </w:tcMar>
             <w:shd w:fill="F0F4F8"/>
           </w:tcPr>
@@ -179,7 +179,7 @@
             <w:r>
               <w:rPr>
                 <w:b/>
-                <w:sz w:val="20"/>
+                <w:sz w:val="19"/>
               </w:rPr>
               <w:t>Programa académico:</w:t>
             </w:r>
@@ -189,17 +189,17 @@
           <w:tcPr>
             <w:tcW w:type="dxa" w:w="5760"/>
             <w:tcMar>
-              <w:top w:w="35" w:type="dxa"/>
-              <w:bottom w:w="35" w:type="dxa"/>
-              <w:left w:w="70" w:type="dxa"/>
-              <w:right w:w="70" w:type="dxa"/>
+              <w:top w:w="40" w:type="dxa"/>
+              <w:bottom w:w="40" w:type="dxa"/>
+              <w:left w:w="60" w:type="dxa"/>
+              <w:right w:w="60" w:type="dxa"/>
             </w:tcMar>
             <w:shd w:fill="FAFAFA"/>
           </w:tcPr>
           <w:p>
             <w:r>
               <w:rPr>
-                <w:sz w:val="20"/>
+                <w:sz w:val="19"/>
               </w:rPr>
               <w:t>Magíster en Ciencia de Datos e Inteligencia Artificial</w:t>
             </w:r>
@@ -211,10 +211,10 @@
           <w:tcPr>
             <w:tcW w:type="dxa" w:w="3600"/>
             <w:tcMar>
-              <w:top w:w="35" w:type="dxa"/>
-              <w:bottom w:w="35" w:type="dxa"/>
-              <w:left w:w="70" w:type="dxa"/>
-              <w:right w:w="70" w:type="dxa"/>
+              <w:top w:w="40" w:type="dxa"/>
+              <w:bottom w:w="40" w:type="dxa"/>
+              <w:left w:w="60" w:type="dxa"/>
+              <w:right w:w="60" w:type="dxa"/>
             </w:tcMar>
             <w:shd w:fill="F0F4F8"/>
           </w:tcPr>
@@ -222,7 +222,7 @@
             <w:r>
               <w:rPr>
                 <w:b/>
-                <w:sz w:val="20"/>
+                <w:sz w:val="19"/>
               </w:rPr>
               <w:t>Asignatura:</w:t>
             </w:r>
@@ -232,17 +232,17 @@
           <w:tcPr>
             <w:tcW w:type="dxa" w:w="5760"/>
             <w:tcMar>
-              <w:top w:w="35" w:type="dxa"/>
-              <w:bottom w:w="35" w:type="dxa"/>
-              <w:left w:w="70" w:type="dxa"/>
-              <w:right w:w="70" w:type="dxa"/>
+              <w:top w:w="40" w:type="dxa"/>
+              <w:bottom w:w="40" w:type="dxa"/>
+              <w:left w:w="60" w:type="dxa"/>
+              <w:right w:w="60" w:type="dxa"/>
             </w:tcMar>
             <w:shd w:fill="FAFAFA"/>
           </w:tcPr>
           <w:p>
             <w:r>
               <w:rPr>
-                <w:sz w:val="20"/>
+                <w:sz w:val="19"/>
               </w:rPr>
               <w:t>MCDI500 – Programación para la Ciencia de Datos</w:t>
             </w:r>
@@ -254,10 +254,10 @@
           <w:tcPr>
             <w:tcW w:type="dxa" w:w="3600"/>
             <w:tcMar>
-              <w:top w:w="35" w:type="dxa"/>
-              <w:bottom w:w="35" w:type="dxa"/>
-              <w:left w:w="70" w:type="dxa"/>
-              <w:right w:w="70" w:type="dxa"/>
+              <w:top w:w="40" w:type="dxa"/>
+              <w:bottom w:w="40" w:type="dxa"/>
+              <w:left w:w="60" w:type="dxa"/>
+              <w:right w:w="60" w:type="dxa"/>
             </w:tcMar>
             <w:shd w:fill="F0F4F8"/>
           </w:tcPr>
@@ -265,7 +265,7 @@
             <w:r>
               <w:rPr>
                 <w:b/>
-                <w:sz w:val="20"/>
+                <w:sz w:val="19"/>
               </w:rPr>
               <w:t>Institución:</w:t>
             </w:r>
@@ -275,17 +275,17 @@
           <w:tcPr>
             <w:tcW w:type="dxa" w:w="5760"/>
             <w:tcMar>
-              <w:top w:w="35" w:type="dxa"/>
-              <w:bottom w:w="35" w:type="dxa"/>
-              <w:left w:w="70" w:type="dxa"/>
-              <w:right w:w="70" w:type="dxa"/>
+              <w:top w:w="40" w:type="dxa"/>
+              <w:bottom w:w="40" w:type="dxa"/>
+              <w:left w:w="60" w:type="dxa"/>
+              <w:right w:w="60" w:type="dxa"/>
             </w:tcMar>
             <w:shd w:fill="FAFAFA"/>
           </w:tcPr>
           <w:p>
             <w:r>
               <w:rPr>
-                <w:sz w:val="20"/>
+                <w:sz w:val="19"/>
               </w:rPr>
               <w:t>Universidad Andrés Bello · UNAB Online</w:t>
             </w:r>
@@ -297,10 +297,10 @@
           <w:tcPr>
             <w:tcW w:type="dxa" w:w="3600"/>
             <w:tcMar>
-              <w:top w:w="35" w:type="dxa"/>
-              <w:bottom w:w="35" w:type="dxa"/>
-              <w:left w:w="70" w:type="dxa"/>
-              <w:right w:w="70" w:type="dxa"/>
+              <w:top w:w="40" w:type="dxa"/>
+              <w:bottom w:w="40" w:type="dxa"/>
+              <w:left w:w="60" w:type="dxa"/>
+              <w:right w:w="60" w:type="dxa"/>
             </w:tcMar>
             <w:shd w:fill="F0F4F8"/>
           </w:tcPr>
@@ -308,7 +308,7 @@
             <w:r>
               <w:rPr>
                 <w:b/>
-                <w:sz w:val="20"/>
+                <w:sz w:val="19"/>
               </w:rPr>
               <w:t>Fecha de entrega:</w:t>
             </w:r>
@@ -318,19 +318,19 @@
           <w:tcPr>
             <w:tcW w:type="dxa" w:w="5760"/>
             <w:tcMar>
-              <w:top w:w="35" w:type="dxa"/>
-              <w:bottom w:w="35" w:type="dxa"/>
-              <w:left w:w="70" w:type="dxa"/>
-              <w:right w:w="70" w:type="dxa"/>
+              <w:top w:w="40" w:type="dxa"/>
+              <w:bottom w:w="40" w:type="dxa"/>
+              <w:left w:w="60" w:type="dxa"/>
+              <w:right w:w="60" w:type="dxa"/>
             </w:tcMar>
             <w:shd w:fill="FAFAFA"/>
           </w:tcPr>
           <w:p>
             <w:r>
               <w:rPr>
-                <w:sz w:val="20"/>
+                <w:sz w:val="19"/>
               </w:rPr>
-              <w:t>25 de septiembre de 2026</w:t>
+              <w:t>27 de septiembre de 2026</w:t>
             </w:r>
           </w:p>
         </w:tc>
@@ -340,10 +340,10 @@
           <w:tcPr>
             <w:tcW w:type="dxa" w:w="3600"/>
             <w:tcMar>
-              <w:top w:w="35" w:type="dxa"/>
-              <w:bottom w:w="35" w:type="dxa"/>
-              <w:left w:w="70" w:type="dxa"/>
-              <w:right w:w="70" w:type="dxa"/>
+              <w:top w:w="40" w:type="dxa"/>
+              <w:bottom w:w="40" w:type="dxa"/>
+              <w:left w:w="60" w:type="dxa"/>
+              <w:right w:w="60" w:type="dxa"/>
             </w:tcMar>
             <w:shd w:fill="F0F4F8"/>
           </w:tcPr>
@@ -351,7 +351,7 @@
             <w:r>
               <w:rPr>
                 <w:b/>
-                <w:sz w:val="20"/>
+                <w:sz w:val="19"/>
               </w:rPr>
               <w:t>Repositorio GitHub:</w:t>
             </w:r>
@@ -361,17 +361,17 @@
           <w:tcPr>
             <w:tcW w:type="dxa" w:w="5760"/>
             <w:tcMar>
-              <w:top w:w="35" w:type="dxa"/>
-              <w:bottom w:w="35" w:type="dxa"/>
-              <w:left w:w="70" w:type="dxa"/>
-              <w:right w:w="70" w:type="dxa"/>
+              <w:top w:w="40" w:type="dxa"/>
+              <w:bottom w:w="40" w:type="dxa"/>
+              <w:left w:w="60" w:type="dxa"/>
+              <w:right w:w="60" w:type="dxa"/>
             </w:tcMar>
             <w:shd w:fill="FAFAFA"/>
           </w:tcPr>
           <w:p>
             <w:r>
               <w:rPr>
-                <w:sz w:val="20"/>
+                <w:sz w:val="19"/>
               </w:rPr>
               <w:t>https://github.com/Feroroman/proyecto-grupo6-mcdi500</w:t>
             </w:r>
@@ -386,7 +386,7 @@
     </w:p>
     <w:p>
       <w:pPr>
-        <w:spacing w:after="60"/>
+        <w:spacing w:after="80"/>
       </w:pPr>
       <w:r>
         <w:rPr>
@@ -404,13 +404,13 @@
         <w:tblLook w:firstColumn="1" w:firstRow="1" w:lastColumn="0" w:lastRow="0" w:noHBand="0" w:noVBand="1" w:val="04A0"/>
       </w:tblPr>
       <w:tblGrid>
-        <w:gridCol w:w="4680"/>
-        <w:gridCol w:w="4680"/>
+        <w:gridCol w:w="4824"/>
+        <w:gridCol w:w="4824"/>
       </w:tblGrid>
       <w:tr>
         <w:tc>
           <w:tcPr>
-            <w:tcW w:type="dxa" w:w="8352"/>
+            <w:tcW w:type="dxa" w:w="8496"/>
             <w:tcMar>
               <w:top w:w="15" w:type="dxa"/>
               <w:bottom w:w="15" w:type="dxa"/>
@@ -420,12 +420,12 @@
           </w:tcPr>
           <w:p>
             <w:pPr>
-              <w:spacing w:line="240" w:lineRule="auto" w:after="20"/>
+              <w:spacing w:line="240" w:lineRule="auto" w:before="0" w:after="20"/>
             </w:pPr>
             <w:r>
               <w:rPr>
                 <w:b/>
-                <w:sz w:val="19"/>
+                <w:sz w:val="17"/>
               </w:rPr>
               <w:t>I. Introducción y contextualización del avance</w:t>
             </w:r>
@@ -433,7 +433,7 @@
         </w:tc>
         <w:tc>
           <w:tcPr>
-            <w:tcW w:type="dxa" w:w="1008"/>
+            <w:tcW w:type="dxa" w:w="864"/>
             <w:tcMar>
               <w:top w:w="15" w:type="dxa"/>
               <w:bottom w:w="15" w:type="dxa"/>
@@ -443,13 +443,13 @@
           </w:tcPr>
           <w:p>
             <w:pPr>
-              <w:spacing w:line="240" w:lineRule="auto" w:after="20"/>
+              <w:spacing w:line="240" w:lineRule="auto" w:before="0" w:after="20"/>
               <w:jc w:val="right"/>
             </w:pPr>
             <w:r>
               <w:rPr>
                 <w:b/>
-                <w:sz w:val="19"/>
+                <w:sz w:val="17"/>
               </w:rPr>
               <w:t>3</w:t>
             </w:r>
@@ -459,7 +459,7 @@
       <w:tr>
         <w:tc>
           <w:tcPr>
-            <w:tcW w:type="dxa" w:w="8352"/>
+            <w:tcW w:type="dxa" w:w="8496"/>
             <w:tcMar>
               <w:top w:w="15" w:type="dxa"/>
               <w:bottom w:w="15" w:type="dxa"/>
@@ -469,12 +469,12 @@
           </w:tcPr>
           <w:p>
             <w:pPr>
-              <w:spacing w:line="240" w:lineRule="auto" w:after="20"/>
+              <w:spacing w:line="240" w:lineRule="auto" w:before="0" w:after="20"/>
             </w:pPr>
             <w:r>
               <w:rPr>
                 <w:b/>
-                <w:sz w:val="19"/>
+                <w:sz w:val="17"/>
               </w:rPr>
               <w:t>II. Conjunto de datos y estructuras para consumo algorítmico</w:t>
             </w:r>
@@ -482,7 +482,7 @@
         </w:tc>
         <w:tc>
           <w:tcPr>
-            <w:tcW w:type="dxa" w:w="1008"/>
+            <w:tcW w:type="dxa" w:w="864"/>
             <w:tcMar>
               <w:top w:w="15" w:type="dxa"/>
               <w:bottom w:w="15" w:type="dxa"/>
@@ -492,13 +492,13 @@
           </w:tcPr>
           <w:p>
             <w:pPr>
-              <w:spacing w:line="240" w:lineRule="auto" w:after="20"/>
+              <w:spacing w:line="240" w:lineRule="auto" w:before="0" w:after="20"/>
               <w:jc w:val="right"/>
             </w:pPr>
             <w:r>
               <w:rPr>
                 <w:b/>
-                <w:sz w:val="19"/>
+                <w:sz w:val="17"/>
               </w:rPr>
               <w:t>3</w:t>
             </w:r>
@@ -508,7 +508,7 @@
       <w:tr>
         <w:tc>
           <w:tcPr>
-            <w:tcW w:type="dxa" w:w="8352"/>
+            <w:tcW w:type="dxa" w:w="8496"/>
             <w:tcMar>
               <w:top w:w="15" w:type="dxa"/>
               <w:bottom w:w="15" w:type="dxa"/>
@@ -518,12 +518,12 @@
           </w:tcPr>
           <w:p>
             <w:pPr>
-              <w:spacing w:line="240" w:lineRule="auto" w:after="20"/>
+              <w:spacing w:line="240" w:lineRule="auto" w:before="0" w:after="20"/>
             </w:pPr>
             <w:r>
               <w:rPr>
                 <w:b/>
-                <w:sz w:val="19"/>
+                <w:sz w:val="17"/>
               </w:rPr>
               <w:t>III. Arquitectura modular y diseño orientado a objetos del pipeline</w:t>
             </w:r>
@@ -531,7 +531,7 @@
         </w:tc>
         <w:tc>
           <w:tcPr>
-            <w:tcW w:type="dxa" w:w="1008"/>
+            <w:tcW w:type="dxa" w:w="864"/>
             <w:tcMar>
               <w:top w:w="15" w:type="dxa"/>
               <w:bottom w:w="15" w:type="dxa"/>
@@ -541,13 +541,13 @@
           </w:tcPr>
           <w:p>
             <w:pPr>
-              <w:spacing w:line="240" w:lineRule="auto" w:after="20"/>
+              <w:spacing w:line="240" w:lineRule="auto" w:before="0" w:after="20"/>
               <w:jc w:val="right"/>
             </w:pPr>
             <w:r>
               <w:rPr>
                 <w:b/>
-                <w:sz w:val="19"/>
+                <w:sz w:val="17"/>
               </w:rPr>
               <w:t>4</w:t>
             </w:r>
@@ -557,7 +557,7 @@
       <w:tr>
         <w:tc>
           <w:tcPr>
-            <w:tcW w:type="dxa" w:w="8352"/>
+            <w:tcW w:type="dxa" w:w="8496"/>
             <w:tcMar>
               <w:top w:w="15" w:type="dxa"/>
               <w:bottom w:w="15" w:type="dxa"/>
@@ -567,11 +567,11 @@
           </w:tcPr>
           <w:p>
             <w:pPr>
-              <w:spacing w:line="240" w:lineRule="auto" w:after="20"/>
+              <w:spacing w:line="240" w:lineRule="auto" w:before="0" w:after="20"/>
             </w:pPr>
             <w:r>
               <w:rPr>
-                <w:sz w:val="19"/>
+                <w:sz w:val="17"/>
               </w:rPr>
               <w:t xml:space="preserve">   3.1 Principios de diseño modular en el paquete src/</w:t>
             </w:r>
@@ -579,7 +579,7 @@
         </w:tc>
         <w:tc>
           <w:tcPr>
-            <w:tcW w:type="dxa" w:w="1008"/>
+            <w:tcW w:type="dxa" w:w="864"/>
             <w:tcMar>
               <w:top w:w="15" w:type="dxa"/>
               <w:bottom w:w="15" w:type="dxa"/>
@@ -589,12 +589,12 @@
           </w:tcPr>
           <w:p>
             <w:pPr>
-              <w:spacing w:line="240" w:lineRule="auto" w:after="20"/>
+              <w:spacing w:line="240" w:lineRule="auto" w:before="0" w:after="20"/>
               <w:jc w:val="right"/>
             </w:pPr>
             <w:r>
               <w:rPr>
-                <w:sz w:val="19"/>
+                <w:sz w:val="17"/>
               </w:rPr>
               <w:t>4</w:t>
             </w:r>
@@ -604,7 +604,7 @@
       <w:tr>
         <w:tc>
           <w:tcPr>
-            <w:tcW w:type="dxa" w:w="8352"/>
+            <w:tcW w:type="dxa" w:w="8496"/>
             <w:tcMar>
               <w:top w:w="15" w:type="dxa"/>
               <w:bottom w:w="15" w:type="dxa"/>
@@ -614,11 +614,11 @@
           </w:tcPr>
           <w:p>
             <w:pPr>
-              <w:spacing w:line="240" w:lineRule="auto" w:after="20"/>
+              <w:spacing w:line="240" w:lineRule="auto" w:before="0" w:after="20"/>
             </w:pPr>
             <w:r>
               <w:rPr>
-                <w:sz w:val="19"/>
+                <w:sz w:val="17"/>
               </w:rPr>
               <w:t xml:space="preserve">   3.2 Jerarquía de clases del pipeline (Transformador y Pipeline)</w:t>
             </w:r>
@@ -626,7 +626,7 @@
         </w:tc>
         <w:tc>
           <w:tcPr>
-            <w:tcW w:type="dxa" w:w="1008"/>
+            <w:tcW w:type="dxa" w:w="864"/>
             <w:tcMar>
               <w:top w:w="15" w:type="dxa"/>
               <w:bottom w:w="15" w:type="dxa"/>
@@ -636,12 +636,12 @@
           </w:tcPr>
           <w:p>
             <w:pPr>
-              <w:spacing w:line="240" w:lineRule="auto" w:after="20"/>
+              <w:spacing w:line="240" w:lineRule="auto" w:before="0" w:after="20"/>
               <w:jc w:val="right"/>
             </w:pPr>
             <w:r>
               <w:rPr>
-                <w:sz w:val="19"/>
+                <w:sz w:val="17"/>
               </w:rPr>
               <w:t>4</w:t>
             </w:r>
@@ -651,7 +651,7 @@
       <w:tr>
         <w:tc>
           <w:tcPr>
-            <w:tcW w:type="dxa" w:w="8352"/>
+            <w:tcW w:type="dxa" w:w="8496"/>
             <w:tcMar>
               <w:top w:w="15" w:type="dxa"/>
               <w:bottom w:w="15" w:type="dxa"/>
@@ -661,11 +661,11 @@
           </w:tcPr>
           <w:p>
             <w:pPr>
-              <w:spacing w:line="240" w:lineRule="auto" w:after="20"/>
+              <w:spacing w:line="240" w:lineRule="auto" w:before="0" w:after="20"/>
             </w:pPr>
             <w:r>
               <w:rPr>
-                <w:sz w:val="19"/>
+                <w:sz w:val="17"/>
               </w:rPr>
               <w:t xml:space="preserve">   3.3 Diagrama de dependencias técnicas y justificación de POO</w:t>
             </w:r>
@@ -673,7 +673,7 @@
         </w:tc>
         <w:tc>
           <w:tcPr>
-            <w:tcW w:type="dxa" w:w="1008"/>
+            <w:tcW w:type="dxa" w:w="864"/>
             <w:tcMar>
               <w:top w:w="15" w:type="dxa"/>
               <w:bottom w:w="15" w:type="dxa"/>
@@ -683,12 +683,61 @@
           </w:tcPr>
           <w:p>
             <w:pPr>
-              <w:spacing w:line="240" w:lineRule="auto" w:after="20"/>
+              <w:spacing w:line="240" w:lineRule="auto" w:before="0" w:after="20"/>
               <w:jc w:val="right"/>
             </w:pPr>
             <w:r>
               <w:rPr>
-                <w:sz w:val="19"/>
+                <w:sz w:val="17"/>
+              </w:rPr>
+              <w:t>4</w:t>
+            </w:r>
+          </w:p>
+        </w:tc>
+      </w:tr>
+      <w:tr>
+        <w:tc>
+          <w:tcPr>
+            <w:tcW w:type="dxa" w:w="8496"/>
+            <w:tcMar>
+              <w:top w:w="15" w:type="dxa"/>
+              <w:bottom w:w="15" w:type="dxa"/>
+              <w:left w:w="30" w:type="dxa"/>
+              <w:right w:w="30" w:type="dxa"/>
+            </w:tcMar>
+          </w:tcPr>
+          <w:p>
+            <w:pPr>
+              <w:spacing w:line="240" w:lineRule="auto" w:before="0" w:after="20"/>
+            </w:pPr>
+            <w:r>
+              <w:rPr>
+                <w:b/>
+                <w:sz w:val="17"/>
+              </w:rPr>
+              <w:t>IV. Diseño e implementación de algoritmos estructurados y recursivos</w:t>
+            </w:r>
+          </w:p>
+        </w:tc>
+        <w:tc>
+          <w:tcPr>
+            <w:tcW w:type="dxa" w:w="864"/>
+            <w:tcMar>
+              <w:top w:w="15" w:type="dxa"/>
+              <w:bottom w:w="15" w:type="dxa"/>
+              <w:left w:w="30" w:type="dxa"/>
+              <w:right w:w="30" w:type="dxa"/>
+            </w:tcMar>
+          </w:tcPr>
+          <w:p>
+            <w:pPr>
+              <w:spacing w:line="240" w:lineRule="auto" w:before="0" w:after="20"/>
+              <w:jc w:val="right"/>
+            </w:pPr>
+            <w:r>
+              <w:rPr>
+                <w:b/>
+                <w:sz w:val="17"/>
               </w:rPr>
               <w:t>5</w:t>
             </w:r>
@@ -698,7 +747,7 @@
       <w:tr>
         <w:tc>
           <w:tcPr>
-            <w:tcW w:type="dxa" w:w="8352"/>
+            <w:tcW w:type="dxa" w:w="8496"/>
             <w:tcMar>
               <w:top w:w="15" w:type="dxa"/>
               <w:bottom w:w="15" w:type="dxa"/>
@@ -708,20 +757,19 @@
           </w:tcPr>
           <w:p>
             <w:pPr>
-              <w:spacing w:line="240" w:lineRule="auto" w:after="20"/>
+              <w:spacing w:line="240" w:lineRule="auto" w:before="0" w:after="20"/>
             </w:pPr>
             <w:r>
               <w:rPr>
-                <w:b/>
-                <w:sz w:val="19"/>
+                <w:sz w:val="17"/>
               </w:rPr>
-              <w:t>IV. Diseño e implementación de algoritmos estructurados y recursivos</w:t>
+              <w:t xml:space="preserve">   4.1 Enfoque Divide and Conquer: Merge Sort y Quickselect</w:t>
             </w:r>
           </w:p>
         </w:tc>
         <w:tc>
           <w:tcPr>
-            <w:tcW w:type="dxa" w:w="1008"/>
+            <w:tcW w:type="dxa" w:w="864"/>
             <w:tcMar>
               <w:top w:w="15" w:type="dxa"/>
               <w:bottom w:w="15" w:type="dxa"/>
@@ -731,13 +779,12 @@
           </w:tcPr>
           <w:p>
             <w:pPr>
-              <w:spacing w:line="240" w:lineRule="auto" w:after="20"/>
+              <w:spacing w:line="240" w:lineRule="auto" w:before="0" w:after="20"/>
               <w:jc w:val="right"/>
             </w:pPr>
             <w:r>
               <w:rPr>
-                <w:b/>
-                <w:sz w:val="19"/>
+                <w:sz w:val="17"/>
               </w:rPr>
               <w:t>5</w:t>
             </w:r>
@@ -747,7 +794,7 @@
       <w:tr>
         <w:tc>
           <w:tcPr>
-            <w:tcW w:type="dxa" w:w="8352"/>
+            <w:tcW w:type="dxa" w:w="8496"/>
             <w:tcMar>
               <w:top w:w="15" w:type="dxa"/>
               <w:bottom w:w="15" w:type="dxa"/>
@@ -757,19 +804,19 @@
           </w:tcPr>
           <w:p>
             <w:pPr>
-              <w:spacing w:line="240" w:lineRule="auto" w:after="20"/>
+              <w:spacing w:line="240" w:lineRule="auto" w:before="0" w:after="20"/>
             </w:pPr>
             <w:r>
               <w:rPr>
-                <w:sz w:val="19"/>
+                <w:sz w:val="17"/>
               </w:rPr>
-              <w:t xml:space="preserve">   4.1 Enfoque Divide and Conquer: Merge Sort y Quickselect</w:t>
+              <w:t xml:space="preserve">   4.2 Exploración jerárquica de combinaciones críticas con poda</w:t>
             </w:r>
           </w:p>
         </w:tc>
         <w:tc>
           <w:tcPr>
-            <w:tcW w:type="dxa" w:w="1008"/>
+            <w:tcW w:type="dxa" w:w="864"/>
             <w:tcMar>
               <w:top w:w="15" w:type="dxa"/>
               <w:bottom w:w="15" w:type="dxa"/>
@@ -779,12 +826,12 @@
           </w:tcPr>
           <w:p>
             <w:pPr>
-              <w:spacing w:line="240" w:lineRule="auto" w:after="20"/>
+              <w:spacing w:line="240" w:lineRule="auto" w:before="0" w:after="20"/>
               <w:jc w:val="right"/>
             </w:pPr>
             <w:r>
               <w:rPr>
-                <w:sz w:val="19"/>
+                <w:sz w:val="17"/>
               </w:rPr>
               <w:t>5</w:t>
             </w:r>
@@ -794,7 +841,7 @@
       <w:tr>
         <w:tc>
           <w:tcPr>
-            <w:tcW w:type="dxa" w:w="8352"/>
+            <w:tcW w:type="dxa" w:w="8496"/>
             <w:tcMar>
               <w:top w:w="15" w:type="dxa"/>
               <w:bottom w:w="15" w:type="dxa"/>
@@ -804,19 +851,19 @@
           </w:tcPr>
           <w:p>
             <w:pPr>
-              <w:spacing w:line="240" w:lineRule="auto" w:after="20"/>
+              <w:spacing w:line="240" w:lineRule="auto" w:before="0" w:after="20"/>
             </w:pPr>
             <w:r>
               <w:rPr>
-                <w:sz w:val="19"/>
+                <w:sz w:val="17"/>
               </w:rPr>
-              <w:t xml:space="preserve">   4.2 Exploración jerárquica de combinaciones críticas con poda</w:t>
+              <w:t xml:space="preserve">   4.3 Agregación anidada: jornada dentro de área de conocimiento</w:t>
             </w:r>
           </w:p>
         </w:tc>
         <w:tc>
           <w:tcPr>
-            <w:tcW w:type="dxa" w:w="1008"/>
+            <w:tcW w:type="dxa" w:w="864"/>
             <w:tcMar>
               <w:top w:w="15" w:type="dxa"/>
               <w:bottom w:w="15" w:type="dxa"/>
@@ -826,14 +873,14 @@
           </w:tcPr>
           <w:p>
             <w:pPr>
-              <w:spacing w:line="240" w:lineRule="auto" w:after="20"/>
+              <w:spacing w:line="240" w:lineRule="auto" w:before="0" w:after="20"/>
               <w:jc w:val="right"/>
             </w:pPr>
             <w:r>
               <w:rPr>
-                <w:sz w:val="19"/>
+                <w:sz w:val="17"/>
               </w:rPr>
-              <w:t>5</w:t>
+              <w:t>6</w:t>
             </w:r>
           </w:p>
         </w:tc>
@@ -841,7 +888,7 @@
       <w:tr>
         <w:tc>
           <w:tcPr>
-            <w:tcW w:type="dxa" w:w="8352"/>
+            <w:tcW w:type="dxa" w:w="8496"/>
             <w:tcMar>
               <w:top w:w="15" w:type="dxa"/>
               <w:bottom w:w="15" w:type="dxa"/>
@@ -851,19 +898,20 @@
           </w:tcPr>
           <w:p>
             <w:pPr>
-              <w:spacing w:line="240" w:lineRule="auto" w:after="20"/>
+              <w:spacing w:line="240" w:lineRule="auto" w:before="0" w:after="20"/>
             </w:pPr>
             <w:r>
               <w:rPr>
-                <w:sz w:val="19"/>
+                <w:b/>
+                <w:sz w:val="17"/>
               </w:rPr>
-              <w:t xml:space="preserve">   4.3 Agregación anidada: jornada dentro de área de conocimiento</w:t>
+              <w:t>V. Medición empírica de complejidad computacional y eficiencia</w:t>
             </w:r>
           </w:p>
         </w:tc>
         <w:tc>
           <w:tcPr>
-            <w:tcW w:type="dxa" w:w="1008"/>
+            <w:tcW w:type="dxa" w:w="864"/>
             <w:tcMar>
               <w:top w:w="15" w:type="dxa"/>
               <w:bottom w:w="15" w:type="dxa"/>
@@ -873,12 +921,13 @@
           </w:tcPr>
           <w:p>
             <w:pPr>
-              <w:spacing w:line="240" w:lineRule="auto" w:after="20"/>
+              <w:spacing w:line="240" w:lineRule="auto" w:before="0" w:after="20"/>
               <w:jc w:val="right"/>
             </w:pPr>
             <w:r>
               <w:rPr>
-                <w:sz w:val="19"/>
+                <w:b/>
+                <w:sz w:val="17"/>
               </w:rPr>
               <w:t>6</w:t>
             </w:r>
@@ -888,7 +937,7 @@
       <w:tr>
         <w:tc>
           <w:tcPr>
-            <w:tcW w:type="dxa" w:w="8352"/>
+            <w:tcW w:type="dxa" w:w="8496"/>
             <w:tcMar>
               <w:top w:w="15" w:type="dxa"/>
               <w:bottom w:w="15" w:type="dxa"/>
@@ -898,20 +947,19 @@
           </w:tcPr>
           <w:p>
             <w:pPr>
-              <w:spacing w:line="240" w:lineRule="auto" w:after="20"/>
+              <w:spacing w:line="240" w:lineRule="auto" w:before="0" w:after="20"/>
             </w:pPr>
             <w:r>
               <w:rPr>
-                <w:b/>
-                <w:sz w:val="19"/>
+                <w:sz w:val="17"/>
               </w:rPr>
-              <w:t>V. Medición empírica de complejidad computacional y eficiencia</w:t>
+              <w:t xml:space="preserve">   5.1 Complejidad temporal y ajuste frente a cotas asintóticas</w:t>
             </w:r>
           </w:p>
         </w:tc>
         <w:tc>
           <w:tcPr>
-            <w:tcW w:type="dxa" w:w="1008"/>
+            <w:tcW w:type="dxa" w:w="864"/>
             <w:tcMar>
               <w:top w:w="15" w:type="dxa"/>
               <w:bottom w:w="15" w:type="dxa"/>
@@ -921,13 +969,12 @@
           </w:tcPr>
           <w:p>
             <w:pPr>
-              <w:spacing w:line="240" w:lineRule="auto" w:after="20"/>
+              <w:spacing w:line="240" w:lineRule="auto" w:before="0" w:after="20"/>
               <w:jc w:val="right"/>
             </w:pPr>
             <w:r>
               <w:rPr>
-                <w:b/>
-                <w:sz w:val="19"/>
+                <w:sz w:val="17"/>
               </w:rPr>
               <w:t>6</w:t>
             </w:r>
@@ -937,7 +984,7 @@
       <w:tr>
         <w:tc>
           <w:tcPr>
-            <w:tcW w:type="dxa" w:w="8352"/>
+            <w:tcW w:type="dxa" w:w="8496"/>
             <w:tcMar>
               <w:top w:w="15" w:type="dxa"/>
               <w:bottom w:w="15" w:type="dxa"/>
@@ -947,19 +994,19 @@
           </w:tcPr>
           <w:p>
             <w:pPr>
-              <w:spacing w:line="240" w:lineRule="auto" w:after="20"/>
+              <w:spacing w:line="240" w:lineRule="auto" w:before="0" w:after="20"/>
             </w:pPr>
             <w:r>
               <w:rPr>
-                <w:sz w:val="19"/>
+                <w:sz w:val="17"/>
               </w:rPr>
-              <w:t xml:space="preserve">   5.1 Complejidad temporal y ajuste frente a cotas asintóticas</w:t>
+              <w:t xml:space="preserve">   5.2 Complejidad espacial y profundidad de la pila de llamadas (Call Stack)</w:t>
             </w:r>
           </w:p>
         </w:tc>
         <w:tc>
           <w:tcPr>
-            <w:tcW w:type="dxa" w:w="1008"/>
+            <w:tcW w:type="dxa" w:w="864"/>
             <w:tcMar>
               <w:top w:w="15" w:type="dxa"/>
               <w:bottom w:w="15" w:type="dxa"/>
@@ -969,14 +1016,14 @@
           </w:tcPr>
           <w:p>
             <w:pPr>
-              <w:spacing w:line="240" w:lineRule="auto" w:after="20"/>
+              <w:spacing w:line="240" w:lineRule="auto" w:before="0" w:after="20"/>
               <w:jc w:val="right"/>
             </w:pPr>
             <w:r>
               <w:rPr>
-                <w:sz w:val="19"/>
+                <w:sz w:val="17"/>
               </w:rPr>
-              <w:t>6</w:t>
+              <w:t>7</w:t>
             </w:r>
           </w:p>
         </w:tc>
@@ -984,7 +1031,7 @@
       <w:tr>
         <w:tc>
           <w:tcPr>
-            <w:tcW w:type="dxa" w:w="8352"/>
+            <w:tcW w:type="dxa" w:w="8496"/>
             <w:tcMar>
               <w:top w:w="15" w:type="dxa"/>
               <w:bottom w:w="15" w:type="dxa"/>
@@ -994,19 +1041,19 @@
           </w:tcPr>
           <w:p>
             <w:pPr>
-              <w:spacing w:line="240" w:lineRule="auto" w:after="20"/>
+              <w:spacing w:line="240" w:lineRule="auto" w:before="0" w:after="20"/>
             </w:pPr>
             <w:r>
               <w:rPr>
-                <w:sz w:val="19"/>
+                <w:sz w:val="17"/>
               </w:rPr>
-              <w:t xml:space="preserve">   5.2 Complejidad espacial y profundidad de la pila de llamadas (Call Stack)</w:t>
+              <w:t xml:space="preserve">   5.3 Bucle iterativo vs. vectorización en agrupación y One-Hot</w:t>
             </w:r>
           </w:p>
         </w:tc>
         <w:tc>
           <w:tcPr>
-            <w:tcW w:type="dxa" w:w="1008"/>
+            <w:tcW w:type="dxa" w:w="864"/>
             <w:tcMar>
               <w:top w:w="15" w:type="dxa"/>
               <w:bottom w:w="15" w:type="dxa"/>
@@ -1016,14 +1063,14 @@
           </w:tcPr>
           <w:p>
             <w:pPr>
-              <w:spacing w:line="240" w:lineRule="auto" w:after="20"/>
+              <w:spacing w:line="240" w:lineRule="auto" w:before="0" w:after="20"/>
               <w:jc w:val="right"/>
             </w:pPr>
             <w:r>
               <w:rPr>
-                <w:sz w:val="19"/>
+                <w:sz w:val="17"/>
               </w:rPr>
-              <w:t>6</w:t>
+              <w:t>8</w:t>
             </w:r>
           </w:p>
         </w:tc>
@@ -1031,7 +1078,7 @@
       <w:tr>
         <w:tc>
           <w:tcPr>
-            <w:tcW w:type="dxa" w:w="8352"/>
+            <w:tcW w:type="dxa" w:w="8496"/>
             <w:tcMar>
               <w:top w:w="15" w:type="dxa"/>
               <w:bottom w:w="15" w:type="dxa"/>
@@ -1041,19 +1088,20 @@
           </w:tcPr>
           <w:p>
             <w:pPr>
-              <w:spacing w:line="240" w:lineRule="auto" w:after="20"/>
+              <w:spacing w:line="240" w:lineRule="auto" w:before="0" w:after="20"/>
             </w:pPr>
             <w:r>
               <w:rPr>
-                <w:sz w:val="19"/>
+                <w:b/>
+                <w:sz w:val="17"/>
               </w:rPr>
-              <w:t xml:space="preserve">   5.3 Bucle iterativo vs. vectorización en agrupación y One-Hot</w:t>
+              <w:t>VI. Validación técnica, verificación de resultados y pruebas unitarias</w:t>
             </w:r>
           </w:p>
         </w:tc>
         <w:tc>
           <w:tcPr>
-            <w:tcW w:type="dxa" w:w="1008"/>
+            <w:tcW w:type="dxa" w:w="864"/>
             <w:tcMar>
               <w:top w:w="15" w:type="dxa"/>
               <w:bottom w:w="15" w:type="dxa"/>
@@ -1063,14 +1111,15 @@
           </w:tcPr>
           <w:p>
             <w:pPr>
-              <w:spacing w:line="240" w:lineRule="auto" w:after="20"/>
+              <w:spacing w:line="240" w:lineRule="auto" w:before="0" w:after="20"/>
               <w:jc w:val="right"/>
             </w:pPr>
             <w:r>
               <w:rPr>
-                <w:sz w:val="19"/>
+                <w:b/>
+                <w:sz w:val="17"/>
               </w:rPr>
-              <w:t>7</w:t>
+              <w:t>9</w:t>
             </w:r>
           </w:p>
         </w:tc>
@@ -1078,7 +1127,7 @@
       <w:tr>
         <w:tc>
           <w:tcPr>
-            <w:tcW w:type="dxa" w:w="8352"/>
+            <w:tcW w:type="dxa" w:w="8496"/>
             <w:tcMar>
               <w:top w:w="15" w:type="dxa"/>
               <w:bottom w:w="15" w:type="dxa"/>
@@ -1088,20 +1137,19 @@
           </w:tcPr>
           <w:p>
             <w:pPr>
-              <w:spacing w:line="240" w:lineRule="auto" w:after="20"/>
+              <w:spacing w:line="240" w:lineRule="auto" w:before="0" w:after="20"/>
             </w:pPr>
             <w:r>
               <w:rPr>
-                <w:b/>
-                <w:sz w:val="19"/>
+                <w:sz w:val="17"/>
               </w:rPr>
-              <w:t>VI. Validación técnica, verificación de resultados y pruebas unitarias</w:t>
+              <w:t xml:space="preserve">   6.1 Cobertura de casos normales, límite y excepciones</w:t>
             </w:r>
           </w:p>
         </w:tc>
         <w:tc>
           <w:tcPr>
-            <w:tcW w:type="dxa" w:w="1008"/>
+            <w:tcW w:type="dxa" w:w="864"/>
             <w:tcMar>
               <w:top w:w="15" w:type="dxa"/>
               <w:bottom w:w="15" w:type="dxa"/>
@@ -1111,15 +1159,14 @@
           </w:tcPr>
           <w:p>
             <w:pPr>
-              <w:spacing w:line="240" w:lineRule="auto" w:after="20"/>
+              <w:spacing w:line="240" w:lineRule="auto" w:before="0" w:after="20"/>
               <w:jc w:val="right"/>
             </w:pPr>
             <w:r>
               <w:rPr>
-                <w:b/>
-                <w:sz w:val="19"/>
+                <w:sz w:val="17"/>
               </w:rPr>
-              <w:t>7</w:t>
+              <w:t>9</w:t>
             </w:r>
           </w:p>
         </w:tc>
@@ -1127,7 +1174,7 @@
       <w:tr>
         <w:tc>
           <w:tcPr>
-            <w:tcW w:type="dxa" w:w="8352"/>
+            <w:tcW w:type="dxa" w:w="8496"/>
             <w:tcMar>
               <w:top w:w="15" w:type="dxa"/>
               <w:bottom w:w="15" w:type="dxa"/>
@@ -1137,19 +1184,19 @@
           </w:tcPr>
           <w:p>
             <w:pPr>
-              <w:spacing w:line="240" w:lineRule="auto" w:after="20"/>
+              <w:spacing w:line="240" w:lineRule="auto" w:before="0" w:after="20"/>
             </w:pPr>
             <w:r>
               <w:rPr>
-                <w:sz w:val="19"/>
+                <w:sz w:val="17"/>
               </w:rPr>
-              <w:t xml:space="preserve">   6.1 Cobertura de casos normales, límite y excepciones</w:t>
+              <w:t xml:space="preserve">   6.2 Verificación numérica y análisis de sensibilidad de casos imputados</w:t>
             </w:r>
           </w:p>
         </w:tc>
         <w:tc>
           <w:tcPr>
-            <w:tcW w:type="dxa" w:w="1008"/>
+            <w:tcW w:type="dxa" w:w="864"/>
             <w:tcMar>
               <w:top w:w="15" w:type="dxa"/>
               <w:bottom w:w="15" w:type="dxa"/>
@@ -1159,14 +1206,14 @@
           </w:tcPr>
           <w:p>
             <w:pPr>
-              <w:spacing w:line="240" w:lineRule="auto" w:after="20"/>
+              <w:spacing w:line="240" w:lineRule="auto" w:before="0" w:after="20"/>
               <w:jc w:val="right"/>
             </w:pPr>
             <w:r>
               <w:rPr>
-                <w:sz w:val="19"/>
+                <w:sz w:val="17"/>
               </w:rPr>
-              <w:t>7</w:t>
+              <w:t>9</w:t>
             </w:r>
           </w:p>
         </w:tc>
@@ -1174,7 +1221,7 @@
       <w:tr>
         <w:tc>
           <w:tcPr>
-            <w:tcW w:type="dxa" w:w="8352"/>
+            <w:tcW w:type="dxa" w:w="8496"/>
             <w:tcMar>
               <w:top w:w="15" w:type="dxa"/>
               <w:bottom w:w="15" w:type="dxa"/>
@@ -1184,19 +1231,20 @@
           </w:tcPr>
           <w:p>
             <w:pPr>
-              <w:spacing w:line="240" w:lineRule="auto" w:after="20"/>
+              <w:spacing w:line="240" w:lineRule="auto" w:before="0" w:after="20"/>
             </w:pPr>
             <w:r>
               <w:rPr>
-                <w:sz w:val="19"/>
+                <w:b/>
+                <w:sz w:val="17"/>
               </w:rPr>
-              <w:t xml:space="preserve">   6.2 Verificación numérica y análisis de sensibilidad de casos imputados</w:t>
+              <w:t>VII. Trabajo colaborativo, trazabilidad y control de versiones</w:t>
             </w:r>
           </w:p>
         </w:tc>
         <w:tc>
           <w:tcPr>
-            <w:tcW w:type="dxa" w:w="1008"/>
+            <w:tcW w:type="dxa" w:w="864"/>
             <w:tcMar>
               <w:top w:w="15" w:type="dxa"/>
               <w:bottom w:w="15" w:type="dxa"/>
@@ -1206,14 +1254,15 @@
           </w:tcPr>
           <w:p>
             <w:pPr>
-              <w:spacing w:line="240" w:lineRule="auto" w:after="20"/>
+              <w:spacing w:line="240" w:lineRule="auto" w:before="0" w:after="20"/>
               <w:jc w:val="right"/>
             </w:pPr>
             <w:r>
               <w:rPr>
-                <w:sz w:val="19"/>
+                <w:b/>
+                <w:sz w:val="17"/>
               </w:rPr>
-              <w:t>8</w:t>
+              <w:t>10</w:t>
             </w:r>
           </w:p>
         </w:tc>
@@ -1221,7 +1270,7 @@
       <w:tr>
         <w:tc>
           <w:tcPr>
-            <w:tcW w:type="dxa" w:w="8352"/>
+            <w:tcW w:type="dxa" w:w="8496"/>
             <w:tcMar>
               <w:top w:w="15" w:type="dxa"/>
               <w:bottom w:w="15" w:type="dxa"/>
@@ -1231,20 +1280,20 @@
           </w:tcPr>
           <w:p>
             <w:pPr>
-              <w:spacing w:line="240" w:lineRule="auto" w:after="20"/>
+              <w:spacing w:line="240" w:lineRule="auto" w:before="0" w:after="20"/>
             </w:pPr>
             <w:r>
               <w:rPr>
                 <w:b/>
-                <w:sz w:val="19"/>
+                <w:sz w:val="17"/>
               </w:rPr>
-              <w:t>VII. Trabajo colaborativo, trazabilidad y control de versiones</w:t>
+              <w:t>VIII. Conclusiones y proyección hacia la Fase 4</w:t>
             </w:r>
           </w:p>
         </w:tc>
         <w:tc>
           <w:tcPr>
-            <w:tcW w:type="dxa" w:w="1008"/>
+            <w:tcW w:type="dxa" w:w="864"/>
             <w:tcMar>
               <w:top w:w="15" w:type="dxa"/>
               <w:bottom w:w="15" w:type="dxa"/>
@@ -1254,15 +1303,15 @@
           </w:tcPr>
           <w:p>
             <w:pPr>
-              <w:spacing w:line="240" w:lineRule="auto" w:after="20"/>
+              <w:spacing w:line="240" w:lineRule="auto" w:before="0" w:after="20"/>
               <w:jc w:val="right"/>
             </w:pPr>
             <w:r>
               <w:rPr>
                 <w:b/>
-                <w:sz w:val="19"/>
+                <w:sz w:val="17"/>
               </w:rPr>
-              <w:t>8</w:t>
+              <w:t>10</w:t>
             </w:r>
           </w:p>
         </w:tc>
@@ -1270,7 +1319,7 @@
       <w:tr>
         <w:tc>
           <w:tcPr>
-            <w:tcW w:type="dxa" w:w="8352"/>
+            <w:tcW w:type="dxa" w:w="8496"/>
             <w:tcMar>
               <w:top w:w="15" w:type="dxa"/>
               <w:bottom w:w="15" w:type="dxa"/>
@@ -1280,20 +1329,20 @@
           </w:tcPr>
           <w:p>
             <w:pPr>
-              <w:spacing w:line="240" w:lineRule="auto" w:after="20"/>
+              <w:spacing w:line="240" w:lineRule="auto" w:before="0" w:after="20"/>
             </w:pPr>
             <w:r>
               <w:rPr>
                 <w:b/>
-                <w:sz w:val="19"/>
+                <w:sz w:val="17"/>
               </w:rPr>
-              <w:t>VIII. Conclusiones y proyección hacia la Fase 4</w:t>
+              <w:t>IX. Bibliografía (Norma APA 7.ª)</w:t>
             </w:r>
           </w:p>
         </w:tc>
         <w:tc>
           <w:tcPr>
-            <w:tcW w:type="dxa" w:w="1008"/>
+            <w:tcW w:type="dxa" w:w="864"/>
             <w:tcMar>
               <w:top w:w="15" w:type="dxa"/>
               <w:bottom w:w="15" w:type="dxa"/>
@@ -1303,15 +1352,15 @@
           </w:tcPr>
           <w:p>
             <w:pPr>
-              <w:spacing w:line="240" w:lineRule="auto" w:after="20"/>
+              <w:spacing w:line="240" w:lineRule="auto" w:before="0" w:after="20"/>
               <w:jc w:val="right"/>
             </w:pPr>
             <w:r>
               <w:rPr>
                 <w:b/>
-                <w:sz w:val="19"/>
+                <w:sz w:val="17"/>
               </w:rPr>
-              <w:t>9</w:t>
+              <w:t>10</w:t>
             </w:r>
           </w:p>
         </w:tc>
@@ -1319,7 +1368,7 @@
       <w:tr>
         <w:tc>
           <w:tcPr>
-            <w:tcW w:type="dxa" w:w="8352"/>
+            <w:tcW w:type="dxa" w:w="8496"/>
             <w:tcMar>
               <w:top w:w="15" w:type="dxa"/>
               <w:bottom w:w="15" w:type="dxa"/>
@@ -1329,20 +1378,20 @@
           </w:tcPr>
           <w:p>
             <w:pPr>
-              <w:spacing w:line="240" w:lineRule="auto" w:after="20"/>
+              <w:spacing w:line="240" w:lineRule="auto" w:before="0" w:after="20"/>
             </w:pPr>
             <w:r>
               <w:rPr>
                 <w:b/>
-                <w:sz w:val="19"/>
+                <w:sz w:val="17"/>
               </w:rPr>
-              <w:t>IX. Bibliografía (Norma APA 7.ª)</w:t>
+              <w:t>Anexos técnicos</w:t>
             </w:r>
           </w:p>
         </w:tc>
         <w:tc>
           <w:tcPr>
-            <w:tcW w:type="dxa" w:w="1008"/>
+            <w:tcW w:type="dxa" w:w="864"/>
             <w:tcMar>
               <w:top w:w="15" w:type="dxa"/>
               <w:bottom w:w="15" w:type="dxa"/>
@@ -1352,15 +1401,15 @@
           </w:tcPr>
           <w:p>
             <w:pPr>
-              <w:spacing w:line="240" w:lineRule="auto" w:after="20"/>
+              <w:spacing w:line="240" w:lineRule="auto" w:before="0" w:after="20"/>
               <w:jc w:val="right"/>
             </w:pPr>
             <w:r>
               <w:rPr>
                 <w:b/>
-                <w:sz w:val="19"/>
+                <w:sz w:val="17"/>
               </w:rPr>
-              <w:t>9</w:t>
+              <w:t>12</w:t>
             </w:r>
           </w:p>
         </w:tc>
@@ -1368,7 +1417,7 @@
       <w:tr>
         <w:tc>
           <w:tcPr>
-            <w:tcW w:type="dxa" w:w="8352"/>
+            <w:tcW w:type="dxa" w:w="8496"/>
             <w:tcMar>
               <w:top w:w="15" w:type="dxa"/>
               <w:bottom w:w="15" w:type="dxa"/>
@@ -1378,20 +1427,19 @@
           </w:tcPr>
           <w:p>
             <w:pPr>
-              <w:spacing w:line="240" w:lineRule="auto" w:after="20"/>
+              <w:spacing w:line="240" w:lineRule="auto" w:before="0" w:after="20"/>
             </w:pPr>
             <w:r>
               <w:rPr>
-                <w:b/>
-                <w:sz w:val="19"/>
+                <w:sz w:val="17"/>
               </w:rPr>
-              <w:t>Anexos técnicos</w:t>
+              <w:t xml:space="preserve">   Anexo A · Trazabilidad y verificación automatizada del repositorio</w:t>
             </w:r>
           </w:p>
         </w:tc>
         <w:tc>
           <w:tcPr>
-            <w:tcW w:type="dxa" w:w="1008"/>
+            <w:tcW w:type="dxa" w:w="864"/>
             <w:tcMar>
               <w:top w:w="15" w:type="dxa"/>
               <w:bottom w:w="15" w:type="dxa"/>
@@ -1401,15 +1449,14 @@
           </w:tcPr>
           <w:p>
             <w:pPr>
-              <w:spacing w:line="240" w:lineRule="auto" w:after="20"/>
+              <w:spacing w:line="240" w:lineRule="auto" w:before="0" w:after="20"/>
               <w:jc w:val="right"/>
             </w:pPr>
             <w:r>
               <w:rPr>
-                <w:b/>
-                <w:sz w:val="19"/>
+                <w:sz w:val="17"/>
               </w:rPr>
-              <w:t>10</w:t>
+              <w:t>12</w:t>
             </w:r>
           </w:p>
         </w:tc>
@@ -1417,7 +1464,7 @@
       <w:tr>
         <w:tc>
           <w:tcPr>
-            <w:tcW w:type="dxa" w:w="8352"/>
+            <w:tcW w:type="dxa" w:w="8496"/>
             <w:tcMar>
               <w:top w:w="15" w:type="dxa"/>
               <w:bottom w:w="15" w:type="dxa"/>
@@ -1427,19 +1474,19 @@
           </w:tcPr>
           <w:p>
             <w:pPr>
-              <w:spacing w:line="240" w:lineRule="auto" w:after="20"/>
+              <w:spacing w:line="240" w:lineRule="auto" w:before="0" w:after="20"/>
             </w:pPr>
             <w:r>
               <w:rPr>
-                <w:sz w:val="19"/>
+                <w:sz w:val="17"/>
               </w:rPr>
-              <w:t xml:space="preserve">   Anexo A · Trazabilidad y verificación automatizada del repositorio</w:t>
+              <w:t xml:space="preserve">   Anexo B · Registro de pruebas automatizadas y cobertura</w:t>
             </w:r>
           </w:p>
         </w:tc>
         <w:tc>
           <w:tcPr>
-            <w:tcW w:type="dxa" w:w="1008"/>
+            <w:tcW w:type="dxa" w:w="864"/>
             <w:tcMar>
               <w:top w:w="15" w:type="dxa"/>
               <w:bottom w:w="15" w:type="dxa"/>
@@ -1449,61 +1496,14 @@
           </w:tcPr>
           <w:p>
             <w:pPr>
-              <w:spacing w:line="240" w:lineRule="auto" w:after="20"/>
+              <w:spacing w:line="240" w:lineRule="auto" w:before="0" w:after="20"/>
               <w:jc w:val="right"/>
             </w:pPr>
             <w:r>
               <w:rPr>
-                <w:sz w:val="19"/>
+                <w:sz w:val="17"/>
               </w:rPr>
-              <w:t>10</w:t>
-            </w:r>
-          </w:p>
-        </w:tc>
-      </w:tr>
-      <w:tr>
-        <w:tc>
-          <w:tcPr>
-            <w:tcW w:type="dxa" w:w="8352"/>
-            <w:tcMar>
-              <w:top w:w="15" w:type="dxa"/>
-              <w:bottom w:w="15" w:type="dxa"/>
-              <w:left w:w="30" w:type="dxa"/>
-              <w:right w:w="30" w:type="dxa"/>
-            </w:tcMar>
-          </w:tcPr>
-          <w:p>
-            <w:pPr>
-              <w:spacing w:line="240" w:lineRule="auto" w:after="20"/>
-            </w:pPr>
-            <w:r>
-              <w:rPr>
-                <w:sz w:val="19"/>
-              </w:rPr>
-              <w:t xml:space="preserve">   Anexo B · Registro de pruebas automatizadas y cobertura</w:t>
-            </w:r>
-          </w:p>
-        </w:tc>
-        <w:tc>
-          <w:tcPr>
-            <w:tcW w:type="dxa" w:w="1008"/>
-            <w:tcMar>
-              <w:top w:w="15" w:type="dxa"/>
-              <w:bottom w:w="15" w:type="dxa"/>
-              <w:left w:w="30" w:type="dxa"/>
-              <w:right w:w="30" w:type="dxa"/>
-            </w:tcMar>
-          </w:tcPr>
-          <w:p>
-            <w:pPr>
-              <w:spacing w:line="240" w:lineRule="auto" w:after="20"/>
-              <w:jc w:val="right"/>
-            </w:pPr>
-            <w:r>
-              <w:rPr>
-                <w:sz w:val="19"/>
-              </w:rPr>
-              <w:t>11</w:t>
+              <w:t>13</w:t>
             </w:r>
           </w:p>
         </w:tc>
@@ -1523,7 +1523,7 @@
         <w:rPr>
           <w:b/>
           <w:color w:val="003366"/>
-          <w:sz w:val="26"/>
+          <w:sz w:val="24"/>
         </w:rPr>
         <w:t>I. Introducción y contextualización del avance</w:t>
       </w:r>
@@ -1535,12 +1535,12 @@
     </w:p>
     <w:p>
       <w:r>
-        <w:t>La Fase 3 representa un salto cualitativo fundamental: el paso desde la manipulación tabular hacia el diseño algorítmico estructurado, el análisis asintótico de complejidad y la ingeniería de software orientada a objetos (POO). Conforme a las directrices de la asignatura, el trabajo de esta etapa aborda directamente la necesidad de calcular estadísticos de localización (cuantiles y medianas) de manera eficiente sobre grandes volúmenes de datos, explorar combinaciones de factores académicos de alto riesgo sin incurrir en una explosión combinatoria, instrumentar empíricamente el consumo de tiempo y memoria, y consolidar el pipeline de datos en una jerarquía de clases robusta.</w:t>
+        <w:t>La Fase 3 representa un salto cualitativo fundamental: el paso desde la manipulación tabular hacia el diseño algorítmico estructurado, la recursividad controlada, el análisis asintótico formal y la arquitectura orientada a objetos (POO). El foco central radica en responder con rigor computacional cómo se distribuye y qué factores condicionan la sobreduración de las carreras universitarias en Chile.</w:t>
       </w:r>
     </w:p>
     <w:p>
       <w:r>
-        <w:t>Asimismo, este avance integra de forma explícita las discusiones del Foro Técnico de la Semana 1, analizando el compromiso (trade-off) entre implementaciones iterativas y recursivas, la sobrecarga espacial de la pila de llamadas (call stack), el riesgo de desbordamiento de recursión frente a los límites del intérprete Python (sys.getrecursionlimit) y las ventajas comparativas de la vectorización en NumPy/pandas frente a la iteración imperativa convencional.</w:t>
+        <w:t>Asimismo, este avance integra de forma explícita las discusiones del Foro Técnico de la Semana 1 sobre recursividad y stack overflow, demostrando la viabilidad computacional de operar sobre más de cien mil registros sin desbordar los límites de la pila de llamadas del sistema.</w:t>
       </w:r>
     </w:p>
     <w:p>
@@ -1552,19 +1552,14 @@
         <w:rPr>
           <w:b/>
           <w:color w:val="003366"/>
-          <w:sz w:val="26"/>
+          <w:sz w:val="24"/>
         </w:rPr>
         <w:t>II. Conjunto de datos y estructuras para consumo algorítmico</w:t>
       </w:r>
     </w:p>
     <w:p>
       <w:r>
-        <w:t>El sustrato empírico sobre el cual operan los algoritmos de la Fase 3 es el dataset oficial depurado en la Fase 2 (titulados_2025_pregrado_univ_limpio.csv), alojado localmente en data/processed/. Este subconjunto contiene 105.060 titulados reales con 84 columnas resultantes de las transformaciones de ingeniería de variables (codificación One-Hot de nominales, codificación ordinal respetando jerarquías y escalamiento robusto mediante mediana y RIC).</w:t>
-      </w:r>
-    </w:p>
-    <w:p>
-      <w:r>
-        <w:t>Para garantizar la eficiencia algorítmica y evitar transferencias de memoria innecesarias, los algoritmos implementados consumen únicamente las estructuras de datos estrictamente requeridas para sus operaciones:</w:t>
+        <w:t>El sustrato empírico sobre el cual operan los algoritmos de la Fase 3 es el dataset depurado generado en la Fase 2 (titulados_2025_pregrado_univ_limpio.csv), compuesto por N = 105.060 observaciones individuales y 84 columnas. Para responder a los objetivos algorítmicos, se identificaron y estructuraron variables operativas clave:</w:t>
       </w:r>
     </w:p>
     <w:tbl>
@@ -1574,14 +1569,14 @@
         <w:tblLook w:firstColumn="1" w:firstRow="1" w:lastColumn="0" w:lastRow="0" w:noHBand="0" w:noVBand="1" w:val="04A0"/>
       </w:tblPr>
       <w:tblGrid>
-        <w:gridCol w:w="3120"/>
-        <w:gridCol w:w="3120"/>
-        <w:gridCol w:w="3120"/>
+        <w:gridCol w:w="3216"/>
+        <w:gridCol w:w="3216"/>
+        <w:gridCol w:w="3216"/>
       </w:tblGrid>
       <w:tr>
         <w:tc>
           <w:tcPr>
-            <w:tcW w:type="dxa" w:w="3120"/>
+            <w:tcW w:type="dxa" w:w="3216"/>
             <w:shd w:fill="003366"/>
             <w:tcMar>
               <w:top w:w="50" w:type="dxa"/>
@@ -1603,7 +1598,7 @@
         </w:tc>
         <w:tc>
           <w:tcPr>
-            <w:tcW w:type="dxa" w:w="3120"/>
+            <w:tcW w:type="dxa" w:w="3216"/>
             <w:shd w:fill="003366"/>
             <w:tcMar>
               <w:top w:w="50" w:type="dxa"/>
@@ -1625,7 +1620,7 @@
         </w:tc>
         <w:tc>
           <w:tcPr>
-            <w:tcW w:type="dxa" w:w="3120"/>
+            <w:tcW w:type="dxa" w:w="3216"/>
             <w:shd w:fill="003366"/>
             <w:tcMar>
               <w:top w:w="50" w:type="dxa"/>
@@ -1649,11 +1644,11 @@
       <w:tr>
         <w:tc>
           <w:tcPr>
-            <w:tcW w:type="dxa" w:w="3120"/>
+            <w:tcW w:type="dxa" w:w="3216"/>
             <w:shd w:fill="F9FBFD"/>
             <w:tcMar>
-              <w:top w:w="40" w:type="dxa"/>
-              <w:bottom w:w="40" w:type="dxa"/>
+              <w:top w:w="45" w:type="dxa"/>
+              <w:bottom w:w="45" w:type="dxa"/>
               <w:left w:w="70" w:type="dxa"/>
               <w:right w:w="70" w:type="dxa"/>
             </w:tcMar>
@@ -1669,11 +1664,11 @@
         </w:tc>
         <w:tc>
           <w:tcPr>
-            <w:tcW w:type="dxa" w:w="3120"/>
+            <w:tcW w:type="dxa" w:w="3216"/>
             <w:shd w:fill="F9FBFD"/>
             <w:tcMar>
-              <w:top w:w="40" w:type="dxa"/>
-              <w:bottom w:w="40" w:type="dxa"/>
+              <w:top w:w="45" w:type="dxa"/>
+              <w:bottom w:w="45" w:type="dxa"/>
               <w:left w:w="70" w:type="dxa"/>
               <w:right w:w="70" w:type="dxa"/>
             </w:tcMar>
@@ -1683,17 +1678,17 @@
               <w:rPr>
                 <w:sz w:val="17"/>
               </w:rPr>
-              <w:t>float / Sequence[float]</w:t>
+              <w:t>Float64 / Serie continua</w:t>
             </w:r>
           </w:p>
         </w:tc>
         <w:tc>
           <w:tcPr>
-            <w:tcW w:type="dxa" w:w="3120"/>
+            <w:tcW w:type="dxa" w:w="3216"/>
             <w:shd w:fill="F9FBFD"/>
             <w:tcMar>
-              <w:top w:w="40" w:type="dxa"/>
-              <w:bottom w:w="40" w:type="dxa"/>
+              <w:top w:w="45" w:type="dxa"/>
+              <w:bottom w:w="45" w:type="dxa"/>
               <w:left w:w="70" w:type="dxa"/>
               <w:right w:w="70" w:type="dxa"/>
             </w:tcMar>
@@ -1703,7 +1698,7 @@
               <w:rPr>
                 <w:sz w:val="17"/>
               </w:rPr>
-              <w:t>Variable de respuesta continua (semestres reales hasta titulación). Consumida por Merge Sort y Quickselect.</w:t>
+              <w:t>Variable de respuesta objetivo: duración real observada en semestres.</w:t>
             </w:r>
           </w:p>
         </w:tc>
@@ -1711,11 +1706,11 @@
       <w:tr>
         <w:tc>
           <w:tcPr>
-            <w:tcW w:type="dxa" w:w="3120"/>
+            <w:tcW w:type="dxa" w:w="3216"/>
             <w:shd w:fill="FFFFFF"/>
             <w:tcMar>
-              <w:top w:w="40" w:type="dxa"/>
-              <w:bottom w:w="40" w:type="dxa"/>
+              <w:top w:w="45" w:type="dxa"/>
+              <w:bottom w:w="45" w:type="dxa"/>
               <w:left w:w="70" w:type="dxa"/>
               <w:right w:w="70" w:type="dxa"/>
             </w:tcMar>
@@ -1725,17 +1720,17 @@
               <w:rPr>
                 <w:sz w:val="17"/>
               </w:rPr>
-              <w:t>nomb_area_cine_amb</w:t>
+              <w:t>dur_estudio_carr</w:t>
             </w:r>
           </w:p>
         </w:tc>
         <w:tc>
           <w:tcPr>
-            <w:tcW w:type="dxa" w:w="3120"/>
+            <w:tcW w:type="dxa" w:w="3216"/>
             <w:shd w:fill="FFFFFF"/>
             <w:tcMar>
-              <w:top w:w="40" w:type="dxa"/>
-              <w:bottom w:w="40" w:type="dxa"/>
+              <w:top w:w="45" w:type="dxa"/>
+              <w:bottom w:w="45" w:type="dxa"/>
               <w:left w:w="70" w:type="dxa"/>
               <w:right w:w="70" w:type="dxa"/>
             </w:tcMar>
@@ -1745,17 +1740,17 @@
               <w:rPr>
                 <w:sz w:val="17"/>
               </w:rPr>
-              <w:t>category / string</w:t>
+              <w:t>Float64 / Serie continua</w:t>
             </w:r>
           </w:p>
         </w:tc>
         <w:tc>
           <w:tcPr>
-            <w:tcW w:type="dxa" w:w="3120"/>
+            <w:tcW w:type="dxa" w:w="3216"/>
             <w:shd w:fill="FFFFFF"/>
             <w:tcMar>
-              <w:top w:w="40" w:type="dxa"/>
-              <w:bottom w:w="40" w:type="dxa"/>
+              <w:top w:w="45" w:type="dxa"/>
+              <w:bottom w:w="45" w:type="dxa"/>
               <w:left w:w="70" w:type="dxa"/>
               <w:right w:w="70" w:type="dxa"/>
             </w:tcMar>
@@ -1765,7 +1760,7 @@
               <w:rPr>
                 <w:sz w:val="17"/>
               </w:rPr>
-              <w:t>Factor académico jerárquico de nivel superior (10 grandes áreas del conocimiento UNESCO).</w:t>
+              <w:t>Duración teórica formal del plan curricular según registro oficial SIES.</w:t>
             </w:r>
           </w:p>
         </w:tc>
@@ -1773,11 +1768,11 @@
       <w:tr>
         <w:tc>
           <w:tcPr>
-            <w:tcW w:type="dxa" w:w="3120"/>
+            <w:tcW w:type="dxa" w:w="3216"/>
             <w:shd w:fill="F9FBFD"/>
             <w:tcMar>
-              <w:top w:w="40" w:type="dxa"/>
-              <w:bottom w:w="40" w:type="dxa"/>
+              <w:top w:w="45" w:type="dxa"/>
+              <w:bottom w:w="45" w:type="dxa"/>
               <w:left w:w="70" w:type="dxa"/>
               <w:right w:w="70" w:type="dxa"/>
             </w:tcMar>
@@ -1787,17 +1782,17 @@
               <w:rPr>
                 <w:sz w:val="17"/>
               </w:rPr>
-              <w:t>nomb_jornada, nomb_modalidad</w:t>
+              <w:t>nomb_carrera / cine_f_97_area</w:t>
             </w:r>
           </w:p>
         </w:tc>
         <w:tc>
           <w:tcPr>
-            <w:tcW w:type="dxa" w:w="3120"/>
+            <w:tcW w:type="dxa" w:w="3216"/>
             <w:shd w:fill="F9FBFD"/>
             <w:tcMar>
-              <w:top w:w="40" w:type="dxa"/>
-              <w:bottom w:w="40" w:type="dxa"/>
+              <w:top w:w="45" w:type="dxa"/>
+              <w:bottom w:w="45" w:type="dxa"/>
               <w:left w:w="70" w:type="dxa"/>
               <w:right w:w="70" w:type="dxa"/>
             </w:tcMar>
@@ -1807,17 +1802,17 @@
               <w:rPr>
                 <w:sz w:val="17"/>
               </w:rPr>
-              <w:t>category / string</w:t>
+              <w:t>Categorías normalizadas</w:t>
             </w:r>
           </w:p>
         </w:tc>
         <w:tc>
           <w:tcPr>
-            <w:tcW w:type="dxa" w:w="3120"/>
+            <w:tcW w:type="dxa" w:w="3216"/>
             <w:shd w:fill="F9FBFD"/>
             <w:tcMar>
-              <w:top w:w="40" w:type="dxa"/>
-              <w:bottom w:w="40" w:type="dxa"/>
+              <w:top w:w="45" w:type="dxa"/>
+              <w:bottom w:w="45" w:type="dxa"/>
               <w:left w:w="70" w:type="dxa"/>
               <w:right w:w="70" w:type="dxa"/>
             </w:tcMar>
@@ -1827,7 +1822,7 @@
               <w:rPr>
                 <w:sz w:val="17"/>
               </w:rPr>
-              <w:t>Factores de régimen curricular analizados en la exploración de sobreduración y agregación anidada.</w:t>
+              <w:t>Factores de segmentación jerárquica para exploración combinatoria.</w:t>
             </w:r>
           </w:p>
         </w:tc>
@@ -1835,11 +1830,11 @@
       <w:tr>
         <w:tc>
           <w:tcPr>
-            <w:tcW w:type="dxa" w:w="3120"/>
+            <w:tcW w:type="dxa" w:w="3216"/>
             <w:shd w:fill="FFFFFF"/>
             <w:tcMar>
-              <w:top w:w="40" w:type="dxa"/>
-              <w:bottom w:w="40" w:type="dxa"/>
+              <w:top w:w="45" w:type="dxa"/>
+              <w:bottom w:w="45" w:type="dxa"/>
               <w:left w:w="70" w:type="dxa"/>
               <w:right w:w="70" w:type="dxa"/>
             </w:tcMar>
@@ -1849,17 +1844,17 @@
               <w:rPr>
                 <w:sz w:val="17"/>
               </w:rPr>
-              <w:t>anio_ing_carr_ori_imputada</w:t>
+              <w:t>jornada / tipo_inst_1</w:t>
             </w:r>
           </w:p>
         </w:tc>
         <w:tc>
           <w:tcPr>
-            <w:tcW w:type="dxa" w:w="3120"/>
+            <w:tcW w:type="dxa" w:w="3216"/>
             <w:shd w:fill="FFFFFF"/>
             <w:tcMar>
-              <w:top w:w="40" w:type="dxa"/>
-              <w:bottom w:w="40" w:type="dxa"/>
+              <w:top w:w="45" w:type="dxa"/>
+              <w:bottom w:w="45" w:type="dxa"/>
               <w:left w:w="70" w:type="dxa"/>
               <w:right w:w="70" w:type="dxa"/>
             </w:tcMar>
@@ -1869,17 +1864,17 @@
               <w:rPr>
                 <w:sz w:val="17"/>
               </w:rPr>
-              <w:t>bool (0/1)</w:t>
+              <w:t>Factores discretos</w:t>
             </w:r>
           </w:p>
         </w:tc>
         <w:tc>
           <w:tcPr>
-            <w:tcW w:type="dxa" w:w="3120"/>
+            <w:tcW w:type="dxa" w:w="3216"/>
             <w:shd w:fill="FFFFFF"/>
             <w:tcMar>
-              <w:top w:w="40" w:type="dxa"/>
-              <w:bottom w:w="40" w:type="dxa"/>
+              <w:top w:w="45" w:type="dxa"/>
+              <w:bottom w:w="45" w:type="dxa"/>
               <w:left w:w="70" w:type="dxa"/>
               <w:right w:w="70" w:type="dxa"/>
             </w:tcMar>
@@ -1889,12 +1884,17 @@
               <w:rPr>
                 <w:sz w:val="17"/>
               </w:rPr>
-              <w:t>Bandera de trazabilidad que aísla los 13.396 casos originalmente con código 1900 para el análisis de sensibilidad.</w:t>
+              <w:t>Variables explicativas secundarias analizadas en agregación anidada.</w:t>
             </w:r>
           </w:p>
         </w:tc>
       </w:tr>
     </w:tbl>
+    <w:p>
+      <w:r>
+        <w:t>Para garantizar la eficiencia algorítmica y evitar transferencias de memoria innecesarias, las funciones de partición y búsqueda operan sobre arreglos unidimensionales contiguos (listas nativas de punto flotante de Python y series NumPy), mientras que la exploración combinatoria con poda aprovecha vistas indexadas de pandas sin duplicar estructuras en disco.</w:t>
+      </w:r>
+    </w:p>
     <w:tbl>
       <w:tblPr>
         <w:tblW w:type="auto" w:w="0"/>
@@ -1902,7 +1902,7 @@
         <w:tblLook w:firstColumn="1" w:firstRow="1" w:lastColumn="0" w:lastRow="0" w:noHBand="0" w:noVBand="1" w:val="04A0"/>
       </w:tblPr>
       <w:tblGrid>
-        <w:gridCol w:w="9360"/>
+        <w:gridCol w:w="9648"/>
       </w:tblGrid>
       <w:tr>
         <w:tc>
@@ -1953,7 +1953,7 @@
         <w:rPr>
           <w:b/>
           <w:color w:val="003366"/>
-          <w:sz w:val="26"/>
+          <w:sz w:val="24"/>
         </w:rPr>
         <w:t>III. Arquitectura modular y diseño orientado a objetos del pipeline</w:t>
       </w:r>
@@ -1974,7 +1974,7 @@
     </w:p>
     <w:p>
       <w:r>
-        <w:t>La arquitectura del proyecto sigue el principio de responsabilidad única (Single Responsibility Principle) y modularidad desacoplada. Toda la lógica de negocio, manipulación de datos, algoritmos e instrumentación reside en scripts reutilizables dentro del paquete src/, dejando los notebooks de Jupyter exclusivamente como capas de orquestación, experimentación interactiva y narrativa técnica.</w:t>
+        <w:t>La arquitectura del proyecto sigue el principio de responsabilidad única (Single Responsibility Principle) y bajo acoplamiento. El código desarrollado en src/ se distribuye en módulos desacoplados con responsabilidades analíticas bien delimitadas:</w:t>
       </w:r>
     </w:p>
     <w:tbl>
@@ -1984,14 +1984,14 @@
         <w:tblLook w:firstColumn="1" w:firstRow="1" w:lastColumn="0" w:lastRow="0" w:noHBand="0" w:noVBand="1" w:val="04A0"/>
       </w:tblPr>
       <w:tblGrid>
-        <w:gridCol w:w="3120"/>
-        <w:gridCol w:w="3120"/>
-        <w:gridCol w:w="3120"/>
+        <w:gridCol w:w="3216"/>
+        <w:gridCol w:w="3216"/>
+        <w:gridCol w:w="3216"/>
       </w:tblGrid>
       <w:tr>
         <w:tc>
           <w:tcPr>
-            <w:tcW w:type="dxa" w:w="3120"/>
+            <w:tcW w:type="dxa" w:w="3216"/>
             <w:shd w:fill="003366"/>
             <w:tcMar>
               <w:top w:w="50" w:type="dxa"/>
@@ -2013,7 +2013,7 @@
         </w:tc>
         <w:tc>
           <w:tcPr>
-            <w:tcW w:type="dxa" w:w="3120"/>
+            <w:tcW w:type="dxa" w:w="3216"/>
             <w:shd w:fill="003366"/>
             <w:tcMar>
               <w:top w:w="50" w:type="dxa"/>
@@ -2035,7 +2035,7 @@
         </w:tc>
         <w:tc>
           <w:tcPr>
-            <w:tcW w:type="dxa" w:w="3120"/>
+            <w:tcW w:type="dxa" w:w="3216"/>
             <w:shd w:fill="003366"/>
             <w:tcMar>
               <w:top w:w="50" w:type="dxa"/>
@@ -2059,11 +2059,11 @@
       <w:tr>
         <w:tc>
           <w:tcPr>
-            <w:tcW w:type="dxa" w:w="3120"/>
+            <w:tcW w:type="dxa" w:w="3216"/>
             <w:shd w:fill="F9FBFD"/>
             <w:tcMar>
-              <w:top w:w="40" w:type="dxa"/>
-              <w:bottom w:w="40" w:type="dxa"/>
+              <w:top w:w="45" w:type="dxa"/>
+              <w:bottom w:w="45" w:type="dxa"/>
               <w:left w:w="70" w:type="dxa"/>
               <w:right w:w="70" w:type="dxa"/>
             </w:tcMar>
@@ -2079,11 +2079,11 @@
         </w:tc>
         <w:tc>
           <w:tcPr>
-            <w:tcW w:type="dxa" w:w="3120"/>
+            <w:tcW w:type="dxa" w:w="3216"/>
             <w:shd w:fill="F9FBFD"/>
             <w:tcMar>
-              <w:top w:w="40" w:type="dxa"/>
-              <w:bottom w:w="40" w:type="dxa"/>
+              <w:top w:w="45" w:type="dxa"/>
+              <w:bottom w:w="45" w:type="dxa"/>
               <w:left w:w="70" w:type="dxa"/>
               <w:right w:w="70" w:type="dxa"/>
             </w:tcMar>
@@ -2093,17 +2093,17 @@
               <w:rPr>
                 <w:sz w:val="17"/>
               </w:rPr>
-              <w:t>Ingeniería algorítmica estructurada y recursiva.</w:t>
+              <w:t>Algoritmos estructurados y recursivos</w:t>
             </w:r>
           </w:p>
         </w:tc>
         <w:tc>
           <w:tcPr>
-            <w:tcW w:type="dxa" w:w="3120"/>
+            <w:tcW w:type="dxa" w:w="3216"/>
             <w:shd w:fill="F9FBFD"/>
             <w:tcMar>
-              <w:top w:w="40" w:type="dxa"/>
-              <w:bottom w:w="40" w:type="dxa"/>
+              <w:top w:w="45" w:type="dxa"/>
+              <w:bottom w:w="45" w:type="dxa"/>
               <w:left w:w="70" w:type="dxa"/>
               <w:right w:w="70" w:type="dxa"/>
             </w:tcMar>
@@ -2113,7 +2113,7 @@
               <w:rPr>
                 <w:sz w:val="17"/>
               </w:rPr>
-              <w:t>merge_sort, cuantil_quickselect, explorar_con_poda, agregacion_anidada.</w:t>
+              <w:t>merge_sort, quickselect, explorar_con_poda, agregacion_anidada.</w:t>
             </w:r>
           </w:p>
         </w:tc>
@@ -2121,11 +2121,11 @@
       <w:tr>
         <w:tc>
           <w:tcPr>
-            <w:tcW w:type="dxa" w:w="3120"/>
+            <w:tcW w:type="dxa" w:w="3216"/>
             <w:shd w:fill="FFFFFF"/>
             <w:tcMar>
-              <w:top w:w="40" w:type="dxa"/>
-              <w:bottom w:w="40" w:type="dxa"/>
+              <w:top w:w="45" w:type="dxa"/>
+              <w:bottom w:w="45" w:type="dxa"/>
               <w:left w:w="70" w:type="dxa"/>
               <w:right w:w="70" w:type="dxa"/>
             </w:tcMar>
@@ -2141,11 +2141,11 @@
         </w:tc>
         <w:tc>
           <w:tcPr>
-            <w:tcW w:type="dxa" w:w="3120"/>
+            <w:tcW w:type="dxa" w:w="3216"/>
             <w:shd w:fill="FFFFFF"/>
             <w:tcMar>
-              <w:top w:w="40" w:type="dxa"/>
-              <w:bottom w:w="40" w:type="dxa"/>
+              <w:top w:w="45" w:type="dxa"/>
+              <w:bottom w:w="45" w:type="dxa"/>
               <w:left w:w="70" w:type="dxa"/>
               <w:right w:w="70" w:type="dxa"/>
             </w:tcMar>
@@ -2155,17 +2155,17 @@
               <w:rPr>
                 <w:sz w:val="17"/>
               </w:rPr>
-              <w:t>Perfilado experimental y benchmarking empírico.</w:t>
+              <w:t>Medición empírica y perfiles de recursos</w:t>
             </w:r>
           </w:p>
         </w:tc>
         <w:tc>
           <w:tcPr>
-            <w:tcW w:type="dxa" w:w="3120"/>
+            <w:tcW w:type="dxa" w:w="3216"/>
             <w:shd w:fill="FFFFFF"/>
             <w:tcMar>
-              <w:top w:w="40" w:type="dxa"/>
-              <w:bottom w:w="40" w:type="dxa"/>
+              <w:top w:w="45" w:type="dxa"/>
+              <w:bottom w:w="45" w:type="dxa"/>
               <w:left w:w="70" w:type="dxa"/>
               <w:right w:w="70" w:type="dxa"/>
             </w:tcMar>
@@ -2175,7 +2175,7 @@
               <w:rPr>
                 <w:sz w:val="17"/>
               </w:rPr>
-              <w:t>Clase MedidorComplejidad, perfiles con time.perf_counter y tracemalloc.</w:t>
+              <w:t>Clase MedidorComplejidad, perfiles de tiempo, memoria y llamadas.</w:t>
             </w:r>
           </w:p>
         </w:tc>
@@ -2183,11 +2183,11 @@
       <w:tr>
         <w:tc>
           <w:tcPr>
-            <w:tcW w:type="dxa" w:w="3120"/>
+            <w:tcW w:type="dxa" w:w="3216"/>
             <w:shd w:fill="F9FBFD"/>
             <w:tcMar>
-              <w:top w:w="40" w:type="dxa"/>
-              <w:bottom w:w="40" w:type="dxa"/>
+              <w:top w:w="45" w:type="dxa"/>
+              <w:bottom w:w="45" w:type="dxa"/>
               <w:left w:w="70" w:type="dxa"/>
               <w:right w:w="70" w:type="dxa"/>
             </w:tcMar>
@@ -2203,11 +2203,11 @@
         </w:tc>
         <w:tc>
           <w:tcPr>
-            <w:tcW w:type="dxa" w:w="3120"/>
+            <w:tcW w:type="dxa" w:w="3216"/>
             <w:shd w:fill="F9FBFD"/>
             <w:tcMar>
-              <w:top w:w="40" w:type="dxa"/>
-              <w:bottom w:w="40" w:type="dxa"/>
+              <w:top w:w="45" w:type="dxa"/>
+              <w:bottom w:w="45" w:type="dxa"/>
               <w:left w:w="70" w:type="dxa"/>
               <w:right w:w="70" w:type="dxa"/>
             </w:tcMar>
@@ -2217,17 +2217,17 @@
               <w:rPr>
                 <w:sz w:val="17"/>
               </w:rPr>
-              <w:t>Arquitectura POO del pipeline de preprocesamiento.</w:t>
+              <w:t>Jerarquía de clases para el flujo de datos</w:t>
             </w:r>
           </w:p>
         </w:tc>
         <w:tc>
           <w:tcPr>
-            <w:tcW w:type="dxa" w:w="3120"/>
+            <w:tcW w:type="dxa" w:w="3216"/>
             <w:shd w:fill="F9FBFD"/>
             <w:tcMar>
-              <w:top w:w="40" w:type="dxa"/>
-              <w:bottom w:w="40" w:type="dxa"/>
+              <w:top w:w="45" w:type="dxa"/>
+              <w:bottom w:w="45" w:type="dxa"/>
               <w:left w:w="70" w:type="dxa"/>
               <w:right w:w="70" w:type="dxa"/>
             </w:tcMar>
@@ -2237,7 +2237,7 @@
               <w:rPr>
                 <w:sz w:val="17"/>
               </w:rPr>
-              <w:t>Clase abstracta Transformador (fit/apply) y clase orquestadora Pipeline.</w:t>
+              <w:t>Clase base Transformador, subclases especializadas y clase Pipeline.</w:t>
             </w:r>
           </w:p>
         </w:tc>
@@ -2245,11 +2245,11 @@
       <w:tr>
         <w:tc>
           <w:tcPr>
-            <w:tcW w:type="dxa" w:w="3120"/>
+            <w:tcW w:type="dxa" w:w="3216"/>
             <w:shd w:fill="FFFFFF"/>
             <w:tcMar>
-              <w:top w:w="40" w:type="dxa"/>
-              <w:bottom w:w="40" w:type="dxa"/>
+              <w:top w:w="45" w:type="dxa"/>
+              <w:bottom w:w="45" w:type="dxa"/>
               <w:left w:w="70" w:type="dxa"/>
               <w:right w:w="70" w:type="dxa"/>
             </w:tcMar>
@@ -2259,17 +2259,17 @@
               <w:rPr>
                 <w:sz w:val="17"/>
               </w:rPr>
-              <w:t>src/limpieza.py, escalado.py</w:t>
+              <w:t>src/limpieza.py / escalado.py</w:t>
             </w:r>
           </w:p>
         </w:tc>
         <w:tc>
           <w:tcPr>
-            <w:tcW w:type="dxa" w:w="3120"/>
+            <w:tcW w:type="dxa" w:w="3216"/>
             <w:shd w:fill="FFFFFF"/>
             <w:tcMar>
-              <w:top w:w="40" w:type="dxa"/>
-              <w:bottom w:w="40" w:type="dxa"/>
+              <w:top w:w="45" w:type="dxa"/>
+              <w:bottom w:w="45" w:type="dxa"/>
               <w:left w:w="70" w:type="dxa"/>
               <w:right w:w="70" w:type="dxa"/>
             </w:tcMar>
@@ -2279,17 +2279,17 @@
               <w:rPr>
                 <w:sz w:val="17"/>
               </w:rPr>
-              <w:t>Operaciones elementales de transformación tabular.</w:t>
+              <w:t>Funciones analíticas puras (Fase 2)</w:t>
             </w:r>
           </w:p>
         </w:tc>
         <w:tc>
           <w:tcPr>
-            <w:tcW w:type="dxa" w:w="3120"/>
+            <w:tcW w:type="dxa" w:w="3216"/>
             <w:shd w:fill="FFFFFF"/>
             <w:tcMar>
-              <w:top w:w="40" w:type="dxa"/>
-              <w:bottom w:w="40" w:type="dxa"/>
+              <w:top w:w="45" w:type="dxa"/>
+              <w:bottom w:w="45" w:type="dxa"/>
               <w:left w:w="70" w:type="dxa"/>
               <w:right w:w="70" w:type="dxa"/>
             </w:tcMar>
@@ -2299,7 +2299,7 @@
               <w:rPr>
                 <w:sz w:val="17"/>
               </w:rPr>
-              <w:t>Funciones funcionales puras de imputación, codificación y escalado.</w:t>
+              <w:t>Imputación condicional, filtros de duplicados y escalamiento robusto.</w:t>
             </w:r>
           </w:p>
         </w:tc>
@@ -2307,11 +2307,11 @@
       <w:tr>
         <w:tc>
           <w:tcPr>
-            <w:tcW w:type="dxa" w:w="3120"/>
+            <w:tcW w:type="dxa" w:w="3216"/>
             <w:shd w:fill="F9FBFD"/>
             <w:tcMar>
-              <w:top w:w="40" w:type="dxa"/>
-              <w:bottom w:w="40" w:type="dxa"/>
+              <w:top w:w="45" w:type="dxa"/>
+              <w:bottom w:w="45" w:type="dxa"/>
               <w:left w:w="70" w:type="dxa"/>
               <w:right w:w="70" w:type="dxa"/>
             </w:tcMar>
@@ -2327,11 +2327,11 @@
         </w:tc>
         <w:tc>
           <w:tcPr>
-            <w:tcW w:type="dxa" w:w="3120"/>
+            <w:tcW w:type="dxa" w:w="3216"/>
             <w:shd w:fill="F9FBFD"/>
             <w:tcMar>
-              <w:top w:w="40" w:type="dxa"/>
-              <w:bottom w:w="40" w:type="dxa"/>
+              <w:top w:w="45" w:type="dxa"/>
+              <w:bottom w:w="45" w:type="dxa"/>
               <w:left w:w="70" w:type="dxa"/>
               <w:right w:w="70" w:type="dxa"/>
             </w:tcMar>
@@ -2341,17 +2341,17 @@
               <w:rPr>
                 <w:sz w:val="17"/>
               </w:rPr>
-              <w:t>Auditoría, trazabilidad y control formal automático.</w:t>
+              <w:t>Control formal de evidencias e integración</w:t>
             </w:r>
           </w:p>
         </w:tc>
         <w:tc>
           <w:tcPr>
-            <w:tcW w:type="dxa" w:w="3120"/>
+            <w:tcW w:type="dxa" w:w="3216"/>
             <w:shd w:fill="F9FBFD"/>
             <w:tcMar>
-              <w:top w:w="40" w:type="dxa"/>
-              <w:bottom w:w="40" w:type="dxa"/>
+              <w:top w:w="45" w:type="dxa"/>
+              <w:bottom w:w="45" w:type="dxa"/>
               <w:left w:w="70" w:type="dxa"/>
               <w:right w:w="70" w:type="dxa"/>
             </w:tcMar>
@@ -2361,7 +2361,7 @@
               <w:rPr>
                 <w:sz w:val="17"/>
               </w:rPr>
-              <w:t>Inspección AST de dependencias, auditoría de commits y ejecución de suites.</w:t>
+              <w:t>Auditoría de suites de prueba, conteo de commits y bitácora de verificación.</w:t>
             </w:r>
           </w:p>
         </w:tc>
@@ -2383,7 +2383,67 @@
     </w:p>
     <w:p>
       <w:r>
-        <w:t>En cumplimiento de las observaciones del docente sobre la Sumativa 1, la Fase 3 transforma el pipeline secuencial de funciones en una arquitectura de programación orientada a objetos (POO). Se implementa una clase base abstracta Transformador que define formalmente la interfaz con métodos fit y apply. Esta separación previene formalmente el data leakage. Cada etapa se modela como subclase (LimpiadorValoresEspeciales, ImputadorMediana, CodificadorCategorico, EscaladorRobusto), compuestas dentro de la clase orquestadora Pipeline, la cual instrumenta tiempos y consumos de memoria por etapa.</w:t>
+        <w:t>En cumplimiento de las observaciones del docente sobre la Sumativa 1, la Fase 3 formalizó la transición desde el paradigma funcional hacia una jerarquía de clases orientada a objetos (src/pipeline.py). Se diseñó la clase abstracta Transformador, que define el contrato fit(df) y apply(df), resolviendo de manera estructural el riesgo de fuga de datos (data leakage) al desacoplar el aprendizaje de parámetros (medianas, modas, categorías frecuentes) de su aplicación sobre los registros.</w:t>
+      </w:r>
+    </w:p>
+    <w:p>
+      <w:r>
+        <w:t>Las clases concretas implementadas abarcan: EliminadorDuplicados, CodigoAFaltante, ImputadorMedianaPorGrupo, EliminadorConstantes, CodificadorOrdinal, AgrupadorRaras, CodificadorOneHot y EscaladorRobusto. La orquestación completa recae en la clase Pipeline, la cual permite componer etapas secuenciales, monitorizar tiempos de CPU y memoria pico por etapa, e identificar la etapa dominante.</w:t>
+      </w:r>
+    </w:p>
+    <w:p>
+      <w:pPr>
+        <w:keepNext/>
+        <w:spacing w:before="100" w:after="40"/>
+        <w:jc w:val="center"/>
+      </w:pPr>
+      <w:r>
+        <w:drawing>
+          <wp:inline xmlns:a="http://schemas.openxmlformats.org/drawingml/2006/main" xmlns:pic="http://schemas.openxmlformats.org/drawingml/2006/picture">
+            <wp:extent cx="4937760" cy="1675722"/>
+            <wp:docPr id="1" name="Picture 1"/>
+            <wp:cNvGraphicFramePr>
+              <a:graphicFrameLocks noChangeAspect="1"/>
+            </wp:cNvGraphicFramePr>
+            <a:graphic>
+              <a:graphicData uri="http://schemas.openxmlformats.org/drawingml/2006/picture">
+                <pic:pic>
+                  <pic:nvPicPr>
+                    <pic:cNvPr id="0" name="f3_00_costo_por_etapa.png"/>
+                    <pic:cNvPicPr/>
+                  </pic:nvPicPr>
+                  <pic:blipFill>
+                    <a:blip r:embed="rId10"/>
+                    <a:stretch>
+                      <a:fillRect/>
+                    </a:stretch>
+                  </pic:blipFill>
+                  <pic:spPr>
+                    <a:xfrm>
+                      <a:off x="0" y="0"/>
+                      <a:ext cx="4937760" cy="1675722"/>
+                    </a:xfrm>
+                    <a:prstGeom prst="rect"/>
+                  </pic:spPr>
+                </pic:pic>
+              </a:graphicData>
+            </a:graphic>
+          </wp:inline>
+        </w:drawing>
+      </w:r>
+    </w:p>
+    <w:p>
+      <w:pPr>
+        <w:spacing w:after="100"/>
+        <w:jc w:val="center"/>
+      </w:pPr>
+      <w:r>
+        <w:rPr>
+          <w:i/>
+          <w:color w:val="555555"/>
+          <w:sz w:val="17"/>
+        </w:rPr>
+        <w:t>Figura 1: Costo computacional en tiempo y consumo de memoria por etapa del pipeline POO.</w:t>
       </w:r>
     </w:p>
     <w:p>
@@ -2402,7 +2462,16 @@
     </w:p>
     <w:p>
       <w:r>
-        <w:t>La independencia modular de src/ fue validada por el script de trazabilidad mediante análisis sintáctico abstracto (AST). El grafo confirma que los módulos de algoritmos y complejidad no presentan acoplamiento circular, preparando al equipo para la Fase 4 sin requerir refactorizaciones estructurales.</w:t>
+        <w:t>La independencia modular de src/ fue validada por el script de trazabilidad mediante análisis estático de código (AST). La arquitectura mantiene desacoplados los algoritmos puros de las transformaciones tabulares. El uso de POO en esta fase se justifica por:</w:t>
+      </w:r>
+    </w:p>
+    <w:p>
+      <w:r>
+        <w:t>1. Encapsulamiento del Estado Interno: Cada transformador retiene exclusivamente sus hiperparámetros y estadísticas aprendidas en fit(), impidiendo mutaciones laterales imprevistas en los datos originales.</w:t>
+        <w:br/>
+        <w:t>2. Componibilidad y Extensibilidad: Permite encadenar transformadores homogéneos en pipelines reconfigurables sin alterar la lógica de negocio.</w:t>
+        <w:br/>
+        <w:t>3. Trazabilidad y Perfilado Integrado: La clase Pipeline cronometra y audita el consumo de recursos de cada etapa de forma nativa.</w:t>
       </w:r>
     </w:p>
     <w:p>
@@ -2414,7 +2483,7 @@
         <w:rPr>
           <w:b/>
           <w:color w:val="003366"/>
-          <w:sz w:val="26"/>
+          <w:sz w:val="24"/>
         </w:rPr>
         <w:t>IV. Diseño e implementación de algoritmos estructurados y recursivos</w:t>
       </w:r>
@@ -2435,25 +2504,69 @@
     </w:p>
     <w:p>
       <w:r>
-        <w:t>Para responder a la pregunta de investigación sobre la sobreduración de las carreras, el cálculo de medianas y percentiles es una operación central. En src/algoritmos.py se implementaron dos algoritmos recursivos basados en Divide and Conquer:</w:t>
+        <w:t>Para responder a la pregunta de investigación sobre la sobreduración de las carreras, el equipo requirió calcular sistemáticamente medianas y cuantiles sobre subgrupos de gran tamaño sin incurrir en costos computacionales cuadráticos. Se implementaron dos algoritmos recursivos fundamentales:</w:t>
       </w:r>
     </w:p>
     <w:p>
       <w:r>
-        <w:t>1. Merge Sort (Ordenamiento por Mezcla): Divide la lista de duraciones en dos mitades simétricas de forma recursiva, ordena cada mitad y luego las fusiona en un paso lineal. Su ecuación de recurrencia formal es:</w:t>
+        <w:t>1. Merge Sort (Ordenamiento por Mezcla): Divide la lista de duraciones en dos mitades, las ordena recursivamente y las fusiona de forma estable. Su complejidad temporal garantizada es O(N log N) en el peor caso, con una complejidad espacial auxiliar de O(N).</w:t>
         <w:br/>
-        <w:t xml:space="preserve">   T(n) = 2 · T(n/2) + O(n)</w:t>
-        <w:br/>
-        <w:t>Aplicando el Caso 2 del Teorema Maestro (donde a = 2, b = 2 y f(n) = O(n)), se deduce formalmente una complejidad temporal determinista de Θ(n log n). Su costo espacial auxiliar es O(n) debido a los arreglos intermedios de mezcla.</w:t>
+        <w:t>2. Quickselect (Búsqueda de Cuantiles): Algoritmo de selección probabilístico basado en la partición de Hoare/Lomuto. A diferencia de Merge Sort, Quickselect solo realiza la llamada recursiva sobre la partición que contiene la posición k buscada (prune and search). Esto reduce su complejidad promedio a O(N) lineal, con consumo espacial en pila de llamadas de O(log N).</w:t>
       </w:r>
     </w:p>
     <w:p>
+      <w:pPr>
+        <w:keepNext/>
+        <w:spacing w:before="100" w:after="40"/>
+        <w:jc w:val="center"/>
+      </w:pPr>
       <w:r>
-        <w:t>2. Quickselect (Búsqueda de Cuantiles): Algoritmo de selección probabilístico que particiona el arreglo respecto a un pivote aleatorio (método Hoare). A diferencia del ordenamiento completo, Quickselect solo se llama recursivamente sobre el subarreglo que contiene la posición k buscada. Su recurrencia promedio es:</w:t>
-        <w:br/>
-        <w:t xml:space="preserve">   T(n) = T(n/2) + O(n)</w:t>
-        <w:br/>
-        <w:t>Por el Teorema Maestro (Caso 3), su orden de complejidad temporal esperado es lineal O(n). Esto representa una optimización crítica frente a la versión ingenua (cuantil_ordenando), que ordena la totalidad de los 105.060 registros con costo O(n log n) simplemente para inspeccionar un valor.</w:t>
+        <w:drawing>
+          <wp:inline xmlns:a="http://schemas.openxmlformats.org/drawingml/2006/main" xmlns:pic="http://schemas.openxmlformats.org/drawingml/2006/picture">
+            <wp:extent cx="4937760" cy="3058992"/>
+            <wp:docPr id="2" name="Picture 2"/>
+            <wp:cNvGraphicFramePr>
+              <a:graphicFrameLocks noChangeAspect="1"/>
+            </wp:cNvGraphicFramePr>
+            <a:graphic>
+              <a:graphicData uri="http://schemas.openxmlformats.org/drawingml/2006/picture">
+                <pic:pic>
+                  <pic:nvPicPr>
+                    <pic:cNvPr id="0" name="rendimiento_divide_y_venceras.png"/>
+                    <pic:cNvPicPr/>
+                  </pic:nvPicPr>
+                  <pic:blipFill>
+                    <a:blip r:embed="rId11"/>
+                    <a:stretch>
+                      <a:fillRect/>
+                    </a:stretch>
+                  </pic:blipFill>
+                  <pic:spPr>
+                    <a:xfrm>
+                      <a:off x="0" y="0"/>
+                      <a:ext cx="4937760" cy="3058992"/>
+                    </a:xfrm>
+                    <a:prstGeom prst="rect"/>
+                  </pic:spPr>
+                </pic:pic>
+              </a:graphicData>
+            </a:graphic>
+          </wp:inline>
+        </w:drawing>
+      </w:r>
+    </w:p>
+    <w:p>
+      <w:pPr>
+        <w:spacing w:after="100"/>
+        <w:jc w:val="center"/>
+      </w:pPr>
+      <w:r>
+        <w:rPr>
+          <w:i/>
+          <w:color w:val="555555"/>
+          <w:sz w:val="17"/>
+        </w:rPr>
+        <w:t>Figura 2: Comparación empírica de algoritmos divide y vencerás: Merge Sort vs Quickselect sobre duraciones reales.</w:t>
       </w:r>
     </w:p>
     <w:p>
@@ -2472,12 +2585,12 @@
     </w:p>
     <w:p>
       <w:r>
-        <w:t>El análisis multivariado de factores (área de conocimiento, jornada, modalidad y tramo etario) enfrenta un desafío combinatorio clásico: el árbol de subgrupos posibles crece de forma exponencial según el producto cartesiano de las cardinalidades. Para detectar combinaciones críticas de sobreduración sin colapsar el sistema, se diseñó la función explorar_con_poda, que recorre el árbol en profundidad implementando dos criterios de poda matemáticamente rigurosos y demostrablemente admisibles:</w:t>
+        <w:t>El análisis multivariado de factores (área de conocimiento, jornada, modalidad y tipo de institución) expone el problema clásico de la explosión combinatoria (|C| = ∏ |D_i| &gt; 10^4 ramas posibles). Para identificar combinaciones que exhiban sobreduración sin recorrer el árbol exhaustivo completo, se implementó explorar_con_poda en src/algoritmos.py bajo dos criterios de poda matemáticamente probados:</w:t>
       </w:r>
     </w:p>
     <w:p>
       <w:r>
-        <w:t>• Poda 1 (Por Soporte Mínimo): Si un nodo intermedio agrupa menos de un umbral representativo (n &lt; 100), se poda de inmediato la rama completa. Demostración de corrección: Los descendientes de un subconjunto S' ⊆ S satisfacen estrictamente |S'| ≤ |S|. Si |S| &lt; 100, ningún subgrupo derivado podrá satisfacer jamás el soporte mínimo representativo.</w:t>
+        <w:t>• Poda 1 (Por Soporte Mínimo): Si un nodo intermedio agrupa a menos de 100 titulados, se poda inmediatamente toda su descendencia. Demostración de corrección: Los descendientes de un subconjunto S' ⊆ S satisfacen estrictamente |S'| ≤ |S|. Si |S| &lt; 100, ningún subgrupo derivado podrá satisfacer jamás el soporte mínimo representativo.</w:t>
       </w:r>
     </w:p>
     <w:p>
@@ -2487,7 +2600,62 @@
     </w:p>
     <w:p>
       <w:r>
-        <w:t>Para validar la exactitud de la poda, se construyó la función simétrica explorar_exhaustivo (búsqueda ciega total). Las pruebas automatizadas demostraron que ambas funciones devuelven exactamente los mismos hallazgos críticos de sobreduración, pero la versión con poda reduce el número de nodos visitados y el tiempo de cómputo en más de un 75%.</w:t>
+        <w:t>Para validar la exactitud de la poda, se construyó la función simétrica explorar_exhaustivo. Las pruebas demostraron que ambas funciones devuelven exactamente los mismos 72 hallazgos críticos de sobreduración, pero la poda evita el 36,7% de los nodos visitados (209 frente a 330) y poda 76 ramas estériles, garantizando exactitud sin desperdicio computacional.</w:t>
+      </w:r>
+    </w:p>
+    <w:p>
+      <w:pPr>
+        <w:keepNext/>
+        <w:spacing w:before="100" w:after="40"/>
+        <w:jc w:val="center"/>
+      </w:pPr>
+      <w:r>
+        <w:drawing>
+          <wp:inline xmlns:a="http://schemas.openxmlformats.org/drawingml/2006/main" xmlns:pic="http://schemas.openxmlformats.org/drawingml/2006/picture">
+            <wp:extent cx="4937760" cy="3060285"/>
+            <wp:docPr id="3" name="Picture 3"/>
+            <wp:cNvGraphicFramePr>
+              <a:graphicFrameLocks noChangeAspect="1"/>
+            </wp:cNvGraphicFramePr>
+            <a:graphic>
+              <a:graphicData uri="http://schemas.openxmlformats.org/drawingml/2006/picture">
+                <pic:pic>
+                  <pic:nvPicPr>
+                    <pic:cNvPr id="0" name="rendimiento_exploracion_poda.png"/>
+                    <pic:cNvPicPr/>
+                  </pic:nvPicPr>
+                  <pic:blipFill>
+                    <a:blip r:embed="rId12"/>
+                    <a:stretch>
+                      <a:fillRect/>
+                    </a:stretch>
+                  </pic:blipFill>
+                  <pic:spPr>
+                    <a:xfrm>
+                      <a:off x="0" y="0"/>
+                      <a:ext cx="4937760" cy="3060285"/>
+                    </a:xfrm>
+                    <a:prstGeom prst="rect"/>
+                  </pic:spPr>
+                </pic:pic>
+              </a:graphicData>
+            </a:graphic>
+          </wp:inline>
+        </w:drawing>
+      </w:r>
+    </w:p>
+    <w:p>
+      <w:pPr>
+        <w:spacing w:after="100"/>
+        <w:jc w:val="center"/>
+      </w:pPr>
+      <w:r>
+        <w:rPr>
+          <w:i/>
+          <w:color w:val="555555"/>
+          <w:sz w:val="17"/>
+        </w:rPr>
+        <w:t>Figura 3: Nodos visitados y ramas podadas: Exploración con Poda vs Búsqueda Exhaustiva.</w:t>
       </w:r>
     </w:p>
     <w:p>
@@ -2518,7 +2686,7 @@
         <w:rPr>
           <w:b/>
           <w:color w:val="003366"/>
-          <w:sz w:val="26"/>
+          <w:sz w:val="24"/>
         </w:rPr>
         <w:t>V. Medición empírica de complejidad computacional y eficiencia</w:t>
       </w:r>
@@ -2539,7 +2707,7 @@
     </w:p>
     <w:p>
       <w:r>
-        <w:t>A través de la clase MedidorComplejidad (src/complejidad.py), se realizaron pruebas de estrés experimental variando sistemáticamente el tamaño muestral N ∈ [500, 1.000, 2.500, 5.000, 10.000, 20.000] con datos reales de duración. Se registraron los tiempos de CPU en milisegundos utilizando time.perf_counter() de alta resolución.</w:t>
+        <w:t>A través de la clase MedidorComplejidad (src/complejidad.py), se realizaron pruebas de estrés experimental variando sistemáticamente el tamaño muestral N ∈ [1.000, 5.000, 10.000, 20.000, 50.000] con datos reales de duración de titulados. Se registraron los tiempos de CPU y la memoria pico utilizando tracemalloc y time.time().</w:t>
       </w:r>
     </w:p>
     <w:tbl>
@@ -2549,15 +2717,15 @@
         <w:tblLook w:firstColumn="1" w:firstRow="1" w:lastColumn="0" w:lastRow="0" w:noHBand="0" w:noVBand="1" w:val="04A0"/>
       </w:tblPr>
       <w:tblGrid>
-        <w:gridCol w:w="2340"/>
-        <w:gridCol w:w="2340"/>
-        <w:gridCol w:w="2340"/>
-        <w:gridCol w:w="2340"/>
+        <w:gridCol w:w="2412"/>
+        <w:gridCol w:w="2412"/>
+        <w:gridCol w:w="2412"/>
+        <w:gridCol w:w="2412"/>
       </w:tblGrid>
       <w:tr>
         <w:tc>
           <w:tcPr>
-            <w:tcW w:type="dxa" w:w="2340"/>
+            <w:tcW w:type="dxa" w:w="2412"/>
             <w:shd w:fill="003366"/>
             <w:tcMar>
               <w:top w:w="50" w:type="dxa"/>
@@ -2579,7 +2747,7 @@
         </w:tc>
         <w:tc>
           <w:tcPr>
-            <w:tcW w:type="dxa" w:w="2340"/>
+            <w:tcW w:type="dxa" w:w="2412"/>
             <w:shd w:fill="003366"/>
             <w:tcMar>
               <w:top w:w="50" w:type="dxa"/>
@@ -2595,13 +2763,13 @@
                 <w:color w:val="FFFFFF"/>
                 <w:sz w:val="18"/>
               </w:rPr>
-              <w:t>Quickselect (s)</w:t>
+              <w:t>Ingenuo (Ordena Todo) [s]</w:t>
             </w:r>
           </w:p>
         </w:tc>
         <w:tc>
           <w:tcPr>
-            <w:tcW w:type="dxa" w:w="2340"/>
+            <w:tcW w:type="dxa" w:w="2412"/>
             <w:shd w:fill="003366"/>
             <w:tcMar>
               <w:top w:w="50" w:type="dxa"/>
@@ -2617,13 +2785,13 @@
                 <w:color w:val="FFFFFF"/>
                 <w:sz w:val="18"/>
               </w:rPr>
-              <w:t>Merge Sort (s)</w:t>
+              <w:t>Quickselect [s]</w:t>
             </w:r>
           </w:p>
         </w:tc>
         <w:tc>
           <w:tcPr>
-            <w:tcW w:type="dxa" w:w="2340"/>
+            <w:tcW w:type="dxa" w:w="2412"/>
             <w:shd w:fill="003366"/>
             <w:tcMar>
               <w:top w:w="50" w:type="dxa"/>
@@ -2639,7 +2807,7 @@
                 <w:color w:val="FFFFFF"/>
                 <w:sz w:val="18"/>
               </w:rPr>
-              <w:t>Cuantil Ordenando (s)</w:t>
+              <w:t>Memoria Pico [KB]</w:t>
             </w:r>
           </w:p>
         </w:tc>
@@ -2647,93 +2815,11 @@
       <w:tr>
         <w:tc>
           <w:tcPr>
-            <w:tcW w:type="dxa" w:w="2340"/>
+            <w:tcW w:type="dxa" w:w="2412"/>
             <w:shd w:fill="F9FBFD"/>
             <w:tcMar>
-              <w:top w:w="40" w:type="dxa"/>
-              <w:bottom w:w="40" w:type="dxa"/>
-              <w:left w:w="70" w:type="dxa"/>
-              <w:right w:w="70" w:type="dxa"/>
-            </w:tcMar>
-          </w:tcPr>
-          <w:p>
-            <w:r>
-              <w:rPr>
-                <w:sz w:val="17"/>
-              </w:rPr>
-              <w:t>500</w:t>
-            </w:r>
-          </w:p>
-        </w:tc>
-        <w:tc>
-          <w:tcPr>
-            <w:tcW w:type="dxa" w:w="2340"/>
-            <w:shd w:fill="F9FBFD"/>
-            <w:tcMar>
-              <w:top w:w="40" w:type="dxa"/>
-              <w:bottom w:w="40" w:type="dxa"/>
-              <w:left w:w="70" w:type="dxa"/>
-              <w:right w:w="70" w:type="dxa"/>
-            </w:tcMar>
-          </w:tcPr>
-          <w:p>
-            <w:r>
-              <w:rPr>
-                <w:sz w:val="17"/>
-              </w:rPr>
-              <w:t>0.0004</w:t>
-            </w:r>
-          </w:p>
-        </w:tc>
-        <w:tc>
-          <w:tcPr>
-            <w:tcW w:type="dxa" w:w="2340"/>
-            <w:shd w:fill="F9FBFD"/>
-            <w:tcMar>
-              <w:top w:w="40" w:type="dxa"/>
-              <w:bottom w:w="40" w:type="dxa"/>
-              <w:left w:w="70" w:type="dxa"/>
-              <w:right w:w="70" w:type="dxa"/>
-            </w:tcMar>
-          </w:tcPr>
-          <w:p>
-            <w:r>
-              <w:rPr>
-                <w:sz w:val="17"/>
-              </w:rPr>
-              <w:t>0.0018</w:t>
-            </w:r>
-          </w:p>
-        </w:tc>
-        <w:tc>
-          <w:tcPr>
-            <w:tcW w:type="dxa" w:w="2340"/>
-            <w:shd w:fill="F9FBFD"/>
-            <w:tcMar>
-              <w:top w:w="40" w:type="dxa"/>
-              <w:bottom w:w="40" w:type="dxa"/>
-              <w:left w:w="70" w:type="dxa"/>
-              <w:right w:w="70" w:type="dxa"/>
-            </w:tcMar>
-          </w:tcPr>
-          <w:p>
-            <w:r>
-              <w:rPr>
-                <w:sz w:val="17"/>
-              </w:rPr>
-              <w:t>0.0009</w:t>
-            </w:r>
-          </w:p>
-        </w:tc>
-      </w:tr>
-      <w:tr>
-        <w:tc>
-          <w:tcPr>
-            <w:tcW w:type="dxa" w:w="2340"/>
-            <w:shd w:fill="FFFFFF"/>
-            <w:tcMar>
-              <w:top w:w="40" w:type="dxa"/>
-              <w:bottom w:w="40" w:type="dxa"/>
+              <w:top w:w="45" w:type="dxa"/>
+              <w:bottom w:w="45" w:type="dxa"/>
               <w:left w:w="70" w:type="dxa"/>
               <w:right w:w="70" w:type="dxa"/>
             </w:tcMar>
@@ -2749,11 +2835,11 @@
         </w:tc>
         <w:tc>
           <w:tcPr>
-            <w:tcW w:type="dxa" w:w="2340"/>
-            <w:shd w:fill="FFFFFF"/>
+            <w:tcW w:type="dxa" w:w="2412"/>
+            <w:shd w:fill="F9FBFD"/>
             <w:tcMar>
-              <w:top w:w="40" w:type="dxa"/>
-              <w:bottom w:w="40" w:type="dxa"/>
+              <w:top w:w="45" w:type="dxa"/>
+              <w:bottom w:w="45" w:type="dxa"/>
               <w:left w:w="70" w:type="dxa"/>
               <w:right w:w="70" w:type="dxa"/>
             </w:tcMar>
@@ -2763,17 +2849,17 @@
               <w:rPr>
                 <w:sz w:val="17"/>
               </w:rPr>
-              <w:t>0.0008</w:t>
+              <w:t>0.000048 s</w:t>
             </w:r>
           </w:p>
         </w:tc>
         <w:tc>
           <w:tcPr>
-            <w:tcW w:type="dxa" w:w="2340"/>
-            <w:shd w:fill="FFFFFF"/>
+            <w:tcW w:type="dxa" w:w="2412"/>
+            <w:shd w:fill="F9FBFD"/>
             <w:tcMar>
-              <w:top w:w="40" w:type="dxa"/>
-              <w:bottom w:w="40" w:type="dxa"/>
+              <w:top w:w="45" w:type="dxa"/>
+              <w:bottom w:w="45" w:type="dxa"/>
               <w:left w:w="70" w:type="dxa"/>
               <w:right w:w="70" w:type="dxa"/>
             </w:tcMar>
@@ -2783,17 +2869,17 @@
               <w:rPr>
                 <w:sz w:val="17"/>
               </w:rPr>
-              <w:t>0.0041</w:t>
+              <w:t>0.000137 s</w:t>
             </w:r>
           </w:p>
         </w:tc>
         <w:tc>
           <w:tcPr>
-            <w:tcW w:type="dxa" w:w="2340"/>
-            <w:shd w:fill="FFFFFF"/>
+            <w:tcW w:type="dxa" w:w="2412"/>
+            <w:shd w:fill="F9FBFD"/>
             <w:tcMar>
-              <w:top w:w="40" w:type="dxa"/>
-              <w:bottom w:w="40" w:type="dxa"/>
+              <w:top w:w="45" w:type="dxa"/>
+              <w:bottom w:w="45" w:type="dxa"/>
               <w:left w:w="70" w:type="dxa"/>
               <w:right w:w="70" w:type="dxa"/>
             </w:tcMar>
@@ -2803,7 +2889,7 @@
               <w:rPr>
                 <w:sz w:val="17"/>
               </w:rPr>
-              <w:t>0.0021</w:t>
+              <w:t>12.4 KB</w:t>
             </w:r>
           </w:p>
         </w:tc>
@@ -2811,93 +2897,11 @@
       <w:tr>
         <w:tc>
           <w:tcPr>
-            <w:tcW w:type="dxa" w:w="2340"/>
-            <w:shd w:fill="F9FBFD"/>
-            <w:tcMar>
-              <w:top w:w="40" w:type="dxa"/>
-              <w:bottom w:w="40" w:type="dxa"/>
-              <w:left w:w="70" w:type="dxa"/>
-              <w:right w:w="70" w:type="dxa"/>
-            </w:tcMar>
-          </w:tcPr>
-          <w:p>
-            <w:r>
-              <w:rPr>
-                <w:sz w:val="17"/>
-              </w:rPr>
-              <w:t>2.500</w:t>
-            </w:r>
-          </w:p>
-        </w:tc>
-        <w:tc>
-          <w:tcPr>
-            <w:tcW w:type="dxa" w:w="2340"/>
-            <w:shd w:fill="F9FBFD"/>
-            <w:tcMar>
-              <w:top w:w="40" w:type="dxa"/>
-              <w:bottom w:w="40" w:type="dxa"/>
-              <w:left w:w="70" w:type="dxa"/>
-              <w:right w:w="70" w:type="dxa"/>
-            </w:tcMar>
-          </w:tcPr>
-          <w:p>
-            <w:r>
-              <w:rPr>
-                <w:sz w:val="17"/>
-              </w:rPr>
-              <w:t>0.0019</w:t>
-            </w:r>
-          </w:p>
-        </w:tc>
-        <w:tc>
-          <w:tcPr>
-            <w:tcW w:type="dxa" w:w="2340"/>
-            <w:shd w:fill="F9FBFD"/>
-            <w:tcMar>
-              <w:top w:w="40" w:type="dxa"/>
-              <w:bottom w:w="40" w:type="dxa"/>
-              <w:left w:w="70" w:type="dxa"/>
-              <w:right w:w="70" w:type="dxa"/>
-            </w:tcMar>
-          </w:tcPr>
-          <w:p>
-            <w:r>
-              <w:rPr>
-                <w:sz w:val="17"/>
-              </w:rPr>
-              <w:t>0.0112</w:t>
-            </w:r>
-          </w:p>
-        </w:tc>
-        <w:tc>
-          <w:tcPr>
-            <w:tcW w:type="dxa" w:w="2340"/>
-            <w:shd w:fill="F9FBFD"/>
-            <w:tcMar>
-              <w:top w:w="40" w:type="dxa"/>
-              <w:bottom w:w="40" w:type="dxa"/>
-              <w:left w:w="70" w:type="dxa"/>
-              <w:right w:w="70" w:type="dxa"/>
-            </w:tcMar>
-          </w:tcPr>
-          <w:p>
-            <w:r>
-              <w:rPr>
-                <w:sz w:val="17"/>
-              </w:rPr>
-              <w:t>0.0058</w:t>
-            </w:r>
-          </w:p>
-        </w:tc>
-      </w:tr>
-      <w:tr>
-        <w:tc>
-          <w:tcPr>
-            <w:tcW w:type="dxa" w:w="2340"/>
+            <w:tcW w:type="dxa" w:w="2412"/>
             <w:shd w:fill="FFFFFF"/>
             <w:tcMar>
-              <w:top w:w="40" w:type="dxa"/>
-              <w:bottom w:w="40" w:type="dxa"/>
+              <w:top w:w="45" w:type="dxa"/>
+              <w:bottom w:w="45" w:type="dxa"/>
               <w:left w:w="70" w:type="dxa"/>
               <w:right w:w="70" w:type="dxa"/>
             </w:tcMar>
@@ -2913,11 +2917,11 @@
         </w:tc>
         <w:tc>
           <w:tcPr>
-            <w:tcW w:type="dxa" w:w="2340"/>
+            <w:tcW w:type="dxa" w:w="2412"/>
             <w:shd w:fill="FFFFFF"/>
             <w:tcMar>
-              <w:top w:w="40" w:type="dxa"/>
-              <w:bottom w:w="40" w:type="dxa"/>
+              <w:top w:w="45" w:type="dxa"/>
+              <w:bottom w:w="45" w:type="dxa"/>
               <w:left w:w="70" w:type="dxa"/>
               <w:right w:w="70" w:type="dxa"/>
             </w:tcMar>
@@ -2927,17 +2931,17 @@
               <w:rPr>
                 <w:sz w:val="17"/>
               </w:rPr>
-              <w:t>0.0039</w:t>
+              <w:t>0.000225 s</w:t>
             </w:r>
           </w:p>
         </w:tc>
         <w:tc>
           <w:tcPr>
-            <w:tcW w:type="dxa" w:w="2340"/>
+            <w:tcW w:type="dxa" w:w="2412"/>
             <w:shd w:fill="FFFFFF"/>
             <w:tcMar>
-              <w:top w:w="40" w:type="dxa"/>
-              <w:bottom w:w="40" w:type="dxa"/>
+              <w:top w:w="45" w:type="dxa"/>
+              <w:bottom w:w="45" w:type="dxa"/>
               <w:left w:w="70" w:type="dxa"/>
               <w:right w:w="70" w:type="dxa"/>
             </w:tcMar>
@@ -2947,17 +2951,17 @@
               <w:rPr>
                 <w:sz w:val="17"/>
               </w:rPr>
-              <w:t>0.0245</w:t>
+              <w:t>0.000429 s</w:t>
             </w:r>
           </w:p>
         </w:tc>
         <w:tc>
           <w:tcPr>
-            <w:tcW w:type="dxa" w:w="2340"/>
+            <w:tcW w:type="dxa" w:w="2412"/>
             <w:shd w:fill="FFFFFF"/>
             <w:tcMar>
-              <w:top w:w="40" w:type="dxa"/>
-              <w:bottom w:w="40" w:type="dxa"/>
+              <w:top w:w="45" w:type="dxa"/>
+              <w:bottom w:w="45" w:type="dxa"/>
               <w:left w:w="70" w:type="dxa"/>
               <w:right w:w="70" w:type="dxa"/>
             </w:tcMar>
@@ -2967,7 +2971,7 @@
               <w:rPr>
                 <w:sz w:val="17"/>
               </w:rPr>
-              <w:t>0.0129</w:t>
+              <w:t>48.2 KB</w:t>
             </w:r>
           </w:p>
         </w:tc>
@@ -2975,11 +2979,11 @@
       <w:tr>
         <w:tc>
           <w:tcPr>
-            <w:tcW w:type="dxa" w:w="2340"/>
+            <w:tcW w:type="dxa" w:w="2412"/>
             <w:shd w:fill="F9FBFD"/>
             <w:tcMar>
-              <w:top w:w="40" w:type="dxa"/>
-              <w:bottom w:w="40" w:type="dxa"/>
+              <w:top w:w="45" w:type="dxa"/>
+              <w:bottom w:w="45" w:type="dxa"/>
               <w:left w:w="70" w:type="dxa"/>
               <w:right w:w="70" w:type="dxa"/>
             </w:tcMar>
@@ -2995,11 +2999,11 @@
         </w:tc>
         <w:tc>
           <w:tcPr>
-            <w:tcW w:type="dxa" w:w="2340"/>
+            <w:tcW w:type="dxa" w:w="2412"/>
             <w:shd w:fill="F9FBFD"/>
             <w:tcMar>
-              <w:top w:w="40" w:type="dxa"/>
-              <w:bottom w:w="40" w:type="dxa"/>
+              <w:top w:w="45" w:type="dxa"/>
+              <w:bottom w:w="45" w:type="dxa"/>
               <w:left w:w="70" w:type="dxa"/>
               <w:right w:w="70" w:type="dxa"/>
             </w:tcMar>
@@ -3009,17 +3013,17 @@
               <w:rPr>
                 <w:sz w:val="17"/>
               </w:rPr>
-              <w:t>0.0078</w:t>
+              <w:t>0.000439 s</w:t>
             </w:r>
           </w:p>
         </w:tc>
         <w:tc>
           <w:tcPr>
-            <w:tcW w:type="dxa" w:w="2340"/>
+            <w:tcW w:type="dxa" w:w="2412"/>
             <w:shd w:fill="F9FBFD"/>
             <w:tcMar>
-              <w:top w:w="40" w:type="dxa"/>
-              <w:bottom w:w="40" w:type="dxa"/>
+              <w:top w:w="45" w:type="dxa"/>
+              <w:bottom w:w="45" w:type="dxa"/>
               <w:left w:w="70" w:type="dxa"/>
               <w:right w:w="70" w:type="dxa"/>
             </w:tcMar>
@@ -3029,17 +3033,17 @@
               <w:rPr>
                 <w:sz w:val="17"/>
               </w:rPr>
-              <w:t>0.0531</w:t>
+              <w:t>0.000795 s</w:t>
             </w:r>
           </w:p>
         </w:tc>
         <w:tc>
           <w:tcPr>
-            <w:tcW w:type="dxa" w:w="2340"/>
+            <w:tcW w:type="dxa" w:w="2412"/>
             <w:shd w:fill="F9FBFD"/>
             <w:tcMar>
-              <w:top w:w="40" w:type="dxa"/>
-              <w:bottom w:w="40" w:type="dxa"/>
+              <w:top w:w="45" w:type="dxa"/>
+              <w:bottom w:w="45" w:type="dxa"/>
               <w:left w:w="70" w:type="dxa"/>
               <w:right w:w="70" w:type="dxa"/>
             </w:tcMar>
@@ -3049,7 +3053,7 @@
               <w:rPr>
                 <w:sz w:val="17"/>
               </w:rPr>
-              <w:t>0.0275</w:t>
+              <w:t>96.5 KB</w:t>
             </w:r>
           </w:p>
         </w:tc>
@@ -3057,11 +3061,11 @@
       <w:tr>
         <w:tc>
           <w:tcPr>
-            <w:tcW w:type="dxa" w:w="2340"/>
+            <w:tcW w:type="dxa" w:w="2412"/>
             <w:shd w:fill="FFFFFF"/>
             <w:tcMar>
-              <w:top w:w="40" w:type="dxa"/>
-              <w:bottom w:w="40" w:type="dxa"/>
+              <w:top w:w="45" w:type="dxa"/>
+              <w:bottom w:w="45" w:type="dxa"/>
               <w:left w:w="70" w:type="dxa"/>
               <w:right w:w="70" w:type="dxa"/>
             </w:tcMar>
@@ -3077,11 +3081,11 @@
         </w:tc>
         <w:tc>
           <w:tcPr>
-            <w:tcW w:type="dxa" w:w="2340"/>
+            <w:tcW w:type="dxa" w:w="2412"/>
             <w:shd w:fill="FFFFFF"/>
             <w:tcMar>
-              <w:top w:w="40" w:type="dxa"/>
-              <w:bottom w:w="40" w:type="dxa"/>
+              <w:top w:w="45" w:type="dxa"/>
+              <w:bottom w:w="45" w:type="dxa"/>
               <w:left w:w="70" w:type="dxa"/>
               <w:right w:w="70" w:type="dxa"/>
             </w:tcMar>
@@ -3091,17 +3095,17 @@
               <w:rPr>
                 <w:sz w:val="17"/>
               </w:rPr>
-              <w:t>0.0152</w:t>
+              <w:t>0.000912 s</w:t>
             </w:r>
           </w:p>
         </w:tc>
         <w:tc>
           <w:tcPr>
-            <w:tcW w:type="dxa" w:w="2340"/>
+            <w:tcW w:type="dxa" w:w="2412"/>
             <w:shd w:fill="FFFFFF"/>
             <w:tcMar>
-              <w:top w:w="40" w:type="dxa"/>
-              <w:bottom w:w="40" w:type="dxa"/>
+              <w:top w:w="45" w:type="dxa"/>
+              <w:bottom w:w="45" w:type="dxa"/>
               <w:left w:w="70" w:type="dxa"/>
               <w:right w:w="70" w:type="dxa"/>
             </w:tcMar>
@@ -3111,17 +3115,17 @@
               <w:rPr>
                 <w:sz w:val="17"/>
               </w:rPr>
-              <w:t>0.1140</w:t>
+              <w:t>0.001620 s</w:t>
             </w:r>
           </w:p>
         </w:tc>
         <w:tc>
           <w:tcPr>
-            <w:tcW w:type="dxa" w:w="2340"/>
+            <w:tcW w:type="dxa" w:w="2412"/>
             <w:shd w:fill="FFFFFF"/>
             <w:tcMar>
-              <w:top w:w="40" w:type="dxa"/>
-              <w:bottom w:w="40" w:type="dxa"/>
+              <w:top w:w="45" w:type="dxa"/>
+              <w:bottom w:w="45" w:type="dxa"/>
               <w:left w:w="70" w:type="dxa"/>
               <w:right w:w="70" w:type="dxa"/>
             </w:tcMar>
@@ -3131,15 +3135,152 @@
               <w:rPr>
                 <w:sz w:val="17"/>
               </w:rPr>
-              <w:t>0.0592</w:t>
+              <w:t>192.8 KB</w:t>
+            </w:r>
+          </w:p>
+        </w:tc>
+      </w:tr>
+      <w:tr>
+        <w:tc>
+          <w:tcPr>
+            <w:tcW w:type="dxa" w:w="2412"/>
+            <w:shd w:fill="F9FBFD"/>
+            <w:tcMar>
+              <w:top w:w="45" w:type="dxa"/>
+              <w:bottom w:w="45" w:type="dxa"/>
+              <w:left w:w="70" w:type="dxa"/>
+              <w:right w:w="70" w:type="dxa"/>
+            </w:tcMar>
+          </w:tcPr>
+          <w:p>
+            <w:r>
+              <w:rPr>
+                <w:sz w:val="17"/>
+              </w:rPr>
+              <w:t>50.000</w:t>
+            </w:r>
+          </w:p>
+        </w:tc>
+        <w:tc>
+          <w:tcPr>
+            <w:tcW w:type="dxa" w:w="2412"/>
+            <w:shd w:fill="F9FBFD"/>
+            <w:tcMar>
+              <w:top w:w="45" w:type="dxa"/>
+              <w:bottom w:w="45" w:type="dxa"/>
+              <w:left w:w="70" w:type="dxa"/>
+              <w:right w:w="70" w:type="dxa"/>
+            </w:tcMar>
+          </w:tcPr>
+          <w:p>
+            <w:r>
+              <w:rPr>
+                <w:sz w:val="17"/>
+              </w:rPr>
+              <w:t>0.002480 s</w:t>
+            </w:r>
+          </w:p>
+        </w:tc>
+        <w:tc>
+          <w:tcPr>
+            <w:tcW w:type="dxa" w:w="2412"/>
+            <w:shd w:fill="F9FBFD"/>
+            <w:tcMar>
+              <w:top w:w="45" w:type="dxa"/>
+              <w:bottom w:w="45" w:type="dxa"/>
+              <w:left w:w="70" w:type="dxa"/>
+              <w:right w:w="70" w:type="dxa"/>
+            </w:tcMar>
+          </w:tcPr>
+          <w:p>
+            <w:r>
+              <w:rPr>
+                <w:sz w:val="17"/>
+              </w:rPr>
+              <w:t>0.003950 s</w:t>
+            </w:r>
+          </w:p>
+        </w:tc>
+        <w:tc>
+          <w:tcPr>
+            <w:tcW w:type="dxa" w:w="2412"/>
+            <w:shd w:fill="F9FBFD"/>
+            <w:tcMar>
+              <w:top w:w="45" w:type="dxa"/>
+              <w:bottom w:w="45" w:type="dxa"/>
+              <w:left w:w="70" w:type="dxa"/>
+              <w:right w:w="70" w:type="dxa"/>
+            </w:tcMar>
+          </w:tcPr>
+          <w:p>
+            <w:r>
+              <w:rPr>
+                <w:sz w:val="17"/>
+              </w:rPr>
+              <w:t>481.0 KB</w:t>
             </w:r>
           </w:p>
         </w:tc>
       </w:tr>
     </w:tbl>
     <w:p>
+      <w:pPr>
+        <w:keepNext/>
+        <w:spacing w:before="100" w:after="40"/>
+        <w:jc w:val="center"/>
+      </w:pPr>
       <w:r>
-        <w:t>El ajuste de curvas confirma empíricamente la teoría asintótica: Quickselect escala de forma estrictamente lineal O(N), mientras que Merge Sort refleja la pendiente O(N log N). A N = 20.000, Quickselect es 7,5 veces más rápido que Merge Sort y 3,9 veces más rápido que el ordenamiento de biblioteca, optimizando sensiblemente las consultas repetitivas de medianas.</w:t>
+        <w:drawing>
+          <wp:inline xmlns:a="http://schemas.openxmlformats.org/drawingml/2006/main" xmlns:pic="http://schemas.openxmlformats.org/drawingml/2006/picture">
+            <wp:extent cx="4754880" cy="2849298"/>
+            <wp:docPr id="4" name="Picture 4"/>
+            <wp:cNvGraphicFramePr>
+              <a:graphicFrameLocks noChangeAspect="1"/>
+            </wp:cNvGraphicFramePr>
+            <a:graphic>
+              <a:graphicData uri="http://schemas.openxmlformats.org/drawingml/2006/picture">
+                <pic:pic>
+                  <pic:nvPicPr>
+                    <pic:cNvPr id="0" name="f3_01_complejidad_temporal.png"/>
+                    <pic:cNvPicPr/>
+                  </pic:nvPicPr>
+                  <pic:blipFill>
+                    <a:blip r:embed="rId13"/>
+                    <a:stretch>
+                      <a:fillRect/>
+                    </a:stretch>
+                  </pic:blipFill>
+                  <pic:spPr>
+                    <a:xfrm>
+                      <a:off x="0" y="0"/>
+                      <a:ext cx="4754880" cy="2849298"/>
+                    </a:xfrm>
+                    <a:prstGeom prst="rect"/>
+                  </pic:spPr>
+                </pic:pic>
+              </a:graphicData>
+            </a:graphic>
+          </wp:inline>
+        </w:drawing>
+      </w:r>
+    </w:p>
+    <w:p>
+      <w:pPr>
+        <w:spacing w:after="100"/>
+        <w:jc w:val="center"/>
+      </w:pPr>
+      <w:r>
+        <w:rPr>
+          <w:i/>
+          <w:color w:val="555555"/>
+          <w:sz w:val="17"/>
+        </w:rPr>
+        <w:t>Figura 4: Complejidad temporal empírica sobre el dataset real: Cuantil Ingenuo vs Quickselect.</w:t>
+      </w:r>
+    </w:p>
+    <w:p>
+      <w:r>
+        <w:t>Un hallazgo de ingeniería notable evidenciado en el notebook F3 es que para listas en memoria en Python puro, el algoritmo de ordenamiento nativo de Python (Timsort implementado en C a nivel de intérprete) resulta numéricamente muy rápido en tamaños moderados frente al overhead del bucle de recursión en Python de Quickselect. Sin embargo, Quickselect garantiza su cota asintótica O(N) y requiere una fracción de nodos visitados.</w:t>
       </w:r>
     </w:p>
     <w:p>
@@ -3158,7 +3299,62 @@
     </w:p>
     <w:p>
       <w:r>
-        <w:t>El consumo de memoria dinámica fue monitorizado mediante el módulo tracemalloc de la biblioteca estándar de Python, evaluando la memoria pico (peak memory allocation) durante la recursión. Para N = 20.000 elementos, Merge Sort demandó un pico de 1.84 MB de memoria debido a la instanciación de listas intermedias, mientras que Quickselect operó con menos de 0.42 MB.</w:t>
+        <w:t>El consumo de memoria dinámica fue monitorizado mediante tracemalloc, evaluando la memoria pico durante la recursión. En la Figura 5 se evidencia la evolución del consumo espacial de los algoritmos sobre el dataset real.</w:t>
+      </w:r>
+    </w:p>
+    <w:p>
+      <w:pPr>
+        <w:keepNext/>
+        <w:spacing w:before="100" w:after="40"/>
+        <w:jc w:val="center"/>
+      </w:pPr>
+      <w:r>
+        <w:drawing>
+          <wp:inline xmlns:a="http://schemas.openxmlformats.org/drawingml/2006/main" xmlns:pic="http://schemas.openxmlformats.org/drawingml/2006/picture">
+            <wp:extent cx="4754880" cy="2909888"/>
+            <wp:docPr id="5" name="Picture 5"/>
+            <wp:cNvGraphicFramePr>
+              <a:graphicFrameLocks noChangeAspect="1"/>
+            </wp:cNvGraphicFramePr>
+            <a:graphic>
+              <a:graphicData uri="http://schemas.openxmlformats.org/drawingml/2006/picture">
+                <pic:pic>
+                  <pic:nvPicPr>
+                    <pic:cNvPr id="0" name="f3_02_consumo_memoria.png"/>
+                    <pic:cNvPicPr/>
+                  </pic:nvPicPr>
+                  <pic:blipFill>
+                    <a:blip r:embed="rId14"/>
+                    <a:stretch>
+                      <a:fillRect/>
+                    </a:stretch>
+                  </pic:blipFill>
+                  <pic:spPr>
+                    <a:xfrm>
+                      <a:off x="0" y="0"/>
+                      <a:ext cx="4754880" cy="2909888"/>
+                    </a:xfrm>
+                    <a:prstGeom prst="rect"/>
+                  </pic:spPr>
+                </pic:pic>
+              </a:graphicData>
+            </a:graphic>
+          </wp:inline>
+        </w:drawing>
+      </w:r>
+    </w:p>
+    <w:p>
+      <w:pPr>
+        <w:spacing w:after="100"/>
+        <w:jc w:val="center"/>
+      </w:pPr>
+      <w:r>
+        <w:rPr>
+          <w:i/>
+          <w:color w:val="555555"/>
+          <w:sz w:val="17"/>
+        </w:rPr>
+        <w:t>Figura 5: Consumo de memoria pico sobre el dataset real: Cuantil Ingenuo vs Quickselect.</w:t>
       </w:r>
     </w:p>
     <w:p>
@@ -3186,17 +3382,69 @@
     </w:p>
     <w:p>
       <w:r>
-        <w:t>Uno de los requerimientos clave señalados por el docente consistió en contrastar numéricamente el desempeño de implementaciones vectorizadas frente a bucles for imperativos sobre las 105.060 filas reales del dataset en dos tareas críticas de preprocesamiento:</w:t>
+        <w:t>Uno de los requerimientos centrales consistió en contrastar numéricamente el desempeño de implementaciones vectorizadas frente a bucles for imperativos sobre las 105.060 filas reales del dataset en dos tareas críticas de preprocesamiento:</w:t>
       </w:r>
     </w:p>
     <w:p>
       <w:r>
-        <w:t>1. Agrupación de categorías raras (agrupar_raras): Consiste en evaluar 968 nombres de carreras con frecuencias inferiores a 100 registros para reclasificarlas como 'OTRA'. La versión con bucle iterativo fila por fila tardó 4.82 segundos en CPU. La implementación vectorizada mediante Series.isin(frecuentes) ejecutó la misma tarea en 0.038 segundos, logrando una aceleración de 126×.</w:t>
+        <w:t>1. Agrupación de categorías raras (agrupar_raras): Consiste en evaluar 1.096 categorías totales de carreras para reclasificar 968 raras como 'OTRA'. La versión vectorizada mediante Series.isin(frecuentes) superó al bucle iterativo logrando una aceleración de 5,9×.</w:t>
+        <w:br/>
+        <w:t>2. Codificación One-Hot (one_hot): Expansión de variables categóricas en matrices binarias indicadoras. La versión vectorizada mediante pd.get_dummies() superó al bucle celda por celda alcanzando una aceleración de 4,6× sobre el total de filas.</w:t>
       </w:r>
     </w:p>
     <w:p>
+      <w:pPr>
+        <w:keepNext/>
+        <w:spacing w:before="100" w:after="40"/>
+        <w:jc w:val="center"/>
+      </w:pPr>
       <w:r>
-        <w:t>2. Codificación One-Hot (one_hot): Expansión de 5 variables categóricas en 36 columnas binarias indicadoras. Un bucle iterativo que construye las columnas mediante asignación celda a celda tardó 14.15 segundos y generó alta fragmentación de memoria en DataFrame. La versión vectorizada utilizando pd.get_dummies() ejecutó en 0.112 segundos (aceleración de 126×), reduciendo drásticamente la latencia del pipeline.</w:t>
+        <w:drawing>
+          <wp:inline xmlns:a="http://schemas.openxmlformats.org/drawingml/2006/main" xmlns:pic="http://schemas.openxmlformats.org/drawingml/2006/picture">
+            <wp:extent cx="4937760" cy="1674855"/>
+            <wp:docPr id="6" name="Picture 6"/>
+            <wp:cNvGraphicFramePr>
+              <a:graphicFrameLocks noChangeAspect="1"/>
+            </wp:cNvGraphicFramePr>
+            <a:graphic>
+              <a:graphicData uri="http://schemas.openxmlformats.org/drawingml/2006/picture">
+                <pic:pic>
+                  <pic:nvPicPr>
+                    <pic:cNvPr id="0" name="f3_03_bucle_vs_vectorizado.png"/>
+                    <pic:cNvPicPr/>
+                  </pic:nvPicPr>
+                  <pic:blipFill>
+                    <a:blip r:embed="rId15"/>
+                    <a:stretch>
+                      <a:fillRect/>
+                    </a:stretch>
+                  </pic:blipFill>
+                  <pic:spPr>
+                    <a:xfrm>
+                      <a:off x="0" y="0"/>
+                      <a:ext cx="4937760" cy="1674855"/>
+                    </a:xfrm>
+                    <a:prstGeom prst="rect"/>
+                  </pic:spPr>
+                </pic:pic>
+              </a:graphicData>
+            </a:graphic>
+          </wp:inline>
+        </w:drawing>
+      </w:r>
+    </w:p>
+    <w:p>
+      <w:pPr>
+        <w:spacing w:after="100"/>
+        <w:jc w:val="center"/>
+      </w:pPr>
+      <w:r>
+        <w:rPr>
+          <w:i/>
+          <w:color w:val="555555"/>
+          <w:sz w:val="17"/>
+        </w:rPr>
+        <w:t>Figura 6: Comparación de tiempos de ejecución: Bucle iterativo vs Vectorización sobre el dataset real.</w:t>
       </w:r>
     </w:p>
     <w:p>
@@ -3208,7 +3456,7 @@
         <w:rPr>
           <w:b/>
           <w:color w:val="003366"/>
-          <w:sz w:val="26"/>
+          <w:sz w:val="24"/>
         </w:rPr>
         <w:t>VI. Validación técnica, verificación de resultados y pruebas unitarias</w:t>
       </w:r>
@@ -3234,16 +3482,10 @@
     </w:p>
     <w:p>
       <w:r>
-        <w:t>• Caso Normal: Verificación del ordenamiento correcto de listas aleatorias, cálculo exacto de medianas en distribuciones continuas y exploración jerárquica sobre DataFrames sintéticos con factores correlacionados.</w:t>
-      </w:r>
-    </w:p>
-    <w:p>
-      <w:r>
-        <w:t>• Caso Límite (Edge Cases): Listas de un solo elemento (len = 1), arreglos con elementos idénticos (varianza cero), listas con valores extremos y árboles donde ningún subgrupo satisface el soporte mínimo.</w:t>
-      </w:r>
-    </w:p>
-    <w:p>
-      <w:r>
+        <w:t>• Caso Normal: Verificación del ordenamiento correcto de listas aleatorias, cálculo exacto de cuantiles y exploración jerárquica sobre DataFrames sintéticos.</w:t>
+        <w:br/>
+        <w:t>• Caso Límite (Edge Cases): Listas de un solo elemento (len = 1), arreglos con elementos idénticos (varianza cero) y árboles sin subgrupos válidos.</w:t>
+        <w:br/>
         <w:t>• Caso de Excepción: Validación de que las funciones emitan excepciones explícitas y controladas (TypeError al pasar tipos inválidos, ValueError al ingresar listas vacías o umbrales fuera de rango, y KeyError ante columnas ausentes).</w:t>
       </w:r>
     </w:p>
@@ -3263,7 +3505,7 @@
     </w:p>
     <w:p>
       <w:r>
-        <w:t>En la Fase 2 se identificaron 13.396 registros (12,75% del universo) cuyo año de ingreso a la carrera de origen registraba el código 1900 (faltante no aleatorio, asociado a convalidaciones o cambios curriculares), los cuales fueron imputados con la mediana condicional por año de ingreso a la carrera actual, creando la bandera anio_ing_carr_ori_imputada. En cumplimiento del compromiso adquirido en la entrega previa, se ejecutó el análisis de sensibilidad recalculando la duración mediana con y sin estos 13.396 casos:</w:t>
+        <w:t>En la Fase 2 se identificaron 13.396 registros (12,75% del universo) cuyo año de ingreso a la carrera de origen registraba el código 1900 (faltante no aleatorio, asociado a convalidaciones o cambios curriculares), los cuales fueron imputados con la mediana condicional por año de ingreso a la carrera actual, creando la bandera anio_ing_carr_ori_imputada. Se ejecutó el análisis de sensibilidad comparando la duración mediana con y sin estos 13.396 casos:</w:t>
       </w:r>
     </w:p>
     <w:tbl>
@@ -3273,16 +3515,16 @@
         <w:tblLook w:firstColumn="1" w:firstRow="1" w:lastColumn="0" w:lastRow="0" w:noHBand="0" w:noVBand="1" w:val="04A0"/>
       </w:tblPr>
       <w:tblGrid>
-        <w:gridCol w:w="1872"/>
-        <w:gridCol w:w="1872"/>
-        <w:gridCol w:w="1872"/>
-        <w:gridCol w:w="1872"/>
-        <w:gridCol w:w="1872"/>
+        <w:gridCol w:w="1930"/>
+        <w:gridCol w:w="1930"/>
+        <w:gridCol w:w="1930"/>
+        <w:gridCol w:w="1930"/>
+        <w:gridCol w:w="1930"/>
       </w:tblGrid>
       <w:tr>
         <w:tc>
           <w:tcPr>
-            <w:tcW w:type="dxa" w:w="1872"/>
+            <w:tcW w:type="dxa" w:w="1930"/>
             <w:shd w:fill="003366"/>
             <w:tcMar>
               <w:top w:w="50" w:type="dxa"/>
@@ -3304,7 +3546,7 @@
         </w:tc>
         <w:tc>
           <w:tcPr>
-            <w:tcW w:type="dxa" w:w="1872"/>
+            <w:tcW w:type="dxa" w:w="1930"/>
             <w:shd w:fill="003366"/>
             <w:tcMar>
               <w:top w:w="50" w:type="dxa"/>
@@ -3326,7 +3568,7 @@
         </w:tc>
         <w:tc>
           <w:tcPr>
-            <w:tcW w:type="dxa" w:w="1872"/>
+            <w:tcW w:type="dxa" w:w="1930"/>
             <w:shd w:fill="003366"/>
             <w:tcMar>
               <w:top w:w="50" w:type="dxa"/>
@@ -3348,7 +3590,7 @@
         </w:tc>
         <w:tc>
           <w:tcPr>
-            <w:tcW w:type="dxa" w:w="1872"/>
+            <w:tcW w:type="dxa" w:w="1930"/>
             <w:shd w:fill="003366"/>
             <w:tcMar>
               <w:top w:w="50" w:type="dxa"/>
@@ -3370,7 +3612,7 @@
         </w:tc>
         <w:tc>
           <w:tcPr>
-            <w:tcW w:type="dxa" w:w="1872"/>
+            <w:tcW w:type="dxa" w:w="1930"/>
             <w:shd w:fill="003366"/>
             <w:tcMar>
               <w:top w:w="50" w:type="dxa"/>
@@ -3394,11 +3636,11 @@
       <w:tr>
         <w:tc>
           <w:tcPr>
-            <w:tcW w:type="dxa" w:w="1872"/>
+            <w:tcW w:type="dxa" w:w="1930"/>
             <w:shd w:fill="F9FBFD"/>
             <w:tcMar>
-              <w:top w:w="40" w:type="dxa"/>
-              <w:bottom w:w="40" w:type="dxa"/>
+              <w:top w:w="45" w:type="dxa"/>
+              <w:bottom w:w="45" w:type="dxa"/>
               <w:left w:w="70" w:type="dxa"/>
               <w:right w:w="70" w:type="dxa"/>
             </w:tcMar>
@@ -3414,11 +3656,11 @@
         </w:tc>
         <w:tc>
           <w:tcPr>
-            <w:tcW w:type="dxa" w:w="1872"/>
+            <w:tcW w:type="dxa" w:w="1930"/>
             <w:shd w:fill="F9FBFD"/>
             <w:tcMar>
-              <w:top w:w="40" w:type="dxa"/>
-              <w:bottom w:w="40" w:type="dxa"/>
+              <w:top w:w="45" w:type="dxa"/>
+              <w:bottom w:w="45" w:type="dxa"/>
               <w:left w:w="70" w:type="dxa"/>
               <w:right w:w="70" w:type="dxa"/>
             </w:tcMar>
@@ -3434,11 +3676,11 @@
         </w:tc>
         <w:tc>
           <w:tcPr>
-            <w:tcW w:type="dxa" w:w="1872"/>
+            <w:tcW w:type="dxa" w:w="1930"/>
             <w:shd w:fill="F9FBFD"/>
             <w:tcMar>
-              <w:top w:w="40" w:type="dxa"/>
-              <w:bottom w:w="40" w:type="dxa"/>
+              <w:top w:w="45" w:type="dxa"/>
+              <w:bottom w:w="45" w:type="dxa"/>
               <w:left w:w="70" w:type="dxa"/>
               <w:right w:w="70" w:type="dxa"/>
             </w:tcMar>
@@ -3454,11 +3696,11 @@
         </w:tc>
         <w:tc>
           <w:tcPr>
-            <w:tcW w:type="dxa" w:w="1872"/>
+            <w:tcW w:type="dxa" w:w="1930"/>
             <w:shd w:fill="F9FBFD"/>
             <w:tcMar>
-              <w:top w:w="40" w:type="dxa"/>
-              <w:bottom w:w="40" w:type="dxa"/>
+              <w:top w:w="45" w:type="dxa"/>
+              <w:bottom w:w="45" w:type="dxa"/>
               <w:left w:w="70" w:type="dxa"/>
               <w:right w:w="70" w:type="dxa"/>
             </w:tcMar>
@@ -3474,11 +3716,11 @@
         </w:tc>
         <w:tc>
           <w:tcPr>
-            <w:tcW w:type="dxa" w:w="1872"/>
+            <w:tcW w:type="dxa" w:w="1930"/>
             <w:shd w:fill="F9FBFD"/>
             <w:tcMar>
-              <w:top w:w="40" w:type="dxa"/>
-              <w:bottom w:w="40" w:type="dxa"/>
+              <w:top w:w="45" w:type="dxa"/>
+              <w:bottom w:w="45" w:type="dxa"/>
               <w:left w:w="70" w:type="dxa"/>
               <w:right w:w="70" w:type="dxa"/>
             </w:tcMar>
@@ -3496,11 +3738,11 @@
       <w:tr>
         <w:tc>
           <w:tcPr>
-            <w:tcW w:type="dxa" w:w="1872"/>
+            <w:tcW w:type="dxa" w:w="1930"/>
             <w:shd w:fill="FFFFFF"/>
             <w:tcMar>
-              <w:top w:w="40" w:type="dxa"/>
-              <w:bottom w:w="40" w:type="dxa"/>
+              <w:top w:w="45" w:type="dxa"/>
+              <w:bottom w:w="45" w:type="dxa"/>
               <w:left w:w="70" w:type="dxa"/>
               <w:right w:w="70" w:type="dxa"/>
             </w:tcMar>
@@ -3516,11 +3758,11 @@
         </w:tc>
         <w:tc>
           <w:tcPr>
-            <w:tcW w:type="dxa" w:w="1872"/>
+            <w:tcW w:type="dxa" w:w="1930"/>
             <w:shd w:fill="FFFFFF"/>
             <w:tcMar>
-              <w:top w:w="40" w:type="dxa"/>
-              <w:bottom w:w="40" w:type="dxa"/>
+              <w:top w:w="45" w:type="dxa"/>
+              <w:bottom w:w="45" w:type="dxa"/>
               <w:left w:w="70" w:type="dxa"/>
               <w:right w:w="70" w:type="dxa"/>
             </w:tcMar>
@@ -3536,11 +3778,11 @@
         </w:tc>
         <w:tc>
           <w:tcPr>
-            <w:tcW w:type="dxa" w:w="1872"/>
+            <w:tcW w:type="dxa" w:w="1930"/>
             <w:shd w:fill="FFFFFF"/>
             <w:tcMar>
-              <w:top w:w="40" w:type="dxa"/>
-              <w:bottom w:w="40" w:type="dxa"/>
+              <w:top w:w="45" w:type="dxa"/>
+              <w:bottom w:w="45" w:type="dxa"/>
               <w:left w:w="70" w:type="dxa"/>
               <w:right w:w="70" w:type="dxa"/>
             </w:tcMar>
@@ -3556,11 +3798,11 @@
         </w:tc>
         <w:tc>
           <w:tcPr>
-            <w:tcW w:type="dxa" w:w="1872"/>
+            <w:tcW w:type="dxa" w:w="1930"/>
             <w:shd w:fill="FFFFFF"/>
             <w:tcMar>
-              <w:top w:w="40" w:type="dxa"/>
-              <w:bottom w:w="40" w:type="dxa"/>
+              <w:top w:w="45" w:type="dxa"/>
+              <w:bottom w:w="45" w:type="dxa"/>
               <w:left w:w="70" w:type="dxa"/>
               <w:right w:w="70" w:type="dxa"/>
             </w:tcMar>
@@ -3576,11 +3818,11 @@
         </w:tc>
         <w:tc>
           <w:tcPr>
-            <w:tcW w:type="dxa" w:w="1872"/>
+            <w:tcW w:type="dxa" w:w="1930"/>
             <w:shd w:fill="FFFFFF"/>
             <w:tcMar>
-              <w:top w:w="40" w:type="dxa"/>
-              <w:bottom w:w="40" w:type="dxa"/>
+              <w:top w:w="45" w:type="dxa"/>
+              <w:bottom w:w="45" w:type="dxa"/>
               <w:left w:w="70" w:type="dxa"/>
               <w:right w:w="70" w:type="dxa"/>
             </w:tcMar>
@@ -3597,6 +3839,61 @@
       </w:tr>
     </w:tbl>
     <w:p>
+      <w:pPr>
+        <w:keepNext/>
+        <w:spacing w:before="100" w:after="40"/>
+        <w:jc w:val="center"/>
+      </w:pPr>
+      <w:r>
+        <w:drawing>
+          <wp:inline xmlns:a="http://schemas.openxmlformats.org/drawingml/2006/main" xmlns:pic="http://schemas.openxmlformats.org/drawingml/2006/picture">
+            <wp:extent cx="4937760" cy="2212020"/>
+            <wp:docPr id="7" name="Picture 7"/>
+            <wp:cNvGraphicFramePr>
+              <a:graphicFrameLocks noChangeAspect="1"/>
+            </wp:cNvGraphicFramePr>
+            <a:graphic>
+              <a:graphicData uri="http://schemas.openxmlformats.org/drawingml/2006/picture">
+                <pic:pic>
+                  <pic:nvPicPr>
+                    <pic:cNvPr id="0" name="f3_04_sensibilidad.png"/>
+                    <pic:cNvPicPr/>
+                  </pic:nvPicPr>
+                  <pic:blipFill>
+                    <a:blip r:embed="rId16"/>
+                    <a:stretch>
+                      <a:fillRect/>
+                    </a:stretch>
+                  </pic:blipFill>
+                  <pic:spPr>
+                    <a:xfrm>
+                      <a:off x="0" y="0"/>
+                      <a:ext cx="4937760" cy="2212020"/>
+                    </a:xfrm>
+                    <a:prstGeom prst="rect"/>
+                  </pic:spPr>
+                </pic:pic>
+              </a:graphicData>
+            </a:graphic>
+          </wp:inline>
+        </w:drawing>
+      </w:r>
+    </w:p>
+    <w:p>
+      <w:pPr>
+        <w:spacing w:after="100"/>
+        <w:jc w:val="center"/>
+      </w:pPr>
+      <w:r>
+        <w:rPr>
+          <w:i/>
+          <w:color w:val="555555"/>
+          <w:sz w:val="17"/>
+        </w:rPr>
+        <w:t>Figura 7: Análisis de sensibilidad en duración mediana y dispersión: Muestra total vs Muestra pura.</w:t>
+      </w:r>
+    </w:p>
+    <w:p>
       <w:r>
         <w:t>Los resultados demuestran la robustez del tratamiento aplicado: tanto la mediana (10 semestres) como el rango intercuartílico (2 semestres) se mantienen estrictamente invariantes entre ambos subconjuntos. La desviación estándar apenas varía un 2,82%, confirmando que la imputación no introduce sesgo ni artefactos numéricos en las conclusiones del proyecto.</w:t>
       </w:r>
@@ -3610,7 +3907,7 @@
         <w:rPr>
           <w:b/>
           <w:color w:val="003366"/>
-          <w:sz w:val="26"/>
+          <w:sz w:val="24"/>
         </w:rPr>
         <w:t>VII. Trabajo colaborativo, trazabilidad y control de versiones</w:t>
       </w:r>
@@ -3623,15 +3920,9 @@
     <w:p>
       <w:r>
         <w:t>1. Desacoplamiento Estricto por Archivos: Cada archivo del proyecto posee un único autor y responsable exclusivo (César en src/algoritmos.py y tests/test_algoritmos.py; Jorge en src/complejidad.py y figuras; Fernanda en src/pipeline.py y notebook F3; Sebastián en docs/f3_s02_grupo6.docx, docs/f3_s02_grupo6.pdf, docs/verificacion.md y scripts/evidencias.py). Esta arquitectura evitó el 100% de conflictos de mezcla en archivos binarios y JSON.</w:t>
-      </w:r>
-    </w:p>
-    <w:p>
-      <w:r>
+        <w:br/>
         <w:t>2. Trabajo en Ramas y Pull Requests (PR): Todo cambio entra a main exclusivamente a través de PRs con revisión cruzada formal (César revisa a Sebastián, Jorge revisa a César, Fernanda revisa a Jorge, Sebastián revisa a Fernanda). Cada PR incluye descripciones técnicas detalladas y comentarios constructivos de revisión.</w:t>
-      </w:r>
-    </w:p>
-    <w:p>
-      <w:r>
+        <w:br/>
         <w:t>3. Trazabilidad Automatizada y Cifra Única de Commits: Para resolver la inconsistencia observada en la entrega anterior (donde se citaban distintos números de commits), el equipo utilizó el script scripts/evidencias.py, que extrae la cifra oficial y unificada mediante la instrucción git rev-list --count main, garantizando consistencia absoluta entre el repositorio y el documento formal.</w:t>
       </w:r>
     </w:p>
@@ -3644,7 +3935,7 @@
         <w:rPr>
           <w:b/>
           <w:color w:val="003366"/>
-          <w:sz w:val="26"/>
+          <w:sz w:val="24"/>
         </w:rPr>
         <w:t>VIII. Conclusiones y proyección hacia la Fase 4</w:t>
       </w:r>
@@ -3656,22 +3947,13 @@
     </w:p>
     <w:p>
       <w:r>
-        <w:t>1. Ventaja analítica de Divide and Conquer: La implementación de Quickselect demostró ser el método óptimo para la extracción de medianas condicionales, reduciendo la complejidad temporal de O(n log n) a O(n) y manteniendo un consumo espacial despreciable frente a los ordenamientos ciegos.</w:t>
-      </w:r>
-    </w:p>
-    <w:p>
-      <w:r>
-        <w:t>2. Eficacia de la exploración con poda: La formalización de podas por soporte mínimo y cota superior demostró ser una solución matemática elegante frente al problema de la explosión combinatoria, permitiendo identificar subgrupos críticos de sobreduración con una fracción mínima de los recursos computacionales.</w:t>
-      </w:r>
-    </w:p>
-    <w:p>
-      <w:r>
-        <w:t>3. Solidez de la arquitectura orientada a objetos: La migración del pipeline funcional a clases abstractas Transformador y orquestadores Pipeline proporciona una barrera hermética contra el data leakage y habilita una integración limpia y reproducible para la siguiente fase.</w:t>
-      </w:r>
-    </w:p>
-    <w:p>
-      <w:r>
-        <w:t>Proyección hacia la Fase 4 (Comunicación y Modelado): El equipo cuenta con un repositorio limpio, funciones probadas al 100% y un conjunto de datos escalado y caracterizado. En la Fase 4, estos componentes se integrarán en modelos estadísticos multivariados y visualizaciones interactivas de alto impacto para responder con rigor y claridad a la pregunta analizable sobre los factores asociados a la duración de la titulación en Chile.</w:t>
+        <w:t>1. Ventaja analítica de Divide and Conquer: La implementación de Quickselect demostró ser el método óptimo para la extracción de cuantiles condicionales, reduciendo la complejidad temporal de O(N log N) a O(N) lineal con consumo de memoria auxiliar despreciable.</w:t>
+        <w:br/>
+        <w:t>2. Eficacia de la exploración con poda: Las podas por soporte mínimo y cota superior evitaron el 36,7% de los nodos visitados en el espacio combinatorio, hallando con exactitud matemática el 100% de los patrones críticos de sobreduración.</w:t>
+        <w:br/>
+        <w:t>3. Solidez de la arquitectura orientada a objetos: La migración del pipeline a clases abstractas Transformador y orquestadores Pipeline garantiza reproducibilidad sin fuga de información (data leakage) y habilita un perfilado sistemático de recursos.</w:t>
+        <w:br/>
+        <w:t>Proyección hacia la Fase 4 (Comunicación y Modelado): Con una base modular sólida y 114 pruebas superadas, el equipo integrará modelos estadísticos multivariados y tableros interactivos para responder a la pregunta central sobre los factores asociados a la duración de la titulación.</w:t>
       </w:r>
     </w:p>
     <w:p>
@@ -3683,7 +3965,7 @@
         <w:rPr>
           <w:b/>
           <w:color w:val="003366"/>
-          <w:sz w:val="26"/>
+          <w:sz w:val="24"/>
         </w:rPr>
         <w:t>IX. Bibliografía (Norma APA 7.ª)</w:t>
       </w:r>
@@ -3692,11 +3974,15 @@
       <w:r>
         <w:t>Centro de Estudios MINEDUC. (2025). Bases de datos de titulados de educación superior 2025. Ministerio de Educación de Chile. https://datosabiertos.mineduc.cl/</w:t>
         <w:br/>
+        <w:br/>
         <w:t>Cormen, T. H., Leiserson, C. E., Rivest, R. L., &amp; Stein, C. (2022). Introduction to algorithms (4.ª ed.). The MIT Press.</w:t>
+        <w:br/>
         <w:br/>
         <w:t>McKinney, W. (2022). Python for data analysis: Data wrangling with pandas, NumPy, and Jupyter (3.ª ed.). O'Reilly Media.</w:t>
         <w:br/>
+        <w:br/>
         <w:t>Python Software Foundation. (2026). The Python standard library: Execution trace, memory profiling, and recursion management (Versión 3.14). https://docs.python.org/3.14/</w:t>
+        <w:br/>
         <w:br/>
         <w:t>Universidad Andrés Bello. (2026). MCDI500 – Programación para la Ciencia de Datos: Unidad 2 · Algoritmos estructurados, recursividad y complejidad computacional. Facultad de Ingeniería, Magíster en Ciencia de Datos e Inteligencia Artificial, UNAB Online.</w:t>
       </w:r>
@@ -3715,7 +4001,7 @@
         <w:rPr>
           <w:b/>
           <w:color w:val="003366"/>
-          <w:sz w:val="26"/>
+          <w:sz w:val="24"/>
         </w:rPr>
         <w:t>Anexos técnicos</w:t>
       </w:r>
@@ -3741,19 +4027,19 @@
     </w:p>
     <w:p>
       <w:pPr>
-        <w:spacing w:line="240" w:lineRule="auto"/>
-        <w:ind w:left="288"/>
+        <w:spacing w:line="240" w:lineRule="auto" w:after="80"/>
+        <w:ind w:left="216"/>
       </w:pPr>
       <w:r>
         <w:rPr>
           <w:rFonts w:ascii="Consolas" w:hAnsi="Consolas"/>
           <w:color w:val="333333"/>
-          <w:sz w:val="17"/>
+          <w:sz w:val="16"/>
         </w:rPr>
         <w:t># Verificación y trazabilidad · Fase 3</w:t>
         <w:br/>
         <w:br/>
-        <w:t>Generado automáticamente por `scripts/evidencias.py` el 24-09-2026 08:34.</w:t>
+        <w:t>Generado automáticamente por `scripts/evidencias.py` el 27-09-2026 12:01.</w:t>
         <w:br/>
         <w:t>Todas las cifras de este documento salen del repositorio en el momento de generarlo; ninguna se transcribe de memoria.</w:t>
         <w:br/>
@@ -3769,41 +4055,64 @@
         <w:br/>
         <w:t>| `tests/test_pipeline.py` | Fase 2 · funciones del pipeline | `python tests/test_pipeline.py` | **OK** · 11/11 pruebas superadas |</w:t>
         <w:br/>
-        <w:t>| `tests/test_pipeline_clases.py` | Fase 3 · jerarquía de clases | `python tests/test_pipeline_clases.py` | **NO EXISTE** · — |</w:t>
+        <w:t>| `tests/test_pipeline_clases.py` | Fase 3 · jerarquía de clases | `python tests/test_pipeline_clases.py` | **OK** · 42/42 pruebas superadas |</w:t>
         <w:br/>
-        <w:t>| `tests/test_algoritmos.py` | Fase 3 · algoritmos recursivos | `python tests/test_algoritmos.py` | **NO EXISTE** · — |</w:t>
+        <w:t>| `tests/test_algoritmos.py` | Fase 3 · algoritmos recursivos | `python tests/test_algoritmos.py` | **OK** · 49/49 pruebas superadas |</w:t>
         <w:br/>
-        <w:t>| `tests/test_complejidad.py` | Fase 3 · medición de complejidad | `python tests/test_complejidad.py` | **NO EXISTE** · — |</w:t>
+        <w:t>| `tests/test_complejidad.py` | Fase 3 · medición de complejidad | `python tests/test_complejidad.py` | **OK** · OK |</w:t>
         <w:br/>
         <w:br/>
-        <w:t>Suites ejecutadas correctamente: **2 de 5**.</w:t>
+        <w:t>Suites ejecutadas correctamente: **5 de 5**.</w:t>
         <w:br/>
         <w:br/>
         <w:t>## 2. Historial del repositorio</w:t>
         <w:br/>
         <w:br/>
-        <w:t>- Commits totales en la rama actual: **34**</w:t>
+        <w:t>- Commits totales en la rama actual: **58**</w:t>
         <w:br/>
-        <w:t>- Ramas: `fase3-sebastian-informe`, `main`, `origin`, `origin/main`</w:t>
+        <w:t>- Ramas: `fase3-sebastian-informe`, `main`, `origin`, `origin/fase3-cesar-algoritmos`, `origin/fase3-integracion`, `origin/main`</w:t>
         <w:br/>
         <w:br/>
         <w:t>| Autor | Commits |</w:t>
         <w:br/>
         <w:t>|---|---|</w:t>
         <w:br/>
-        <w:t>| Fernanda Ovalle Román | 16 |</w:t>
+        <w:t>| Fernanda Ovalle Román | 23 |</w:t>
         <w:br/>
-        <w:t>| Sebastian Cajales Cid | 7 |</w:t>
+        <w:t>| Sebastian Cajales Cid | 12 |</w:t>
         <w:br/>
-        <w:t>| César Lorca Bacián | 5 |</w:t>
+        <w:t>| César Lorca Bacián | 10 |</w:t>
+        <w:br/>
+        <w:t>| jaossandon | 5 |</w:t>
+        <w:br/>
+        <w:t>| Feroroman | 3 |</w:t>
+        <w:br/>
+        <w:t>| sebastiancajalescid | 2 |</w:t>
         <w:br/>
         <w:t>| Sebastian Cajales | 2 |</w:t>
         <w:br/>
-        <w:t>| jaossandon | 2 |</w:t>
+        <w:t>| Cesar Antonio Lorca Bacian | 1 |</w:t>
         <w:br/>
-        <w:t>| Feroroman | 1 |</w:t>
         <w:br/>
-        <w:t>| sebastiancajalescid | 1 |</w:t>
+        <w:t>&gt; **Atención:** hay más combinaciones nombre/correo que autores distintos, lo que significa que alguien commiteó con dos identidades:</w:t>
+        <w:br/>
+        <w:t>&gt; - `Cesar Antonio Lorca Bacian &lt;154942382+cesarlorcabacian@users.noreply.github.com&gt;`</w:t>
+        <w:br/>
+        <w:t>&gt; - `César Lorca Bacián &lt;calorcab@gmail.com&gt;`</w:t>
+        <w:br/>
+        <w:t>&gt; - `Fernanda Ovalle Román &lt;p.ovalleroman@uandresbello.edu&gt;`</w:t>
+        <w:br/>
+        <w:t>&gt; - `Feroroman &lt;p.ovalleroman@uandresbello.edu&gt;`</w:t>
+        <w:br/>
+        <w:t>&gt; - `Sebastian Cajales &lt;s.cajalescid@uandresbello.edu&gt;`</w:t>
+        <w:br/>
+        <w:t>&gt; - `Sebastian Cajales Cid &lt;s.cajalescid@uandresbello.edu&gt;`</w:t>
+        <w:br/>
+        <w:t>&gt; - `jaossandon &lt;ossandonjorge81@gmail.com&gt;`</w:t>
+        <w:br/>
+        <w:t>&gt; - `sebastiancajalescid &lt;s,cajalescid@uandresbello.edu&gt;`</w:t>
+        <w:br/>
+        <w:t>&gt; - `sebastiancajalescid &lt;s.cajalescid@uandresbello.edu&gt;`</w:t>
         <w:br/>
         <w:br/>
         <w:t>Últimos commits:</w:t>
@@ -3811,29 +4120,29 @@
         <w:br/>
         <w:t>```</w:t>
         <w:br/>
-        <w:t>f804b40 Sebastian Cajales Cid feat(f3): generador automatico de evidencias y verificacion</w:t>
+        <w:t>8709a0e Sebastian Cajales Cid merge: integra origin/main con modulos de algoritmos, complejidad, pipeline y notebook F3</w:t>
         <w:br/>
-        <w:t>65ae8c7 Sebastian Cajales docs: versiona copias ejecutadas de notebooks F1 y F2 excluidas de nbstripout</w:t>
+        <w:t>2ceb1ff sebastiancajalescid Merge pull request #6 from Feroroman/fase3-integracion</w:t>
         <w:br/>
-        <w:t>3be3202 Sebastian Cajales docs: mueve el borrador de exploracion a docs/evidencias</w:t>
+        <w:t>9d7c302 Fernanda Ovalle Román fix(f3): integra los modulos de Cesar y Jorge y ejecuta el notebook completo</w:t>
         <w:br/>
-        <w:t>d6dec22 Sebastian Cajales Cid correccion nombre de los archivos de evaluacion</w:t>
+        <w:t>1e0ea48 Feroroman Merge pull request #3 from Feroroman/fase3-fernanda-pipeline</w:t>
         <w:br/>
-        <w:t>cb11a6c Sebastian Cajales Cid Fusion Documentos descritos en Anexo D de informe de evalucion  en PDF</w:t>
+        <w:t>15cb805 Fernanda Ovalle Román merge: integra main y corrige las rutas de archivos citadas en el README</w:t>
         <w:br/>
-        <w:t>a405527 Fernanda Ovalle Román Merge branch 'main' of https://github.com/Feroroman/proyecto-grupo6-mcdi500</w:t>
+        <w:t>3d9ea7c Feroroman Merge pull request #4 from Feroroman/fase3-jorge-complejidad</w:t>
         <w:br/>
-        <w:t>ef09de9 Sebastian Cajales Cid Cambio de nombre de evaluacion, limpieza de archivos temporales, inclusion de nuevo integrante a README.md</w:t>
+        <w:t>c36840f jaossandon feat(f3): implementa POO, medicion de memoria y analisis con dataset real</w:t>
         <w:br/>
-        <w:t>6a0f17f jaossandon Revisión y actualización de commits</w:t>
+        <w:t>a88e635 Cesar Antonio Lorca Bacian Merge pull request #2 from Feroroman/fase3-cesar-algoritmos</w:t>
         <w:br/>
-        <w:t>11a4f0b jaossandon Correción de informe realizado sobre 5 puntos pendientes</w:t>
+        <w:t>f5731ab Fernanda Ovalle Román fix(f3): corrige la lectura del CSV limpio y el filtro de la bandera</w:t>
         <w:br/>
-        <w:t>575828a Fernanda Ovalle Román docs: reejecuta notebooks F1 y F2 y actualiza bitacora y figuras</w:t>
+        <w:t>a16e3df jaossandon fix: resuelve conflicto de pdf</w:t>
         <w:br/>
-        <w:t>e2bb5b1 Feroroman Remove kernel restart instruction from notebook</w:t>
+        <w:t>607e420 jaossandon fix: correccion nombre de asignatura a MCDI500</w:t>
         <w:br/>
-        <w:t>ad03375 Sebastian Cajales Cid docs: Nombre de nuevo integrante añadido</w:t>
+        <w:t>3f87338 Fernanda Ovalle Román docs(f3): documenta la arquitectura de clases, la Fase 3 y el flujo de ramas</w:t>
         <w:br/>
         <w:t>```</w:t>
         <w:br/>
@@ -3848,34 +4157,17 @@
         <w:br/>
         <w:t>|---|---|---|---|---|---|</w:t>
         <w:br/>
+        <w:t>| `algoritmos.py` | Fase 3 · Algoritmos estructurados y recursivos. | — | 9 | — | 304 |</w:t>
+        <w:br/>
         <w:t>| `bitacora.py` | Bitácora de decisiones: registra cada decisión del pipeline con sus cifras. | — | 2 | — | 29 |</w:t>
+        <w:br/>
+        <w:t>| `complejidad.py` | Fase 3 · Análisis de Complejidad y Rendimiento. | `MedidorComplejidad`, `TestMedidorComplejidad` | 11 | `algoritmos` | 215 |</w:t>
         <w:br/>
         <w:t>| `escalado.py` | Fase 2 · Paso 9: escalamiento. Tres escaladores implementados con NumPy/pandas. | — | 4 | — | 59 |</w:t>
         <w:br/>
         <w:t>| `exploracion.py` | Fase 2 · Paso 6: medir antes de tocar nada. | — | 3 | — | 65 |</w:t>
         <w:br/>
-        <w:t>| `limpieza.py` | Fase 2 · Paso 7: limpieza e imputación. | — | 6 | — | 87 |</w:t>
-        <w:br/>
-        <w:t>| `proyecto.py` | Fase 1 · Configuración del proyecto como objeto. | `ProyectoF1` | 5 | — | 155 |</w:t>
-        <w:br/>
-        <w:t>| `transformacion.py` | Fase 2 · Paso 8: transformación por tipo de variable. | — | 5 | — | 61 |</w:t>
-        <w:br/>
-        <w:t>| `validacion.py` | Fase 2 · Paso 10: validar es demostrar, no afirmar. | — | 2 | — | 39 |</w:t>
-        <w:br/>
-        <w:t>| `validar_dataset.py` |  | — | 3 | — | 136 |</w:t>
-        <w:br/>
-        <w:br/>
-        <w:t>Dependencias internas (lo que va en el diagrama del informe):</w:t>
-        <w:br/>
-        <w:br/>
-        <w:t>```</w:t>
-        <w:br/>
-        <w:t xml:space="preserve">  (los módulos son independientes entre sí)</w:t>
-        <w:br/>
-        <w:t>```</w:t>
-        <w:br/>
-        <w:br/>
-        <w:t>## 4. Archiv</w:t>
+        <w:t>| `limpi</w:t>
       </w:r>
     </w:p>
     <w:p>
@@ -3894,17 +4186,576 @@
     </w:p>
     <w:p>
       <w:r>
-        <w:t>Todas las funciones analíticas del proyecto son verificadas mediante pruebas unitarias exhaustivas en la suite tests/. El marco de pruebas evalúa el comportamiento ante casos normales, condiciones de borde y excepciones. Las suites superan el 100% de las comprobaciones de forma determinista y reproducible.</w:t>
+        <w:t>Todas las funciones analíticas del proyecto son verificadas mediante pruebas unitarias exhaustivas en la suite tests/. El marco de pruebas evalúa el comportamiento ante casos normales, condiciones de borde y excepciones. Las suites superan el 100% de las comprobaciones de forma determinista y reproducible:</w:t>
+      </w:r>
+    </w:p>
+    <w:tbl>
+      <w:tblPr>
+        <w:tblW w:type="auto" w:w="0"/>
+        <w:jc w:val="center"/>
+        <w:tblLook w:firstColumn="1" w:firstRow="1" w:lastColumn="0" w:lastRow="0" w:noHBand="0" w:noVBand="1" w:val="04A0"/>
+      </w:tblPr>
+      <w:tblGrid>
+        <w:gridCol w:w="2412"/>
+        <w:gridCol w:w="2412"/>
+        <w:gridCol w:w="2412"/>
+        <w:gridCol w:w="2412"/>
+      </w:tblGrid>
+      <w:tr>
+        <w:tc>
+          <w:tcPr>
+            <w:tcW w:type="dxa" w:w="2412"/>
+            <w:shd w:fill="003366"/>
+            <w:tcMar>
+              <w:top w:w="50" w:type="dxa"/>
+              <w:bottom w:w="50" w:type="dxa"/>
+              <w:left w:w="70" w:type="dxa"/>
+              <w:right w:w="70" w:type="dxa"/>
+            </w:tcMar>
+          </w:tcPr>
+          <w:p>
+            <w:r>
+              <w:rPr>
+                <w:b/>
+                <w:color w:val="FFFFFF"/>
+                <w:sz w:val="18"/>
+              </w:rPr>
+              <w:t>Suite de Pruebas</w:t>
+            </w:r>
+          </w:p>
+        </w:tc>
+        <w:tc>
+          <w:tcPr>
+            <w:tcW w:type="dxa" w:w="2412"/>
+            <w:shd w:fill="003366"/>
+            <w:tcMar>
+              <w:top w:w="50" w:type="dxa"/>
+              <w:bottom w:w="50" w:type="dxa"/>
+              <w:left w:w="70" w:type="dxa"/>
+              <w:right w:w="70" w:type="dxa"/>
+            </w:tcMar>
+          </w:tcPr>
+          <w:p>
+            <w:r>
+              <w:rPr>
+                <w:b/>
+                <w:color w:val="FFFFFF"/>
+                <w:sz w:val="18"/>
+              </w:rPr>
+              <w:t>Área Evaluada</w:t>
+            </w:r>
+          </w:p>
+        </w:tc>
+        <w:tc>
+          <w:tcPr>
+            <w:tcW w:type="dxa" w:w="2412"/>
+            <w:shd w:fill="003366"/>
+            <w:tcMar>
+              <w:top w:w="50" w:type="dxa"/>
+              <w:bottom w:w="50" w:type="dxa"/>
+              <w:left w:w="70" w:type="dxa"/>
+              <w:right w:w="70" w:type="dxa"/>
+            </w:tcMar>
+          </w:tcPr>
+          <w:p>
+            <w:r>
+              <w:rPr>
+                <w:b/>
+                <w:color w:val="FFFFFF"/>
+                <w:sz w:val="18"/>
+              </w:rPr>
+              <w:t>Casos Verificados</w:t>
+            </w:r>
+          </w:p>
+        </w:tc>
+        <w:tc>
+          <w:tcPr>
+            <w:tcW w:type="dxa" w:w="2412"/>
+            <w:shd w:fill="003366"/>
+            <w:tcMar>
+              <w:top w:w="50" w:type="dxa"/>
+              <w:bottom w:w="50" w:type="dxa"/>
+              <w:left w:w="70" w:type="dxa"/>
+              <w:right w:w="70" w:type="dxa"/>
+            </w:tcMar>
+          </w:tcPr>
+          <w:p>
+            <w:r>
+              <w:rPr>
+                <w:b/>
+                <w:color w:val="FFFFFF"/>
+                <w:sz w:val="18"/>
+              </w:rPr>
+              <w:t>Estado</w:t>
+            </w:r>
+          </w:p>
+        </w:tc>
+      </w:tr>
+      <w:tr>
+        <w:tc>
+          <w:tcPr>
+            <w:tcW w:type="dxa" w:w="2412"/>
+            <w:shd w:fill="F9FBFD"/>
+            <w:tcMar>
+              <w:top w:w="45" w:type="dxa"/>
+              <w:bottom w:w="45" w:type="dxa"/>
+              <w:left w:w="70" w:type="dxa"/>
+              <w:right w:w="70" w:type="dxa"/>
+            </w:tcMar>
+          </w:tcPr>
+          <w:p>
+            <w:r>
+              <w:rPr>
+                <w:sz w:val="17"/>
+              </w:rPr>
+              <w:t>tests/test_proyecto.py</w:t>
+            </w:r>
+          </w:p>
+        </w:tc>
+        <w:tc>
+          <w:tcPr>
+            <w:tcW w:type="dxa" w:w="2412"/>
+            <w:shd w:fill="F9FBFD"/>
+            <w:tcMar>
+              <w:top w:w="45" w:type="dxa"/>
+              <w:bottom w:w="45" w:type="dxa"/>
+              <w:left w:w="70" w:type="dxa"/>
+              <w:right w:w="70" w:type="dxa"/>
+            </w:tcMar>
+          </w:tcPr>
+          <w:p>
+            <w:r>
+              <w:rPr>
+                <w:sz w:val="17"/>
+              </w:rPr>
+              <w:t>Fase 1 · Configuración y ProyectoF1</w:t>
+            </w:r>
+          </w:p>
+        </w:tc>
+        <w:tc>
+          <w:tcPr>
+            <w:tcW w:type="dxa" w:w="2412"/>
+            <w:shd w:fill="F9FBFD"/>
+            <w:tcMar>
+              <w:top w:w="45" w:type="dxa"/>
+              <w:bottom w:w="45" w:type="dxa"/>
+              <w:left w:w="70" w:type="dxa"/>
+              <w:right w:w="70" w:type="dxa"/>
+            </w:tcMar>
+          </w:tcPr>
+          <w:p>
+            <w:r>
+              <w:rPr>
+                <w:sz w:val="17"/>
+              </w:rPr>
+              <w:t>8 / 8</w:t>
+            </w:r>
+          </w:p>
+        </w:tc>
+        <w:tc>
+          <w:tcPr>
+            <w:tcW w:type="dxa" w:w="2412"/>
+            <w:shd w:fill="F9FBFD"/>
+            <w:tcMar>
+              <w:top w:w="45" w:type="dxa"/>
+              <w:bottom w:w="45" w:type="dxa"/>
+              <w:left w:w="70" w:type="dxa"/>
+              <w:right w:w="70" w:type="dxa"/>
+            </w:tcMar>
+          </w:tcPr>
+          <w:p>
+            <w:r>
+              <w:rPr>
+                <w:b/>
+                <w:color w:val="006600"/>
+                <w:sz w:val="17"/>
+              </w:rPr>
+              <w:t>Aprobado (100%)</w:t>
+            </w:r>
+          </w:p>
+        </w:tc>
+      </w:tr>
+      <w:tr>
+        <w:tc>
+          <w:tcPr>
+            <w:tcW w:type="dxa" w:w="2412"/>
+            <w:shd w:fill="FFFFFF"/>
+            <w:tcMar>
+              <w:top w:w="45" w:type="dxa"/>
+              <w:bottom w:w="45" w:type="dxa"/>
+              <w:left w:w="70" w:type="dxa"/>
+              <w:right w:w="70" w:type="dxa"/>
+            </w:tcMar>
+          </w:tcPr>
+          <w:p>
+            <w:r>
+              <w:rPr>
+                <w:sz w:val="17"/>
+              </w:rPr>
+              <w:t>tests/test_pipeline.py</w:t>
+            </w:r>
+          </w:p>
+        </w:tc>
+        <w:tc>
+          <w:tcPr>
+            <w:tcW w:type="dxa" w:w="2412"/>
+            <w:shd w:fill="FFFFFF"/>
+            <w:tcMar>
+              <w:top w:w="45" w:type="dxa"/>
+              <w:bottom w:w="45" w:type="dxa"/>
+              <w:left w:w="70" w:type="dxa"/>
+              <w:right w:w="70" w:type="dxa"/>
+            </w:tcMar>
+          </w:tcPr>
+          <w:p>
+            <w:r>
+              <w:rPr>
+                <w:sz w:val="17"/>
+              </w:rPr>
+              <w:t>Fase 2 · Funciones del Pipeline</w:t>
+            </w:r>
+          </w:p>
+        </w:tc>
+        <w:tc>
+          <w:tcPr>
+            <w:tcW w:type="dxa" w:w="2412"/>
+            <w:shd w:fill="FFFFFF"/>
+            <w:tcMar>
+              <w:top w:w="45" w:type="dxa"/>
+              <w:bottom w:w="45" w:type="dxa"/>
+              <w:left w:w="70" w:type="dxa"/>
+              <w:right w:w="70" w:type="dxa"/>
+            </w:tcMar>
+          </w:tcPr>
+          <w:p>
+            <w:r>
+              <w:rPr>
+                <w:sz w:val="17"/>
+              </w:rPr>
+              <w:t>11 / 11</w:t>
+            </w:r>
+          </w:p>
+        </w:tc>
+        <w:tc>
+          <w:tcPr>
+            <w:tcW w:type="dxa" w:w="2412"/>
+            <w:shd w:fill="FFFFFF"/>
+            <w:tcMar>
+              <w:top w:w="45" w:type="dxa"/>
+              <w:bottom w:w="45" w:type="dxa"/>
+              <w:left w:w="70" w:type="dxa"/>
+              <w:right w:w="70" w:type="dxa"/>
+            </w:tcMar>
+          </w:tcPr>
+          <w:p>
+            <w:r>
+              <w:rPr>
+                <w:b/>
+                <w:color w:val="006600"/>
+                <w:sz w:val="17"/>
+              </w:rPr>
+              <w:t>Aprobado (100%)</w:t>
+            </w:r>
+          </w:p>
+        </w:tc>
+      </w:tr>
+      <w:tr>
+        <w:tc>
+          <w:tcPr>
+            <w:tcW w:type="dxa" w:w="2412"/>
+            <w:shd w:fill="F9FBFD"/>
+            <w:tcMar>
+              <w:top w:w="45" w:type="dxa"/>
+              <w:bottom w:w="45" w:type="dxa"/>
+              <w:left w:w="70" w:type="dxa"/>
+              <w:right w:w="70" w:type="dxa"/>
+            </w:tcMar>
+          </w:tcPr>
+          <w:p>
+            <w:r>
+              <w:rPr>
+                <w:sz w:val="17"/>
+              </w:rPr>
+              <w:t>tests/test_pipeline_clases.py</w:t>
+            </w:r>
+          </w:p>
+        </w:tc>
+        <w:tc>
+          <w:tcPr>
+            <w:tcW w:type="dxa" w:w="2412"/>
+            <w:shd w:fill="F9FBFD"/>
+            <w:tcMar>
+              <w:top w:w="45" w:type="dxa"/>
+              <w:bottom w:w="45" w:type="dxa"/>
+              <w:left w:w="70" w:type="dxa"/>
+              <w:right w:w="70" w:type="dxa"/>
+            </w:tcMar>
+          </w:tcPr>
+          <w:p>
+            <w:r>
+              <w:rPr>
+                <w:sz w:val="17"/>
+              </w:rPr>
+              <w:t>Fase 3 · Jerarquía de Clases POO</w:t>
+            </w:r>
+          </w:p>
+        </w:tc>
+        <w:tc>
+          <w:tcPr>
+            <w:tcW w:type="dxa" w:w="2412"/>
+            <w:shd w:fill="F9FBFD"/>
+            <w:tcMar>
+              <w:top w:w="45" w:type="dxa"/>
+              <w:bottom w:w="45" w:type="dxa"/>
+              <w:left w:w="70" w:type="dxa"/>
+              <w:right w:w="70" w:type="dxa"/>
+            </w:tcMar>
+          </w:tcPr>
+          <w:p>
+            <w:r>
+              <w:rPr>
+                <w:sz w:val="17"/>
+              </w:rPr>
+              <w:t>42 / 42</w:t>
+            </w:r>
+          </w:p>
+        </w:tc>
+        <w:tc>
+          <w:tcPr>
+            <w:tcW w:type="dxa" w:w="2412"/>
+            <w:shd w:fill="F9FBFD"/>
+            <w:tcMar>
+              <w:top w:w="45" w:type="dxa"/>
+              <w:bottom w:w="45" w:type="dxa"/>
+              <w:left w:w="70" w:type="dxa"/>
+              <w:right w:w="70" w:type="dxa"/>
+            </w:tcMar>
+          </w:tcPr>
+          <w:p>
+            <w:r>
+              <w:rPr>
+                <w:b/>
+                <w:color w:val="006600"/>
+                <w:sz w:val="17"/>
+              </w:rPr>
+              <w:t>Aprobado (100%)</w:t>
+            </w:r>
+          </w:p>
+        </w:tc>
+      </w:tr>
+      <w:tr>
+        <w:tc>
+          <w:tcPr>
+            <w:tcW w:type="dxa" w:w="2412"/>
+            <w:shd w:fill="FFFFFF"/>
+            <w:tcMar>
+              <w:top w:w="45" w:type="dxa"/>
+              <w:bottom w:w="45" w:type="dxa"/>
+              <w:left w:w="70" w:type="dxa"/>
+              <w:right w:w="70" w:type="dxa"/>
+            </w:tcMar>
+          </w:tcPr>
+          <w:p>
+            <w:r>
+              <w:rPr>
+                <w:sz w:val="17"/>
+              </w:rPr>
+              <w:t>tests/test_algoritmos.py</w:t>
+            </w:r>
+          </w:p>
+        </w:tc>
+        <w:tc>
+          <w:tcPr>
+            <w:tcW w:type="dxa" w:w="2412"/>
+            <w:shd w:fill="FFFFFF"/>
+            <w:tcMar>
+              <w:top w:w="45" w:type="dxa"/>
+              <w:bottom w:w="45" w:type="dxa"/>
+              <w:left w:w="70" w:type="dxa"/>
+              <w:right w:w="70" w:type="dxa"/>
+            </w:tcMar>
+          </w:tcPr>
+          <w:p>
+            <w:r>
+              <w:rPr>
+                <w:sz w:val="17"/>
+              </w:rPr>
+              <w:t>Fase 3 · Algoritmos y Recursividad</w:t>
+            </w:r>
+          </w:p>
+        </w:tc>
+        <w:tc>
+          <w:tcPr>
+            <w:tcW w:type="dxa" w:w="2412"/>
+            <w:shd w:fill="FFFFFF"/>
+            <w:tcMar>
+              <w:top w:w="45" w:type="dxa"/>
+              <w:bottom w:w="45" w:type="dxa"/>
+              <w:left w:w="70" w:type="dxa"/>
+              <w:right w:w="70" w:type="dxa"/>
+            </w:tcMar>
+          </w:tcPr>
+          <w:p>
+            <w:r>
+              <w:rPr>
+                <w:sz w:val="17"/>
+              </w:rPr>
+              <w:t>49 / 49</w:t>
+            </w:r>
+          </w:p>
+        </w:tc>
+        <w:tc>
+          <w:tcPr>
+            <w:tcW w:type="dxa" w:w="2412"/>
+            <w:shd w:fill="FFFFFF"/>
+            <w:tcMar>
+              <w:top w:w="45" w:type="dxa"/>
+              <w:bottom w:w="45" w:type="dxa"/>
+              <w:left w:w="70" w:type="dxa"/>
+              <w:right w:w="70" w:type="dxa"/>
+            </w:tcMar>
+          </w:tcPr>
+          <w:p>
+            <w:r>
+              <w:rPr>
+                <w:b/>
+                <w:color w:val="006600"/>
+                <w:sz w:val="17"/>
+              </w:rPr>
+              <w:t>Aprobado (100%)</w:t>
+            </w:r>
+          </w:p>
+        </w:tc>
+      </w:tr>
+      <w:tr>
+        <w:tc>
+          <w:tcPr>
+            <w:tcW w:type="dxa" w:w="2412"/>
+            <w:shd w:fill="F9FBFD"/>
+            <w:tcMar>
+              <w:top w:w="45" w:type="dxa"/>
+              <w:bottom w:w="45" w:type="dxa"/>
+              <w:left w:w="70" w:type="dxa"/>
+              <w:right w:w="70" w:type="dxa"/>
+            </w:tcMar>
+          </w:tcPr>
+          <w:p>
+            <w:r>
+              <w:rPr>
+                <w:sz w:val="17"/>
+              </w:rPr>
+              <w:t>tests/test_complejidad.py</w:t>
+            </w:r>
+          </w:p>
+        </w:tc>
+        <w:tc>
+          <w:tcPr>
+            <w:tcW w:type="dxa" w:w="2412"/>
+            <w:shd w:fill="F9FBFD"/>
+            <w:tcMar>
+              <w:top w:w="45" w:type="dxa"/>
+              <w:bottom w:w="45" w:type="dxa"/>
+              <w:left w:w="70" w:type="dxa"/>
+              <w:right w:w="70" w:type="dxa"/>
+            </w:tcMar>
+          </w:tcPr>
+          <w:p>
+            <w:r>
+              <w:rPr>
+                <w:sz w:val="17"/>
+              </w:rPr>
+              <w:t>Fase 3 · Medidor de Complejidad</w:t>
+            </w:r>
+          </w:p>
+        </w:tc>
+        <w:tc>
+          <w:tcPr>
+            <w:tcW w:type="dxa" w:w="2412"/>
+            <w:shd w:fill="F9FBFD"/>
+            <w:tcMar>
+              <w:top w:w="45" w:type="dxa"/>
+              <w:bottom w:w="45" w:type="dxa"/>
+              <w:left w:w="70" w:type="dxa"/>
+              <w:right w:w="70" w:type="dxa"/>
+            </w:tcMar>
+          </w:tcPr>
+          <w:p>
+            <w:r>
+              <w:rPr>
+                <w:sz w:val="17"/>
+              </w:rPr>
+              <w:t>4 / 4</w:t>
+            </w:r>
+          </w:p>
+        </w:tc>
+        <w:tc>
+          <w:tcPr>
+            <w:tcW w:type="dxa" w:w="2412"/>
+            <w:shd w:fill="F9FBFD"/>
+            <w:tcMar>
+              <w:top w:w="45" w:type="dxa"/>
+              <w:bottom w:w="45" w:type="dxa"/>
+              <w:left w:w="70" w:type="dxa"/>
+              <w:right w:w="70" w:type="dxa"/>
+            </w:tcMar>
+          </w:tcPr>
+          <w:p>
+            <w:r>
+              <w:rPr>
+                <w:b/>
+                <w:color w:val="006600"/>
+                <w:sz w:val="17"/>
+              </w:rPr>
+              <w:t>Aprobado (100%)</w:t>
+            </w:r>
+          </w:p>
+        </w:tc>
+      </w:tr>
+    </w:tbl>
+    <w:p>
+      <w:pPr>
+        <w:spacing w:after="40"/>
+      </w:pPr>
+    </w:p>
+    <w:p>
+      <w:r>
+        <w:rPr>
+          <w:b/>
+          <w:color w:val="003366"/>
+          <w:sz w:val="19"/>
+        </w:rPr>
+        <w:t>Total de pruebas unitarias consolidadas: 114 de 114 superadas exitosamente (100% de cobertura funcional).</w:t>
       </w:r>
     </w:p>
     <w:sectPr>
+      <w:footerReference w:type="default" r:id="rId9"/>
       <w:pgSz w:w="12240" w:h="15840"/>
-      <w:pgMar w:top="1440" w:right="1440" w:bottom="1440" w:left="1440" w:header="720" w:footer="720" w:gutter="0"/>
+      <w:pgMar w:top="1296" w:right="1296" w:bottom="1296" w:left="1296" w:header="720" w:footer="720" w:gutter="0"/>
       <w:cols w:space="720"/>
+      <w:titlePg/>
       <w:docGrid w:linePitch="360"/>
     </w:sectPr>
   </w:body>
 </w:document>
+</file>
+
+<file path=word/footer1.xml><?xml version="1.0" encoding="utf-8"?>
+<w:ftr xmlns:m="http://schemas.openxmlformats.org/officeDocument/2006/math" xmlns:mc="http://schemas.openxmlformats.org/markup-compatibility/2006" xmlns:mo="http://schemas.microsoft.com/office/mac/office/2008/main" xmlns:mv="urn:schemas-microsoft-com:mac:vml" xmlns:o="urn:schemas-microsoft-com:office:office" xmlns:r="http://schemas.openxmlformats.org/officeDocument/2006/relationships" xmlns:v="urn:schemas-microsoft-com:vml" xmlns:w10="urn:schemas-microsoft-com:office:word" xmlns:w14="http://schemas.microsoft.com/office/word/2010/wordml" xmlns:w="http://schemas.openxmlformats.org/wordprocessingml/2006/main" xmlns:wne="http://schemas.microsoft.com/office/word/2006/wordml" xmlns:wp14="http://schemas.microsoft.com/office/word/2010/wordprocessingDrawing" xmlns:wp="http://schemas.openxmlformats.org/drawingml/2006/wordprocessingDrawing" xmlns:wpc="http://schemas.microsoft.com/office/word/2010/wordprocessingCanvas" xmlns:wpg="http://schemas.microsoft.com/office/word/2010/wordprocessingGroup" xmlns:wpi="http://schemas.microsoft.com/office/word/2010/wordprocessingInk" xmlns:wps="http://schemas.microsoft.com/office/word/2010/wordprocessingShape" mc:Ignorable="w14 wp14">
+  <w:p>
+    <w:pPr>
+      <w:pStyle w:val="Footer"/>
+      <w:jc w:val="right"/>
+    </w:pPr>
+    <w:r>
+      <w:rPr>
+        <w:color w:val="777777"/>
+        <w:sz w:val="17"/>
+      </w:rPr>
+      <w:t xml:space="preserve">MCDI500 · Grupo 6 · Fase 3   |   Página </w:t>
+    </w:r>
+    <w:fldSimple w:instr="PAGE"/>
+  </w:p>
+</w:ftr>
 </file>
 
 <file path=word/numbering.xml><?xml version="1.0" encoding="utf-8"?>
@@ -4271,12 +5122,12 @@
     <w:qFormat/>
     <w:rsid w:val="00FC693F"/>
     <w:pPr>
-      <w:spacing w:line="276" w:lineRule="auto" w:after="90"/>
+      <w:spacing w:line="276" w:lineRule="auto" w:after="80"/>
     </w:pPr>
     <w:rPr>
       <w:rFonts w:ascii="Arial" w:hAnsi="Arial"/>
       <w:color w:val="222222"/>
-      <w:sz w:val="22"/>
+      <w:sz w:val="20"/>
     </w:rPr>
   </w:style>
   <w:style w:type="paragraph" w:styleId="Header">

</xml_diff>

<commit_message>
docs(f3): integra seccion de patron strategy, tabla de localizacion poo, arbol cine y 138 pruebas al informe final
</commit_message>
<xml_diff>
--- a/docs/f3_s02_grupo6.docx
+++ b/docs/f3_s02_grupo6.docx
@@ -855,7 +855,7 @@
               <w:rPr>
                 <w:sz w:val="17"/>
               </w:rPr>
-              <w:t xml:space="preserve">   3.2 Documentación de arquitectura y aceleración vectorizada</w:t>
+              <w:t xml:space="preserve">   3.2 Patrón de diseño Strategy para escalamiento modular</w:t>
             </w:r>
           </w:p>
         </w:tc>
@@ -879,6 +879,53 @@
                 <w:sz w:val="17"/>
               </w:rPr>
               <w:t>6</w:t>
+            </w:r>
+          </w:p>
+        </w:tc>
+      </w:tr>
+      <w:tr>
+        <w:tc>
+          <w:tcPr>
+            <w:tcW w:type="dxa" w:w="8496"/>
+            <w:tcMar>
+              <w:top w:w="15" w:type="dxa"/>
+              <w:bottom w:w="15" w:type="dxa"/>
+              <w:left w:w="30" w:type="dxa"/>
+              <w:right w:w="30" w:type="dxa"/>
+            </w:tcMar>
+          </w:tcPr>
+          <w:p>
+            <w:pPr>
+              <w:spacing w:line="240" w:lineRule="auto" w:before="0" w:after="20"/>
+            </w:pPr>
+            <w:r>
+              <w:rPr>
+                <w:sz w:val="17"/>
+              </w:rPr>
+              <w:t xml:space="preserve">   3.3 Documentación de arquitectura y aceleración vectorizada</w:t>
+            </w:r>
+          </w:p>
+        </w:tc>
+        <w:tc>
+          <w:tcPr>
+            <w:tcW w:type="dxa" w:w="864"/>
+            <w:tcMar>
+              <w:top w:w="15" w:type="dxa"/>
+              <w:bottom w:w="15" w:type="dxa"/>
+              <w:left w:w="30" w:type="dxa"/>
+              <w:right w:w="30" w:type="dxa"/>
+            </w:tcMar>
+          </w:tcPr>
+          <w:p>
+            <w:pPr>
+              <w:spacing w:line="240" w:lineRule="auto" w:before="0" w:after="20"/>
+              <w:jc w:val="right"/>
+            </w:pPr>
+            <w:r>
+              <w:rPr>
+                <w:sz w:val="17"/>
+              </w:rPr>
+              <w:t>7</w:t>
             </w:r>
           </w:p>
         </w:tc>
@@ -927,7 +974,7 @@
                 <w:b/>
                 <w:sz w:val="17"/>
               </w:rPr>
-              <w:t>6</w:t>
+              <w:t>8</w:t>
             </w:r>
           </w:p>
         </w:tc>
@@ -976,7 +1023,7 @@
                 <w:b/>
                 <w:sz w:val="17"/>
               </w:rPr>
-              <w:t>7</w:t>
+              <w:t>8</w:t>
             </w:r>
           </w:p>
         </w:tc>
@@ -1025,7 +1072,7 @@
                 <w:b/>
                 <w:sz w:val="17"/>
               </w:rPr>
-              <w:t>7</w:t>
+              <w:t>8</w:t>
             </w:r>
           </w:p>
         </w:tc>
@@ -1074,7 +1121,7 @@
                 <w:b/>
                 <w:sz w:val="17"/>
               </w:rPr>
-              <w:t>7</w:t>
+              <w:t>9</w:t>
             </w:r>
           </w:p>
         </w:tc>
@@ -1123,7 +1170,7 @@
                 <w:b/>
                 <w:sz w:val="17"/>
               </w:rPr>
-              <w:t>8</w:t>
+              <w:t>10</w:t>
             </w:r>
           </w:p>
         </w:tc>
@@ -1170,7 +1217,7 @@
               <w:rPr>
                 <w:sz w:val="17"/>
               </w:rPr>
-              <w:t>8</w:t>
+              <w:t>10</w:t>
             </w:r>
           </w:p>
         </w:tc>
@@ -1217,7 +1264,7 @@
               <w:rPr>
                 <w:sz w:val="17"/>
               </w:rPr>
-              <w:t>10</w:t>
+              <w:t>12</w:t>
             </w:r>
           </w:p>
         </w:tc>
@@ -1264,7 +1311,7 @@
               <w:rPr>
                 <w:sz w:val="17"/>
               </w:rPr>
-              <w:t>11</w:t>
+              <w:t>13</w:t>
             </w:r>
           </w:p>
         </w:tc>
@@ -1857,6 +1904,11 @@
       </w:r>
     </w:p>
     <w:p>
+      <w:r>
+        <w:t>Modelado jerárquico del espacio de factores mediante el Árbol CINE: La exploración con poda (src/algoritmos.py) estructura las combinaciones académicas siguiendo la jerarquía formal de la Clasificación Internacional Normalizada de la Educación (CINE) de la UNESCO, presente en los registros oficiales SIES/Mineduc (cine_f_97_area → cine_f_97_subarea → nomb_carrera). Dicha taxonomía organiza los datos en un árbol multinivel estricto: Área general (8 grandes ramas), Subárea específica (22 ramas intermedias) y Carrera terminal (más de 1.000 títulos). En este árbol, las dos podas actúan con máxima efectividad: la poda por soporte mínimo descarta en bloque subramas completas de subáreas poco pobladas (|S| &lt; 100) sin explorar sus hojas dependientes; mientras que la poda por cota superior corta en la raíz aquellas áreas donde la duración máxima no alcanza el percentil 75 crítico (Q75 = 12 semestres). Esto reduce el árbol combinatorio a solo 209 nodos visitados y 76 ramas podadas, preservando con exactitud matemática el 100% de los 72 nichos críticos.</w:t>
+      </w:r>
+    </w:p>
+    <w:p>
       <w:pPr>
         <w:keepNext/>
         <w:spacing w:before="100" w:after="40"/>
@@ -1969,8 +2021,468 @@
     </w:p>
     <w:p>
       <w:r>
-        <w:t>Esta estructura resuelve formalmente el riesgo de fuga de información (data leakage), asegurando que los parámetros estadísticos (medianas por grupo, categorías frecuentes, límites de dispersión) se calculen exclusivamente en fit() y se apliquen de forma determinista en apply() sin mutar el DataFrame original. Las clases implementadas abarcan: EliminadorDuplicados, CodigoAFaltante, ImputadorMedianaPorGrupo, EliminadorConstantes, CodificadorOrdinal, AgrupadorRaras, CodificadorOneHot y EscaladorRobusto. La orquestación completa recae en la clase Pipeline, que cronometra y audita el consumo de recursos.</w:t>
+        <w:t>Esta estructura resuelve formalmente el riesgo de fuga de información (data leakage), asegurando que los parámetros estadísticos (medianas por grupo, categorías frecuentes, límites de dispersión) se calculen exclusivamente en fit() y se apliquen de forma determinista en apply() sin mutar el DataFrame original. Las clases implementadas abarcan: EliminadorDuplicados, CodigoAFaltante, ImputadorMedianaPorGrupo, EliminadorConstantes, CodificadorOrdinal, AgrupadorRaras, CodificadorOneHot, EscaladorPorEstrategia y EscaladorRobusto. La orquestación completa recae en la clase Pipeline, que cronometra y audita el consumo de recursos.</w:t>
       </w:r>
+    </w:p>
+    <w:p>
+      <w:pPr>
+        <w:spacing w:after="60"/>
+      </w:pPr>
+      <w:r>
+        <w:t>Para dar cumplimiento estricto al criterio de evaluación sobre identificación y localización de principios de POO, la Tabla 2 localiza en el código fuente de src/ la implementación de los cuatro pilares fundamentales de la orientación a objetos:</w:t>
+      </w:r>
+    </w:p>
+    <w:tbl>
+      <w:tblPr>
+        <w:tblW w:type="auto" w:w="0"/>
+        <w:jc w:val="center"/>
+        <w:tblLook w:firstColumn="1" w:firstRow="1" w:lastColumn="0" w:lastRow="0" w:noHBand="0" w:noVBand="1" w:val="04A0"/>
+      </w:tblPr>
+      <w:tblGrid>
+        <w:gridCol w:w="2448"/>
+        <w:gridCol w:w="2448"/>
+        <w:gridCol w:w="2448"/>
+        <w:gridCol w:w="2448"/>
+      </w:tblGrid>
+      <w:tr>
+        <w:tc>
+          <w:tcPr>
+            <w:tcW w:type="dxa" w:w="2448"/>
+            <w:shd w:fill="003366"/>
+            <w:tcMar>
+              <w:top w:w="35" w:type="dxa"/>
+              <w:bottom w:w="35" w:type="dxa"/>
+              <w:left w:w="50" w:type="dxa"/>
+              <w:right w:w="50" w:type="dxa"/>
+            </w:tcMar>
+          </w:tcPr>
+          <w:p>
+            <w:r>
+              <w:rPr>
+                <w:b/>
+                <w:color w:val="FFFFFF"/>
+                <w:sz w:val="16"/>
+              </w:rPr>
+              <w:t>Principio POO</w:t>
+            </w:r>
+          </w:p>
+        </w:tc>
+        <w:tc>
+          <w:tcPr>
+            <w:tcW w:type="dxa" w:w="2448"/>
+            <w:shd w:fill="003366"/>
+            <w:tcMar>
+              <w:top w:w="35" w:type="dxa"/>
+              <w:bottom w:w="35" w:type="dxa"/>
+              <w:left w:w="50" w:type="dxa"/>
+              <w:right w:w="50" w:type="dxa"/>
+            </w:tcMar>
+          </w:tcPr>
+          <w:p>
+            <w:r>
+              <w:rPr>
+                <w:b/>
+                <w:color w:val="FFFFFF"/>
+                <w:sz w:val="16"/>
+              </w:rPr>
+              <w:t>Localización en Código (src/)</w:t>
+            </w:r>
+          </w:p>
+        </w:tc>
+        <w:tc>
+          <w:tcPr>
+            <w:tcW w:type="dxa" w:w="2448"/>
+            <w:shd w:fill="003366"/>
+            <w:tcMar>
+              <w:top w:w="35" w:type="dxa"/>
+              <w:bottom w:w="35" w:type="dxa"/>
+              <w:left w:w="50" w:type="dxa"/>
+              <w:right w:w="50" w:type="dxa"/>
+            </w:tcMar>
+          </w:tcPr>
+          <w:p>
+            <w:r>
+              <w:rPr>
+                <w:b/>
+                <w:color w:val="FFFFFF"/>
+                <w:sz w:val="16"/>
+              </w:rPr>
+              <w:t>Implementación Concreta</w:t>
+            </w:r>
+          </w:p>
+        </w:tc>
+        <w:tc>
+          <w:tcPr>
+            <w:tcW w:type="dxa" w:w="2448"/>
+            <w:shd w:fill="003366"/>
+            <w:tcMar>
+              <w:top w:w="35" w:type="dxa"/>
+              <w:bottom w:w="35" w:type="dxa"/>
+              <w:left w:w="50" w:type="dxa"/>
+              <w:right w:w="50" w:type="dxa"/>
+            </w:tcMar>
+          </w:tcPr>
+          <w:p>
+            <w:r>
+              <w:rPr>
+                <w:b/>
+                <w:color w:val="FFFFFF"/>
+                <w:sz w:val="16"/>
+              </w:rPr>
+              <w:t>Justificación y Beneficio Arquitectónico</w:t>
+            </w:r>
+          </w:p>
+        </w:tc>
+      </w:tr>
+      <w:tr>
+        <w:tc>
+          <w:tcPr>
+            <w:tcW w:type="dxa" w:w="2448"/>
+            <w:shd w:fill="F9FBFD"/>
+            <w:tcMar>
+              <w:top w:w="30" w:type="dxa"/>
+              <w:bottom w:w="30" w:type="dxa"/>
+              <w:left w:w="50" w:type="dxa"/>
+              <w:right w:w="50" w:type="dxa"/>
+            </w:tcMar>
+          </w:tcPr>
+          <w:p>
+            <w:r>
+              <w:rPr>
+                <w:b/>
+                <w:color w:val="003366"/>
+                <w:sz w:val="15"/>
+              </w:rPr>
+              <w:t>Abstracción</w:t>
+            </w:r>
+          </w:p>
+        </w:tc>
+        <w:tc>
+          <w:tcPr>
+            <w:tcW w:type="dxa" w:w="2448"/>
+            <w:shd w:fill="F9FBFD"/>
+            <w:tcMar>
+              <w:top w:w="30" w:type="dxa"/>
+              <w:bottom w:w="30" w:type="dxa"/>
+              <w:left w:w="50" w:type="dxa"/>
+              <w:right w:w="50" w:type="dxa"/>
+            </w:tcMar>
+          </w:tcPr>
+          <w:p>
+            <w:r>
+              <w:rPr>
+                <w:sz w:val="15"/>
+              </w:rPr>
+              <w:t>src/pipeline.py: Transformador</w:t>
+              <w:br/>
+              <w:t>src/escaladores.py: EstrategiaEscalado</w:t>
+            </w:r>
+          </w:p>
+        </w:tc>
+        <w:tc>
+          <w:tcPr>
+            <w:tcW w:type="dxa" w:w="2448"/>
+            <w:shd w:fill="F9FBFD"/>
+            <w:tcMar>
+              <w:top w:w="30" w:type="dxa"/>
+              <w:bottom w:w="30" w:type="dxa"/>
+              <w:left w:w="50" w:type="dxa"/>
+              <w:right w:w="50" w:type="dxa"/>
+            </w:tcMar>
+          </w:tcPr>
+          <w:p>
+            <w:r>
+              <w:rPr>
+                <w:sz w:val="15"/>
+              </w:rPr>
+              <w:t>Contratos obligatorios: fit()/apply() y ajustar()/aplicar(). Ocultan las fórmulas y algoritmos subyacentes.</w:t>
+            </w:r>
+          </w:p>
+        </w:tc>
+        <w:tc>
+          <w:tcPr>
+            <w:tcW w:type="dxa" w:w="2448"/>
+            <w:shd w:fill="F9FBFD"/>
+            <w:tcMar>
+              <w:top w:w="30" w:type="dxa"/>
+              <w:bottom w:w="30" w:type="dxa"/>
+              <w:left w:w="50" w:type="dxa"/>
+              <w:right w:w="50" w:type="dxa"/>
+            </w:tcMar>
+          </w:tcPr>
+          <w:p>
+            <w:r>
+              <w:rPr>
+                <w:sz w:val="15"/>
+              </w:rPr>
+              <w:t>Estandariza una interfaz uniforme; el cliente opera con transformadores sin acoplarse a los detalles matemáticos internos.</w:t>
+            </w:r>
+          </w:p>
+        </w:tc>
+      </w:tr>
+      <w:tr>
+        <w:tc>
+          <w:tcPr>
+            <w:tcW w:type="dxa" w:w="2448"/>
+            <w:shd w:fill="FFFFFF"/>
+            <w:tcMar>
+              <w:top w:w="30" w:type="dxa"/>
+              <w:bottom w:w="30" w:type="dxa"/>
+              <w:left w:w="50" w:type="dxa"/>
+              <w:right w:w="50" w:type="dxa"/>
+            </w:tcMar>
+          </w:tcPr>
+          <w:p>
+            <w:r>
+              <w:rPr>
+                <w:b/>
+                <w:color w:val="003366"/>
+                <w:sz w:val="15"/>
+              </w:rPr>
+              <w:t>Encapsulamiento</w:t>
+            </w:r>
+          </w:p>
+        </w:tc>
+        <w:tc>
+          <w:tcPr>
+            <w:tcW w:type="dxa" w:w="2448"/>
+            <w:shd w:fill="FFFFFF"/>
+            <w:tcMar>
+              <w:top w:w="30" w:type="dxa"/>
+              <w:bottom w:w="30" w:type="dxa"/>
+              <w:left w:w="50" w:type="dxa"/>
+              <w:right w:w="50" w:type="dxa"/>
+            </w:tcMar>
+          </w:tcPr>
+          <w:p>
+            <w:r>
+              <w:rPr>
+                <w:sz w:val="15"/>
+              </w:rPr>
+              <w:t>src/pipeline.py: mediana_, ric_, frecuentes_</w:t>
+              <w:br/>
+              <w:t>src/escaladores.py: centro_, escala_</w:t>
+            </w:r>
+          </w:p>
+        </w:tc>
+        <w:tc>
+          <w:tcPr>
+            <w:tcW w:type="dxa" w:w="2448"/>
+            <w:shd w:fill="FFFFFF"/>
+            <w:tcMar>
+              <w:top w:w="30" w:type="dxa"/>
+              <w:bottom w:w="30" w:type="dxa"/>
+              <w:left w:w="50" w:type="dxa"/>
+              <w:right w:w="50" w:type="dxa"/>
+            </w:tcMar>
+          </w:tcPr>
+          <w:p>
+            <w:r>
+              <w:rPr>
+                <w:sz w:val="15"/>
+              </w:rPr>
+              <w:t>Atributos protegidos con sufijo guion bajo. Inmutabilidad garantizada mediante df.copy() sin mutar el DataFrame recibido.</w:t>
+            </w:r>
+          </w:p>
+        </w:tc>
+        <w:tc>
+          <w:tcPr>
+            <w:tcW w:type="dxa" w:w="2448"/>
+            <w:shd w:fill="FFFFFF"/>
+            <w:tcMar>
+              <w:top w:w="30" w:type="dxa"/>
+              <w:bottom w:w="30" w:type="dxa"/>
+              <w:left w:w="50" w:type="dxa"/>
+              <w:right w:w="50" w:type="dxa"/>
+            </w:tcMar>
+          </w:tcPr>
+          <w:p>
+            <w:r>
+              <w:rPr>
+                <w:sz w:val="15"/>
+              </w:rPr>
+              <w:t>Erradica la fuga de información (data leakage); los parámetros persisten en la instancia y no se recalculan en inferencia.</w:t>
+            </w:r>
+          </w:p>
+        </w:tc>
+      </w:tr>
+      <w:tr>
+        <w:tc>
+          <w:tcPr>
+            <w:tcW w:type="dxa" w:w="2448"/>
+            <w:shd w:fill="F9FBFD"/>
+            <w:tcMar>
+              <w:top w:w="30" w:type="dxa"/>
+              <w:bottom w:w="30" w:type="dxa"/>
+              <w:left w:w="50" w:type="dxa"/>
+              <w:right w:w="50" w:type="dxa"/>
+            </w:tcMar>
+          </w:tcPr>
+          <w:p>
+            <w:r>
+              <w:rPr>
+                <w:b/>
+                <w:color w:val="003366"/>
+                <w:sz w:val="15"/>
+              </w:rPr>
+              <w:t>Herencia</w:t>
+            </w:r>
+          </w:p>
+        </w:tc>
+        <w:tc>
+          <w:tcPr>
+            <w:tcW w:type="dxa" w:w="2448"/>
+            <w:shd w:fill="F9FBFD"/>
+            <w:tcMar>
+              <w:top w:w="30" w:type="dxa"/>
+              <w:bottom w:w="30" w:type="dxa"/>
+              <w:left w:w="50" w:type="dxa"/>
+              <w:right w:w="50" w:type="dxa"/>
+            </w:tcMar>
+          </w:tcPr>
+          <w:p>
+            <w:r>
+              <w:rPr>
+                <w:sz w:val="15"/>
+              </w:rPr>
+              <w:t>src/pipeline.py: 8 subclases de Transformador</w:t>
+              <w:br/>
+              <w:t>src/escaladores.py: 3 subclases de Estrategia</w:t>
+            </w:r>
+          </w:p>
+        </w:tc>
+        <w:tc>
+          <w:tcPr>
+            <w:tcW w:type="dxa" w:w="2448"/>
+            <w:shd w:fill="F9FBFD"/>
+            <w:tcMar>
+              <w:top w:w="30" w:type="dxa"/>
+              <w:bottom w:w="30" w:type="dxa"/>
+              <w:left w:w="50" w:type="dxa"/>
+              <w:right w:w="50" w:type="dxa"/>
+            </w:tcMar>
+          </w:tcPr>
+          <w:p>
+            <w:r>
+              <w:rPr>
+                <w:sz w:val="15"/>
+              </w:rPr>
+              <w:t>Reutilización de lógica común (__init__, fit, cifras, profiling). EscaladorRobusto hereda de EscaladorPorEstrategia en 3 líneas.</w:t>
+            </w:r>
+          </w:p>
+        </w:tc>
+        <w:tc>
+          <w:tcPr>
+            <w:tcW w:type="dxa" w:w="2448"/>
+            <w:shd w:fill="F9FBFD"/>
+            <w:tcMar>
+              <w:top w:w="30" w:type="dxa"/>
+              <w:bottom w:w="30" w:type="dxa"/>
+              <w:left w:w="50" w:type="dxa"/>
+              <w:right w:w="50" w:type="dxa"/>
+            </w:tcMar>
+          </w:tcPr>
+          <w:p>
+            <w:r>
+              <w:rPr>
+                <w:sz w:val="15"/>
+              </w:rPr>
+              <w:t>Elimina duplicación de código (DRY) y asegura una jerarquía coherente donde cada clase especializa a su base.</w:t>
+            </w:r>
+          </w:p>
+        </w:tc>
+      </w:tr>
+      <w:tr>
+        <w:tc>
+          <w:tcPr>
+            <w:tcW w:type="dxa" w:w="2448"/>
+            <w:shd w:fill="FFFFFF"/>
+            <w:tcMar>
+              <w:top w:w="30" w:type="dxa"/>
+              <w:bottom w:w="30" w:type="dxa"/>
+              <w:left w:w="50" w:type="dxa"/>
+              <w:right w:w="50" w:type="dxa"/>
+            </w:tcMar>
+          </w:tcPr>
+          <w:p>
+            <w:r>
+              <w:rPr>
+                <w:b/>
+                <w:color w:val="003366"/>
+                <w:sz w:val="15"/>
+              </w:rPr>
+              <w:t>Polimorfismo</w:t>
+            </w:r>
+          </w:p>
+        </w:tc>
+        <w:tc>
+          <w:tcPr>
+            <w:tcW w:type="dxa" w:w="2448"/>
+            <w:shd w:fill="FFFFFF"/>
+            <w:tcMar>
+              <w:top w:w="30" w:type="dxa"/>
+              <w:bottom w:w="30" w:type="dxa"/>
+              <w:left w:w="50" w:type="dxa"/>
+              <w:right w:w="50" w:type="dxa"/>
+            </w:tcMar>
+          </w:tcPr>
+          <w:p>
+            <w:r>
+              <w:rPr>
+                <w:sz w:val="15"/>
+              </w:rPr>
+              <w:t>src/pipeline.py: Pipeline.apply()</w:t>
+              <w:br/>
+              <w:t>src/escaladores.py: Escalador.aplicar()</w:t>
+            </w:r>
+          </w:p>
+        </w:tc>
+        <w:tc>
+          <w:tcPr>
+            <w:tcW w:type="dxa" w:w="2448"/>
+            <w:shd w:fill="FFFFFF"/>
+            <w:tcMar>
+              <w:top w:w="30" w:type="dxa"/>
+              <w:bottom w:w="30" w:type="dxa"/>
+              <w:left w:w="50" w:type="dxa"/>
+              <w:right w:w="50" w:type="dxa"/>
+            </w:tcMar>
+          </w:tcPr>
+          <w:p>
+            <w:r>
+              <w:rPr>
+                <w:sz w:val="15"/>
+              </w:rPr>
+              <w:t>Pipeline ejecuta etapa.apply(df) y Escalador invoca self.estrategia.aplicar(s) de manera polimórfica en tiempo de ejecución.</w:t>
+            </w:r>
+          </w:p>
+        </w:tc>
+        <w:tc>
+          <w:tcPr>
+            <w:tcW w:type="dxa" w:w="2448"/>
+            <w:shd w:fill="FFFFFF"/>
+            <w:tcMar>
+              <w:top w:w="30" w:type="dxa"/>
+              <w:bottom w:w="30" w:type="dxa"/>
+              <w:left w:w="50" w:type="dxa"/>
+              <w:right w:w="50" w:type="dxa"/>
+            </w:tcMar>
+          </w:tcPr>
+          <w:p>
+            <w:r>
+              <w:rPr>
+                <w:sz w:val="15"/>
+              </w:rPr>
+              <w:t>Desacoplamiento total; el flujo no requiere condicionales if/isinstance para diferenciar etapas o tipos de escalado.</w:t>
+            </w:r>
+          </w:p>
+        </w:tc>
+      </w:tr>
+    </w:tbl>
+    <w:p>
+      <w:pPr>
+        <w:spacing w:after="40"/>
+      </w:pPr>
     </w:p>
     <w:p>
       <w:pPr>
@@ -2038,7 +2550,1004 @@
           <w:color w:val="114477"/>
           <w:sz w:val="21"/>
         </w:rPr>
-        <w:t>3.2 Documentación de arquitectura y aceleración vectorizada</w:t>
+        <w:t>3.2 Patrón de diseño Strategy para escalamiento modular</w:t>
+      </w:r>
+    </w:p>
+    <w:p>
+      <w:r>
+        <w:t>En estricta conformidad con el criterio de patrones de diseño de software de la rúbrica, se implementó el patrón de comportamiento Strategy (GoF) en src/escaladores.py e integrado al flujo principal en src/pipeline.py, satisfaciendo los seis requisitos arquitectónicos:</w:t>
+      </w:r>
+    </w:p>
+    <w:p>
+      <w:r>
+        <w:t>1. Identificación y justificación del problema: En la Fase 2, el escalamiento consistía en funciones sueltas donde el código de ejecución acoplaba la selección de columnas con la fórmula matemática elegida. Comparar alternativas o incorporar nuevos métodos obligaba a bifurcaciones condicionales y duplicación de código.</w:t>
+        <w:br/>
+        <w:t>2. Interfaz abstracta común: Se implementó la clase base EstrategiaEscalado, definiendo los métodos contractuales obligatorios ajustar(s), aplicar(s), ajustar_aplicar(s), parametros() y verificar(escalada).</w:t>
+        <w:br/>
+        <w:t>3. Familia de algoritmos intercambiables: Se crearon tres estrategias concretas: EstandarizacionZ (media 0, desviación 1), NormalizacionMinMax (rango [0, 1]) y EscaladoRobusto (mediana 0, RIC 1), declarando formalmente la propiedad estadística que garantizan.</w:t>
+        <w:br/>
+        <w:t>4. Contexto desacoplado: La clase Escalador y el transformador EscaladorPorEstrategia consumen la estrategia por composición. No contienen ninguna fórmula matemática ni condicionales if/elif según el tipo de escalador, delegando ciegamente la ejecución en tiempo de ejecución.</w:t>
+        <w:br/>
+        <w:t>5. Principio Abierto/Cerrado (OCP): La arquitectura queda abierta a la extensión y cerrada a la modificación. Incorporar una nueva estrategia (ej. escalado por cuantiles o logarítmico) solo requiere crear una subclase de EstrategiaEscalado, sin alterar una sola línea del contexto ni del pipeline. Se incluye la fábrica crear_estrategia(nombre) vinculada al registro central ESTRATEGIAS.</w:t>
+        <w:br/>
+        <w:t>6. Evaluación empírica comparativa: Mediante comparar_estrategias(), se recorren las alternativas sobre la variable de respuesta dur_total_carr (N = 105.060), fundamentando con datos la elección del escalador robusto ante el 9,4% de observaciones atípicas:</w:t>
+      </w:r>
+    </w:p>
+    <w:tbl>
+      <w:tblPr>
+        <w:tblW w:type="auto" w:w="0"/>
+        <w:jc w:val="center"/>
+        <w:tblLook w:firstColumn="1" w:firstRow="1" w:lastColumn="0" w:lastRow="0" w:noHBand="0" w:noVBand="1" w:val="04A0"/>
+      </w:tblPr>
+      <w:tblGrid>
+        <w:gridCol w:w="1088"/>
+        <w:gridCol w:w="1088"/>
+        <w:gridCol w:w="1088"/>
+        <w:gridCol w:w="1088"/>
+        <w:gridCol w:w="1088"/>
+        <w:gridCol w:w="1088"/>
+        <w:gridCol w:w="1088"/>
+        <w:gridCol w:w="1088"/>
+        <w:gridCol w:w="1088"/>
+      </w:tblGrid>
+      <w:tr>
+        <w:tc>
+          <w:tcPr>
+            <w:tcW w:type="dxa" w:w="1088"/>
+            <w:shd w:fill="003366"/>
+            <w:tcMar>
+              <w:top w:w="30" w:type="dxa"/>
+              <w:bottom w:w="30" w:type="dxa"/>
+              <w:left w:w="40" w:type="dxa"/>
+              <w:right w:w="40" w:type="dxa"/>
+            </w:tcMar>
+          </w:tcPr>
+          <w:p>
+            <w:r>
+              <w:rPr>
+                <w:b/>
+                <w:color w:val="FFFFFF"/>
+                <w:sz w:val="15"/>
+              </w:rPr>
+              <w:t>Estrategia</w:t>
+            </w:r>
+          </w:p>
+        </w:tc>
+        <w:tc>
+          <w:tcPr>
+            <w:tcW w:type="dxa" w:w="1088"/>
+            <w:shd w:fill="003366"/>
+            <w:tcMar>
+              <w:top w:w="30" w:type="dxa"/>
+              <w:bottom w:w="30" w:type="dxa"/>
+              <w:left w:w="40" w:type="dxa"/>
+              <w:right w:w="40" w:type="dxa"/>
+            </w:tcMar>
+          </w:tcPr>
+          <w:p>
+            <w:r>
+              <w:rPr>
+                <w:b/>
+                <w:color w:val="FFFFFF"/>
+                <w:sz w:val="15"/>
+              </w:rPr>
+              <w:t>Propiedad Prometida</w:t>
+            </w:r>
+          </w:p>
+        </w:tc>
+        <w:tc>
+          <w:tcPr>
+            <w:tcW w:type="dxa" w:w="1088"/>
+            <w:shd w:fill="003366"/>
+            <w:tcMar>
+              <w:top w:w="30" w:type="dxa"/>
+              <w:bottom w:w="30" w:type="dxa"/>
+              <w:left w:w="40" w:type="dxa"/>
+              <w:right w:w="40" w:type="dxa"/>
+            </w:tcMar>
+          </w:tcPr>
+          <w:p>
+            <w:r>
+              <w:rPr>
+                <w:b/>
+                <w:color w:val="FFFFFF"/>
+                <w:sz w:val="15"/>
+              </w:rPr>
+              <w:t>Media</w:t>
+            </w:r>
+          </w:p>
+        </w:tc>
+        <w:tc>
+          <w:tcPr>
+            <w:tcW w:type="dxa" w:w="1088"/>
+            <w:shd w:fill="003366"/>
+            <w:tcMar>
+              <w:top w:w="30" w:type="dxa"/>
+              <w:bottom w:w="30" w:type="dxa"/>
+              <w:left w:w="40" w:type="dxa"/>
+              <w:right w:w="40" w:type="dxa"/>
+            </w:tcMar>
+          </w:tcPr>
+          <w:p>
+            <w:r>
+              <w:rPr>
+                <w:b/>
+                <w:color w:val="FFFFFF"/>
+                <w:sz w:val="15"/>
+              </w:rPr>
+              <w:t>Desv.</w:t>
+            </w:r>
+          </w:p>
+        </w:tc>
+        <w:tc>
+          <w:tcPr>
+            <w:tcW w:type="dxa" w:w="1088"/>
+            <w:shd w:fill="003366"/>
+            <w:tcMar>
+              <w:top w:w="30" w:type="dxa"/>
+              <w:bottom w:w="30" w:type="dxa"/>
+              <w:left w:w="40" w:type="dxa"/>
+              <w:right w:w="40" w:type="dxa"/>
+            </w:tcMar>
+          </w:tcPr>
+          <w:p>
+            <w:r>
+              <w:rPr>
+                <w:b/>
+                <w:color w:val="FFFFFF"/>
+                <w:sz w:val="15"/>
+              </w:rPr>
+              <w:t>Mediana</w:t>
+            </w:r>
+          </w:p>
+        </w:tc>
+        <w:tc>
+          <w:tcPr>
+            <w:tcW w:type="dxa" w:w="1088"/>
+            <w:shd w:fill="003366"/>
+            <w:tcMar>
+              <w:top w:w="30" w:type="dxa"/>
+              <w:bottom w:w="30" w:type="dxa"/>
+              <w:left w:w="40" w:type="dxa"/>
+              <w:right w:w="40" w:type="dxa"/>
+            </w:tcMar>
+          </w:tcPr>
+          <w:p>
+            <w:r>
+              <w:rPr>
+                <w:b/>
+                <w:color w:val="FFFFFF"/>
+                <w:sz w:val="15"/>
+              </w:rPr>
+              <w:t>RIC</w:t>
+            </w:r>
+          </w:p>
+        </w:tc>
+        <w:tc>
+          <w:tcPr>
+            <w:tcW w:type="dxa" w:w="1088"/>
+            <w:shd w:fill="003366"/>
+            <w:tcMar>
+              <w:top w:w="30" w:type="dxa"/>
+              <w:bottom w:w="30" w:type="dxa"/>
+              <w:left w:w="40" w:type="dxa"/>
+              <w:right w:w="40" w:type="dxa"/>
+            </w:tcMar>
+          </w:tcPr>
+          <w:p>
+            <w:r>
+              <w:rPr>
+                <w:b/>
+                <w:color w:val="FFFFFF"/>
+                <w:sz w:val="15"/>
+              </w:rPr>
+              <w:t>Mín.</w:t>
+            </w:r>
+          </w:p>
+        </w:tc>
+        <w:tc>
+          <w:tcPr>
+            <w:tcW w:type="dxa" w:w="1088"/>
+            <w:shd w:fill="003366"/>
+            <w:tcMar>
+              <w:top w:w="30" w:type="dxa"/>
+              <w:bottom w:w="30" w:type="dxa"/>
+              <w:left w:w="40" w:type="dxa"/>
+              <w:right w:w="40" w:type="dxa"/>
+            </w:tcMar>
+          </w:tcPr>
+          <w:p>
+            <w:r>
+              <w:rPr>
+                <w:b/>
+                <w:color w:val="FFFFFF"/>
+                <w:sz w:val="15"/>
+              </w:rPr>
+              <w:t>Máx.</w:t>
+            </w:r>
+          </w:p>
+        </w:tc>
+        <w:tc>
+          <w:tcPr>
+            <w:tcW w:type="dxa" w:w="1088"/>
+            <w:shd w:fill="003366"/>
+            <w:tcMar>
+              <w:top w:w="30" w:type="dxa"/>
+              <w:bottom w:w="30" w:type="dxa"/>
+              <w:left w:w="40" w:type="dxa"/>
+              <w:right w:w="40" w:type="dxa"/>
+            </w:tcMar>
+          </w:tcPr>
+          <w:p>
+            <w:r>
+              <w:rPr>
+                <w:b/>
+                <w:color w:val="FFFFFF"/>
+                <w:sz w:val="15"/>
+              </w:rPr>
+              <w:t>¿Verifica?</w:t>
+            </w:r>
+          </w:p>
+        </w:tc>
+      </w:tr>
+      <w:tr>
+        <w:tc>
+          <w:tcPr>
+            <w:tcW w:type="dxa" w:w="1088"/>
+            <w:shd w:fill="F9FBFD"/>
+            <w:tcMar>
+              <w:top w:w="25" w:type="dxa"/>
+              <w:bottom w:w="25" w:type="dxa"/>
+              <w:left w:w="40" w:type="dxa"/>
+              <w:right w:w="40" w:type="dxa"/>
+            </w:tcMar>
+          </w:tcPr>
+          <w:p>
+            <w:r>
+              <w:rPr>
+                <w:b/>
+                <w:sz w:val="15"/>
+              </w:rPr>
+              <w:t>Original</w:t>
+            </w:r>
+          </w:p>
+        </w:tc>
+        <w:tc>
+          <w:tcPr>
+            <w:tcW w:type="dxa" w:w="1088"/>
+            <w:shd w:fill="F9FBFD"/>
+            <w:tcMar>
+              <w:top w:w="25" w:type="dxa"/>
+              <w:bottom w:w="25" w:type="dxa"/>
+              <w:left w:w="40" w:type="dxa"/>
+              <w:right w:w="40" w:type="dxa"/>
+            </w:tcMar>
+          </w:tcPr>
+          <w:p>
+            <w:r>
+              <w:rPr>
+                <w:sz w:val="15"/>
+              </w:rPr>
+              <w:t>Distribución cruda SIES</w:t>
+            </w:r>
+          </w:p>
+        </w:tc>
+        <w:tc>
+          <w:tcPr>
+            <w:tcW w:type="dxa" w:w="1088"/>
+            <w:shd w:fill="F9FBFD"/>
+            <w:tcMar>
+              <w:top w:w="25" w:type="dxa"/>
+              <w:bottom w:w="25" w:type="dxa"/>
+              <w:left w:w="40" w:type="dxa"/>
+              <w:right w:w="40" w:type="dxa"/>
+            </w:tcMar>
+          </w:tcPr>
+          <w:p>
+            <w:r>
+              <w:rPr>
+                <w:sz w:val="15"/>
+              </w:rPr>
+              <w:t>9,0739</w:t>
+            </w:r>
+          </w:p>
+        </w:tc>
+        <w:tc>
+          <w:tcPr>
+            <w:tcW w:type="dxa" w:w="1088"/>
+            <w:shd w:fill="F9FBFD"/>
+            <w:tcMar>
+              <w:top w:w="25" w:type="dxa"/>
+              <w:bottom w:w="25" w:type="dxa"/>
+              <w:left w:w="40" w:type="dxa"/>
+              <w:right w:w="40" w:type="dxa"/>
+            </w:tcMar>
+          </w:tcPr>
+          <w:p>
+            <w:r>
+              <w:rPr>
+                <w:sz w:val="15"/>
+              </w:rPr>
+              <w:t>2,4403</w:t>
+            </w:r>
+          </w:p>
+        </w:tc>
+        <w:tc>
+          <w:tcPr>
+            <w:tcW w:type="dxa" w:w="1088"/>
+            <w:shd w:fill="F9FBFD"/>
+            <w:tcMar>
+              <w:top w:w="25" w:type="dxa"/>
+              <w:bottom w:w="25" w:type="dxa"/>
+              <w:left w:w="40" w:type="dxa"/>
+              <w:right w:w="40" w:type="dxa"/>
+            </w:tcMar>
+          </w:tcPr>
+          <w:p>
+            <w:r>
+              <w:rPr>
+                <w:sz w:val="15"/>
+              </w:rPr>
+              <w:t>10,0000</w:t>
+            </w:r>
+          </w:p>
+        </w:tc>
+        <w:tc>
+          <w:tcPr>
+            <w:tcW w:type="dxa" w:w="1088"/>
+            <w:shd w:fill="F9FBFD"/>
+            <w:tcMar>
+              <w:top w:w="25" w:type="dxa"/>
+              <w:bottom w:w="25" w:type="dxa"/>
+              <w:left w:w="40" w:type="dxa"/>
+              <w:right w:w="40" w:type="dxa"/>
+            </w:tcMar>
+          </w:tcPr>
+          <w:p>
+            <w:r>
+              <w:rPr>
+                <w:sz w:val="15"/>
+              </w:rPr>
+              <w:t>2,0000</w:t>
+            </w:r>
+          </w:p>
+        </w:tc>
+        <w:tc>
+          <w:tcPr>
+            <w:tcW w:type="dxa" w:w="1088"/>
+            <w:shd w:fill="F9FBFD"/>
+            <w:tcMar>
+              <w:top w:w="25" w:type="dxa"/>
+              <w:bottom w:w="25" w:type="dxa"/>
+              <w:left w:w="40" w:type="dxa"/>
+              <w:right w:w="40" w:type="dxa"/>
+            </w:tcMar>
+          </w:tcPr>
+          <w:p>
+            <w:r>
+              <w:rPr>
+                <w:sz w:val="15"/>
+              </w:rPr>
+              <w:t>1,0000</w:t>
+            </w:r>
+          </w:p>
+        </w:tc>
+        <w:tc>
+          <w:tcPr>
+            <w:tcW w:type="dxa" w:w="1088"/>
+            <w:shd w:fill="F9FBFD"/>
+            <w:tcMar>
+              <w:top w:w="25" w:type="dxa"/>
+              <w:bottom w:w="25" w:type="dxa"/>
+              <w:left w:w="40" w:type="dxa"/>
+              <w:right w:w="40" w:type="dxa"/>
+            </w:tcMar>
+          </w:tcPr>
+          <w:p>
+            <w:r>
+              <w:rPr>
+                <w:sz w:val="15"/>
+              </w:rPr>
+              <w:t>24,0000</w:t>
+            </w:r>
+          </w:p>
+        </w:tc>
+        <w:tc>
+          <w:tcPr>
+            <w:tcW w:type="dxa" w:w="1088"/>
+            <w:shd w:fill="F9FBFD"/>
+            <w:tcMar>
+              <w:top w:w="25" w:type="dxa"/>
+              <w:bottom w:w="25" w:type="dxa"/>
+              <w:left w:w="40" w:type="dxa"/>
+              <w:right w:w="40" w:type="dxa"/>
+            </w:tcMar>
+          </w:tcPr>
+          <w:p>
+            <w:r>
+              <w:rPr>
+                <w:b/>
+                <w:color w:val="006600"/>
+                <w:sz w:val="15"/>
+              </w:rPr>
+              <w:t>True</w:t>
+            </w:r>
+          </w:p>
+        </w:tc>
+      </w:tr>
+      <w:tr>
+        <w:tc>
+          <w:tcPr>
+            <w:tcW w:type="dxa" w:w="1088"/>
+            <w:shd w:fill="FFFFFF"/>
+            <w:tcMar>
+              <w:top w:w="25" w:type="dxa"/>
+              <w:bottom w:w="25" w:type="dxa"/>
+              <w:left w:w="40" w:type="dxa"/>
+              <w:right w:w="40" w:type="dxa"/>
+            </w:tcMar>
+          </w:tcPr>
+          <w:p>
+            <w:r>
+              <w:rPr>
+                <w:b/>
+                <w:sz w:val="15"/>
+              </w:rPr>
+              <w:t>Estandar (Z)</w:t>
+            </w:r>
+          </w:p>
+        </w:tc>
+        <w:tc>
+          <w:tcPr>
+            <w:tcW w:type="dxa" w:w="1088"/>
+            <w:shd w:fill="FFFFFF"/>
+            <w:tcMar>
+              <w:top w:w="25" w:type="dxa"/>
+              <w:bottom w:w="25" w:type="dxa"/>
+              <w:left w:w="40" w:type="dxa"/>
+              <w:right w:w="40" w:type="dxa"/>
+            </w:tcMar>
+          </w:tcPr>
+          <w:p>
+            <w:r>
+              <w:rPr>
+                <w:sz w:val="15"/>
+              </w:rPr>
+              <w:t>media 0 y desviación 1</w:t>
+            </w:r>
+          </w:p>
+        </w:tc>
+        <w:tc>
+          <w:tcPr>
+            <w:tcW w:type="dxa" w:w="1088"/>
+            <w:shd w:fill="FFFFFF"/>
+            <w:tcMar>
+              <w:top w:w="25" w:type="dxa"/>
+              <w:bottom w:w="25" w:type="dxa"/>
+              <w:left w:w="40" w:type="dxa"/>
+              <w:right w:w="40" w:type="dxa"/>
+            </w:tcMar>
+          </w:tcPr>
+          <w:p>
+            <w:r>
+              <w:rPr>
+                <w:sz w:val="15"/>
+              </w:rPr>
+              <w:t>-0,0000</w:t>
+            </w:r>
+          </w:p>
+        </w:tc>
+        <w:tc>
+          <w:tcPr>
+            <w:tcW w:type="dxa" w:w="1088"/>
+            <w:shd w:fill="FFFFFF"/>
+            <w:tcMar>
+              <w:top w:w="25" w:type="dxa"/>
+              <w:bottom w:w="25" w:type="dxa"/>
+              <w:left w:w="40" w:type="dxa"/>
+              <w:right w:w="40" w:type="dxa"/>
+            </w:tcMar>
+          </w:tcPr>
+          <w:p>
+            <w:r>
+              <w:rPr>
+                <w:sz w:val="15"/>
+              </w:rPr>
+              <w:t>1,0000</w:t>
+            </w:r>
+          </w:p>
+        </w:tc>
+        <w:tc>
+          <w:tcPr>
+            <w:tcW w:type="dxa" w:w="1088"/>
+            <w:shd w:fill="FFFFFF"/>
+            <w:tcMar>
+              <w:top w:w="25" w:type="dxa"/>
+              <w:bottom w:w="25" w:type="dxa"/>
+              <w:left w:w="40" w:type="dxa"/>
+              <w:right w:w="40" w:type="dxa"/>
+            </w:tcMar>
+          </w:tcPr>
+          <w:p>
+            <w:r>
+              <w:rPr>
+                <w:sz w:val="15"/>
+              </w:rPr>
+              <w:t>0,3795</w:t>
+            </w:r>
+          </w:p>
+        </w:tc>
+        <w:tc>
+          <w:tcPr>
+            <w:tcW w:type="dxa" w:w="1088"/>
+            <w:shd w:fill="FFFFFF"/>
+            <w:tcMar>
+              <w:top w:w="25" w:type="dxa"/>
+              <w:bottom w:w="25" w:type="dxa"/>
+              <w:left w:w="40" w:type="dxa"/>
+              <w:right w:w="40" w:type="dxa"/>
+            </w:tcMar>
+          </w:tcPr>
+          <w:p>
+            <w:r>
+              <w:rPr>
+                <w:sz w:val="15"/>
+              </w:rPr>
+              <w:t>0,8196</w:t>
+            </w:r>
+          </w:p>
+        </w:tc>
+        <w:tc>
+          <w:tcPr>
+            <w:tcW w:type="dxa" w:w="1088"/>
+            <w:shd w:fill="FFFFFF"/>
+            <w:tcMar>
+              <w:top w:w="25" w:type="dxa"/>
+              <w:bottom w:w="25" w:type="dxa"/>
+              <w:left w:w="40" w:type="dxa"/>
+              <w:right w:w="40" w:type="dxa"/>
+            </w:tcMar>
+          </w:tcPr>
+          <w:p>
+            <w:r>
+              <w:rPr>
+                <w:sz w:val="15"/>
+              </w:rPr>
+              <w:t>-3,3085</w:t>
+            </w:r>
+          </w:p>
+        </w:tc>
+        <w:tc>
+          <w:tcPr>
+            <w:tcW w:type="dxa" w:w="1088"/>
+            <w:shd w:fill="FFFFFF"/>
+            <w:tcMar>
+              <w:top w:w="25" w:type="dxa"/>
+              <w:bottom w:w="25" w:type="dxa"/>
+              <w:left w:w="40" w:type="dxa"/>
+              <w:right w:w="40" w:type="dxa"/>
+            </w:tcMar>
+          </w:tcPr>
+          <w:p>
+            <w:r>
+              <w:rPr>
+                <w:sz w:val="15"/>
+              </w:rPr>
+              <w:t>6,1164</w:t>
+            </w:r>
+          </w:p>
+        </w:tc>
+        <w:tc>
+          <w:tcPr>
+            <w:tcW w:type="dxa" w:w="1088"/>
+            <w:shd w:fill="FFFFFF"/>
+            <w:tcMar>
+              <w:top w:w="25" w:type="dxa"/>
+              <w:bottom w:w="25" w:type="dxa"/>
+              <w:left w:w="40" w:type="dxa"/>
+              <w:right w:w="40" w:type="dxa"/>
+            </w:tcMar>
+          </w:tcPr>
+          <w:p>
+            <w:r>
+              <w:rPr>
+                <w:b/>
+                <w:color w:val="006600"/>
+                <w:sz w:val="15"/>
+              </w:rPr>
+              <w:t>True</w:t>
+            </w:r>
+          </w:p>
+        </w:tc>
+      </w:tr>
+      <w:tr>
+        <w:tc>
+          <w:tcPr>
+            <w:tcW w:type="dxa" w:w="1088"/>
+            <w:shd w:fill="F9FBFD"/>
+            <w:tcMar>
+              <w:top w:w="25" w:type="dxa"/>
+              <w:bottom w:w="25" w:type="dxa"/>
+              <w:left w:w="40" w:type="dxa"/>
+              <w:right w:w="40" w:type="dxa"/>
+            </w:tcMar>
+          </w:tcPr>
+          <w:p>
+            <w:r>
+              <w:rPr>
+                <w:b/>
+                <w:sz w:val="15"/>
+              </w:rPr>
+              <w:t>MinMax</w:t>
+            </w:r>
+          </w:p>
+        </w:tc>
+        <w:tc>
+          <w:tcPr>
+            <w:tcW w:type="dxa" w:w="1088"/>
+            <w:shd w:fill="F9FBFD"/>
+            <w:tcMar>
+              <w:top w:w="25" w:type="dxa"/>
+              <w:bottom w:w="25" w:type="dxa"/>
+              <w:left w:w="40" w:type="dxa"/>
+              <w:right w:w="40" w:type="dxa"/>
+            </w:tcMar>
+          </w:tcPr>
+          <w:p>
+            <w:r>
+              <w:rPr>
+                <w:sz w:val="15"/>
+              </w:rPr>
+              <w:t>mínimo 0 y máximo 1</w:t>
+            </w:r>
+          </w:p>
+        </w:tc>
+        <w:tc>
+          <w:tcPr>
+            <w:tcW w:type="dxa" w:w="1088"/>
+            <w:shd w:fill="F9FBFD"/>
+            <w:tcMar>
+              <w:top w:w="25" w:type="dxa"/>
+              <w:bottom w:w="25" w:type="dxa"/>
+              <w:left w:w="40" w:type="dxa"/>
+              <w:right w:w="40" w:type="dxa"/>
+            </w:tcMar>
+          </w:tcPr>
+          <w:p>
+            <w:r>
+              <w:rPr>
+                <w:sz w:val="15"/>
+              </w:rPr>
+              <w:t>0,3510</w:t>
+            </w:r>
+          </w:p>
+        </w:tc>
+        <w:tc>
+          <w:tcPr>
+            <w:tcW w:type="dxa" w:w="1088"/>
+            <w:shd w:fill="F9FBFD"/>
+            <w:tcMar>
+              <w:top w:w="25" w:type="dxa"/>
+              <w:bottom w:w="25" w:type="dxa"/>
+              <w:left w:w="40" w:type="dxa"/>
+              <w:right w:w="40" w:type="dxa"/>
+            </w:tcMar>
+          </w:tcPr>
+          <w:p>
+            <w:r>
+              <w:rPr>
+                <w:sz w:val="15"/>
+              </w:rPr>
+              <w:t>0,1061</w:t>
+            </w:r>
+          </w:p>
+        </w:tc>
+        <w:tc>
+          <w:tcPr>
+            <w:tcW w:type="dxa" w:w="1088"/>
+            <w:shd w:fill="F9FBFD"/>
+            <w:tcMar>
+              <w:top w:w="25" w:type="dxa"/>
+              <w:bottom w:w="25" w:type="dxa"/>
+              <w:left w:w="40" w:type="dxa"/>
+              <w:right w:w="40" w:type="dxa"/>
+            </w:tcMar>
+          </w:tcPr>
+          <w:p>
+            <w:r>
+              <w:rPr>
+                <w:sz w:val="15"/>
+              </w:rPr>
+              <w:t>0,3913</w:t>
+            </w:r>
+          </w:p>
+        </w:tc>
+        <w:tc>
+          <w:tcPr>
+            <w:tcW w:type="dxa" w:w="1088"/>
+            <w:shd w:fill="F9FBFD"/>
+            <w:tcMar>
+              <w:top w:w="25" w:type="dxa"/>
+              <w:bottom w:w="25" w:type="dxa"/>
+              <w:left w:w="40" w:type="dxa"/>
+              <w:right w:w="40" w:type="dxa"/>
+            </w:tcMar>
+          </w:tcPr>
+          <w:p>
+            <w:r>
+              <w:rPr>
+                <w:sz w:val="15"/>
+              </w:rPr>
+              <w:t>0,0870</w:t>
+            </w:r>
+          </w:p>
+        </w:tc>
+        <w:tc>
+          <w:tcPr>
+            <w:tcW w:type="dxa" w:w="1088"/>
+            <w:shd w:fill="F9FBFD"/>
+            <w:tcMar>
+              <w:top w:w="25" w:type="dxa"/>
+              <w:bottom w:w="25" w:type="dxa"/>
+              <w:left w:w="40" w:type="dxa"/>
+              <w:right w:w="40" w:type="dxa"/>
+            </w:tcMar>
+          </w:tcPr>
+          <w:p>
+            <w:r>
+              <w:rPr>
+                <w:sz w:val="15"/>
+              </w:rPr>
+              <w:t>0,0000</w:t>
+            </w:r>
+          </w:p>
+        </w:tc>
+        <w:tc>
+          <w:tcPr>
+            <w:tcW w:type="dxa" w:w="1088"/>
+            <w:shd w:fill="F9FBFD"/>
+            <w:tcMar>
+              <w:top w:w="25" w:type="dxa"/>
+              <w:bottom w:w="25" w:type="dxa"/>
+              <w:left w:w="40" w:type="dxa"/>
+              <w:right w:w="40" w:type="dxa"/>
+            </w:tcMar>
+          </w:tcPr>
+          <w:p>
+            <w:r>
+              <w:rPr>
+                <w:sz w:val="15"/>
+              </w:rPr>
+              <w:t>1,0000</w:t>
+            </w:r>
+          </w:p>
+        </w:tc>
+        <w:tc>
+          <w:tcPr>
+            <w:tcW w:type="dxa" w:w="1088"/>
+            <w:shd w:fill="F9FBFD"/>
+            <w:tcMar>
+              <w:top w:w="25" w:type="dxa"/>
+              <w:bottom w:w="25" w:type="dxa"/>
+              <w:left w:w="40" w:type="dxa"/>
+              <w:right w:w="40" w:type="dxa"/>
+            </w:tcMar>
+          </w:tcPr>
+          <w:p>
+            <w:r>
+              <w:rPr>
+                <w:b/>
+                <w:color w:val="006600"/>
+                <w:sz w:val="15"/>
+              </w:rPr>
+              <w:t>True</w:t>
+            </w:r>
+          </w:p>
+        </w:tc>
+      </w:tr>
+      <w:tr>
+        <w:tc>
+          <w:tcPr>
+            <w:tcW w:type="dxa" w:w="1088"/>
+            <w:shd w:fill="FFFFFF"/>
+            <w:tcMar>
+              <w:top w:w="25" w:type="dxa"/>
+              <w:bottom w:w="25" w:type="dxa"/>
+              <w:left w:w="40" w:type="dxa"/>
+              <w:right w:w="40" w:type="dxa"/>
+            </w:tcMar>
+          </w:tcPr>
+          <w:p>
+            <w:r>
+              <w:rPr>
+                <w:b/>
+                <w:sz w:val="15"/>
+              </w:rPr>
+              <w:t>Robusto</w:t>
+            </w:r>
+          </w:p>
+        </w:tc>
+        <w:tc>
+          <w:tcPr>
+            <w:tcW w:type="dxa" w:w="1088"/>
+            <w:shd w:fill="FFFFFF"/>
+            <w:tcMar>
+              <w:top w:w="25" w:type="dxa"/>
+              <w:bottom w:w="25" w:type="dxa"/>
+              <w:left w:w="40" w:type="dxa"/>
+              <w:right w:w="40" w:type="dxa"/>
+            </w:tcMar>
+          </w:tcPr>
+          <w:p>
+            <w:r>
+              <w:rPr>
+                <w:sz w:val="15"/>
+              </w:rPr>
+              <w:t>mediana 0 y RIC 1</w:t>
+            </w:r>
+          </w:p>
+        </w:tc>
+        <w:tc>
+          <w:tcPr>
+            <w:tcW w:type="dxa" w:w="1088"/>
+            <w:shd w:fill="FFFFFF"/>
+            <w:tcMar>
+              <w:top w:w="25" w:type="dxa"/>
+              <w:bottom w:w="25" w:type="dxa"/>
+              <w:left w:w="40" w:type="dxa"/>
+              <w:right w:w="40" w:type="dxa"/>
+            </w:tcMar>
+          </w:tcPr>
+          <w:p>
+            <w:r>
+              <w:rPr>
+                <w:sz w:val="15"/>
+              </w:rPr>
+              <w:t>-0,4631</w:t>
+            </w:r>
+          </w:p>
+        </w:tc>
+        <w:tc>
+          <w:tcPr>
+            <w:tcW w:type="dxa" w:w="1088"/>
+            <w:shd w:fill="FFFFFF"/>
+            <w:tcMar>
+              <w:top w:w="25" w:type="dxa"/>
+              <w:bottom w:w="25" w:type="dxa"/>
+              <w:left w:w="40" w:type="dxa"/>
+              <w:right w:w="40" w:type="dxa"/>
+            </w:tcMar>
+          </w:tcPr>
+          <w:p>
+            <w:r>
+              <w:rPr>
+                <w:sz w:val="15"/>
+              </w:rPr>
+              <w:t>1,2202</w:t>
+            </w:r>
+          </w:p>
+        </w:tc>
+        <w:tc>
+          <w:tcPr>
+            <w:tcW w:type="dxa" w:w="1088"/>
+            <w:shd w:fill="FFFFFF"/>
+            <w:tcMar>
+              <w:top w:w="25" w:type="dxa"/>
+              <w:bottom w:w="25" w:type="dxa"/>
+              <w:left w:w="40" w:type="dxa"/>
+              <w:right w:w="40" w:type="dxa"/>
+            </w:tcMar>
+          </w:tcPr>
+          <w:p>
+            <w:r>
+              <w:rPr>
+                <w:sz w:val="15"/>
+              </w:rPr>
+              <w:t>0,0000</w:t>
+            </w:r>
+          </w:p>
+        </w:tc>
+        <w:tc>
+          <w:tcPr>
+            <w:tcW w:type="dxa" w:w="1088"/>
+            <w:shd w:fill="FFFFFF"/>
+            <w:tcMar>
+              <w:top w:w="25" w:type="dxa"/>
+              <w:bottom w:w="25" w:type="dxa"/>
+              <w:left w:w="40" w:type="dxa"/>
+              <w:right w:w="40" w:type="dxa"/>
+            </w:tcMar>
+          </w:tcPr>
+          <w:p>
+            <w:r>
+              <w:rPr>
+                <w:sz w:val="15"/>
+              </w:rPr>
+              <w:t>1,0000</w:t>
+            </w:r>
+          </w:p>
+        </w:tc>
+        <w:tc>
+          <w:tcPr>
+            <w:tcW w:type="dxa" w:w="1088"/>
+            <w:shd w:fill="FFFFFF"/>
+            <w:tcMar>
+              <w:top w:w="25" w:type="dxa"/>
+              <w:bottom w:w="25" w:type="dxa"/>
+              <w:left w:w="40" w:type="dxa"/>
+              <w:right w:w="40" w:type="dxa"/>
+            </w:tcMar>
+          </w:tcPr>
+          <w:p>
+            <w:r>
+              <w:rPr>
+                <w:sz w:val="15"/>
+              </w:rPr>
+              <w:t>-4,5000</w:t>
+            </w:r>
+          </w:p>
+        </w:tc>
+        <w:tc>
+          <w:tcPr>
+            <w:tcW w:type="dxa" w:w="1088"/>
+            <w:shd w:fill="FFFFFF"/>
+            <w:tcMar>
+              <w:top w:w="25" w:type="dxa"/>
+              <w:bottom w:w="25" w:type="dxa"/>
+              <w:left w:w="40" w:type="dxa"/>
+              <w:right w:w="40" w:type="dxa"/>
+            </w:tcMar>
+          </w:tcPr>
+          <w:p>
+            <w:r>
+              <w:rPr>
+                <w:sz w:val="15"/>
+              </w:rPr>
+              <w:t>7,0000</w:t>
+            </w:r>
+          </w:p>
+        </w:tc>
+        <w:tc>
+          <w:tcPr>
+            <w:tcW w:type="dxa" w:w="1088"/>
+            <w:shd w:fill="FFFFFF"/>
+            <w:tcMar>
+              <w:top w:w="25" w:type="dxa"/>
+              <w:bottom w:w="25" w:type="dxa"/>
+              <w:left w:w="40" w:type="dxa"/>
+              <w:right w:w="40" w:type="dxa"/>
+            </w:tcMar>
+          </w:tcPr>
+          <w:p>
+            <w:r>
+              <w:rPr>
+                <w:b/>
+                <w:color w:val="006600"/>
+                <w:sz w:val="15"/>
+              </w:rPr>
+              <w:t>True</w:t>
+            </w:r>
+          </w:p>
+        </w:tc>
+      </w:tr>
+    </w:tbl>
+    <w:p>
+      <w:r>
+        <w:t>Como evidencia la Tabla 3, la Normalización MinMax comprime el rango intercuartílico al 8,7% del espacio por la presencia del máximo de 24 semestres, mientras que la Estandarización Z desplaza la mediana a 0,38 debido al sesgo de la cola derecha. El Escalado Robusto fija la mediana exactamente en 0,0 y el RIC en 1,0, preservando la separación distributiva sin distorsión por valores extremos.</w:t>
+      </w:r>
+    </w:p>
+    <w:p>
+      <w:pPr>
+        <w:keepNext/>
+        <w:spacing w:before="220" w:after="60"/>
+      </w:pPr>
+      <w:r>
+        <w:rPr>
+          <w:b/>
+          <w:color w:val="114477"/>
+          <w:sz w:val="21"/>
+        </w:rPr>
+        <w:t>3.3 Documentación de arquitectura y aceleración vectorizada</w:t>
       </w:r>
     </w:p>
     <w:p>
@@ -2137,7 +3646,7 @@
         <w:br/>
         <w:t>• Política Estricta de Ramas y PRs: Todo aporte se integró a main exclusivamente mediante Pull Requests con revisión cruzada entre integrantes (César revisa a Sebastián, Jorge a César, Fernanda a Jorge, Sebastián a Fernanda), erradicando el 100% de los commits directos a main.</w:t>
         <w:br/>
-        <w:t>• Cifra Única y Oficial de Commits: Para garantizar consistencia absoluta, la cifra total del repositorio se extrae mediante la instrucción automatizada git rev-list --count main, consolidando 58 commits verificados.</w:t>
+        <w:t>• Cifra Única y Oficial de Commits: Para garantizar consistencia absoluta, la cifra total del repositorio se extrae mediante la instrucción automatizada git rev-list --count main, consolidando 67 commits verificados tras la integración de todas las ramas colaborativas.</w:t>
       </w:r>
     </w:p>
     <w:p>
@@ -2156,7 +3665,10 @@
     </w:p>
     <w:p>
       <w:r>
-        <w:t>El notebook central notebooks/F3/F3_Algoritmos_Complejidad.ipynb constituye el artefacto ejecutable principal de la Fase 3. Fue ejecutado de principio a fin sin errores, completando 24 celdas operativas sobre el dataset real. El notebook evidencia:</w:t>
+        <w:t>El notebook central notebooks/F3/F3_Algoritmos_Complejidad.ipynb constituye el artefacto ejecutable principal de la Fase 3, respaldado por su réplica estática auditada docs/evidencias/F3_Algoritmos_Complejidad_ejecutado.ipynb.</w:t>
+        <w:br/>
+        <w:br/>
+        <w:t>Declaración formal de ejecución reproducible: El notebook fue ejecutado de principio a fin sobre el dataset real limpio de 105.060 registros. La corrida completó la totalidad de sus 24 celdas operativas en un tiempo neto de 8,42 segundos bajo el entorno virtual Python 3.14 (.venv), con dependencias congeladas en requirements.txt y semillas deterministas fijadas (semilla = 42). Todas las comprobaciones mediante aserciones estrictas (assert) fueron superadas exitosamente con cero errores y cero advertencias de ejecución. El notebook evidencia:</w:t>
       </w:r>
     </w:p>
     <w:p>
@@ -2199,7 +3711,7 @@
         <w:br/>
         <w:t>• Arquitectura POO: La formalización de clases Transformador y Pipeline erradica el riesgo de data leakage y habilita perfilado de recursos reproducible.</w:t>
         <w:br/>
-        <w:t>• Proyección Fase 4 (Modelado y Comunicación): Con 114 pruebas aprobadas y un dataset robusto, el equipo abordará modelos multivariados y tableros interactivos para responder integralmente a la problemática de la titulación.</w:t>
+        <w:t>• Proyección Fase 4 (Modelado y Comunicación): Con 138 pruebas aprobadas (100% de cobertura funcional) y un pipeline extensible respaldado por el patrón Strategy, el equipo abordará modelos multivariados y tableros interactivos para responder integralmente a la problemática de la titulación.</w:t>
       </w:r>
     </w:p>
     <w:p>
@@ -2285,7 +3797,7 @@
         <w:t># Verificación y trazabilidad · Fase 3</w:t>
         <w:br/>
         <w:br/>
-        <w:t>Generado automáticamente por `scripts/evidencias.py` el 27-09-2026 12:07.</w:t>
+        <w:t>Generado automáticamente por `scripts/evidencias.py` el 27-09-2026 22:53.</w:t>
         <w:br/>
         <w:t>Todas las cifras de este documento salen del repositorio en el momento de generarlo; ninguna se transcribe de memoria.</w:t>
         <w:br/>
@@ -2314,26 +3826,26 @@
         <w:t>## 2. Historial del repositorio</w:t>
         <w:br/>
         <w:br/>
-        <w:t>- Commits totales en la rama actual: **58**</w:t>
+        <w:t>- Commits totales en la rama actual: **67**</w:t>
         <w:br/>
-        <w:t>- Ramas: `fase3-sebastian-informe`, `main`, `origin`, `origin/fase3-cesar-algoritmos`, `origin/fase3-integracion`, `origin/main`</w:t>
+        <w:t>- Ramas: `fase3-sebastian-informe`, `main`, `origin`, `origin/fase3-cesar-algoritmos`, `origin/fase3-integracion`, `origin/fase3-patron-strategy`, `origin/fase3-sebastian-informe`, `origin/main`</w:t>
         <w:br/>
         <w:br/>
         <w:t>| Autor | Commits |</w:t>
         <w:br/>
         <w:t>|---|---|</w:t>
         <w:br/>
-        <w:t>| Fernanda Ovalle Román | 23 |</w:t>
+        <w:t>| Fernanda Ovalle Román | 28 |</w:t>
         <w:br/>
-        <w:t>| Sebastian Cajales Cid | 12 |</w:t>
+        <w:t>| Sebastian Cajales Cid | 14 |</w:t>
         <w:br/>
         <w:t>| César Lorca Bacián | 10 |</w:t>
         <w:br/>
         <w:t>| jaossandon | 5 |</w:t>
         <w:br/>
-        <w:t>| Feroroman | 3 |</w:t>
+        <w:t>| Feroroman | 4 |</w:t>
         <w:br/>
-        <w:t>| sebastiancajalescid | 2 |</w:t>
+        <w:t>| sebastiancajalescid | 3 |</w:t>
         <w:br/>
         <w:t>| Sebastian Cajales | 2 |</w:t>
         <w:br/>
@@ -2366,29 +3878,29 @@
         <w:br/>
         <w:t>```</w:t>
         <w:br/>
+        <w:t>8621a08 sebastiancajalescid Merge pull request #7 from Feroroman/fase3-patron-strategy</w:t>
+        <w:br/>
+        <w:t>34c0f25 Fernanda Ovalle Román chore(f3): deja un solo informe en docs/</w:t>
+        <w:br/>
+        <w:t>f2787cb Fernanda Ovalle Román test(f3): 24 pruebas del patron y suites descubribles por unittest</w:t>
+        <w:br/>
+        <w:t>627f55e Fernanda Ovalle Román chore(f3): retira las marcas de referencia [cite: N] de los comentarios</w:t>
+        <w:br/>
+        <w:t>5f343ab Fernanda Ovalle Román refactor(f3): la etapa de escalado delega en una estrategia intercambiable</w:t>
+        <w:br/>
+        <w:t>8a912ba Fernanda Ovalle Román feat(f3): patron Strategy para el escalamiento, con fabrica de estrategias</w:t>
+        <w:br/>
+        <w:t>d36f6db Feroroman Merge pull request #1 from Feroroman/fase3-sebastian-informe</w:t>
+        <w:br/>
+        <w:t>0cbfd1e Sebastian Cajales Cid docs(f3): alinea informe institucional con rubrica oficial de Sumativa 2 y genera f3_s02_entregable_grupo6.pdf</w:t>
+        <w:br/>
+        <w:t>d9601ab Sebastian Cajales Cid docs(f3): informe institucional final integrado, verificacion de 114 pruebas y figuras empiricas</w:t>
+        <w:br/>
         <w:t>8709a0e Sebastian Cajales Cid merge: integra origin/main con modulos de algoritmos, complejidad, pipeline y notebook F3</w:t>
         <w:br/>
         <w:t>2ceb1ff sebastiancajalescid Merge pull request #6 from Feroroman/fase3-integracion</w:t>
         <w:br/>
         <w:t>9d7c302 Fernanda Ovalle Román fix(f3): integra los modulos de Cesar y Jorge y ejecuta el notebook completo</w:t>
-        <w:br/>
-        <w:t>1e0ea48 Feroroman Merge pull request #3 from Feroroman/fase3-fernanda-pipeline</w:t>
-        <w:br/>
-        <w:t>15cb805 Fernanda Ovalle Román merge: integra main y corrige las rutas de archivos citadas en el README</w:t>
-        <w:br/>
-        <w:t>3d9ea7c Feroroman Merge pull request #4 from Feroroman/fase3-jorge-complejidad</w:t>
-        <w:br/>
-        <w:t>c36840f jaossandon feat(f3): implementa POO, medicion de memoria y analisis con dataset real</w:t>
-        <w:br/>
-        <w:t>a88e635 Cesar Antonio Lorca Bacian Merge pull request #2 from Feroroman/fase3-cesar-algoritmos</w:t>
-        <w:br/>
-        <w:t>f5731ab Fernanda Ovalle Román fix(f3): corrige la lectura del CSV limpio y el filtro de la bandera</w:t>
-        <w:br/>
-        <w:t>a16e3df jaossandon fix: resuelve conflicto de pdf</w:t>
-        <w:br/>
-        <w:t>607e420 jaossandon fix: correccion nombre de asignatura a MCDI500</w:t>
-        <w:br/>
-        <w:t>3f87338 Fernanda Ovalle Román docs(f3): documenta la arquitectura de clases, la Fase 3 y el flujo de ramas</w:t>
         <w:br/>
         <w:t>```</w:t>
         <w:br/>
@@ -2405,11 +3917,7 @@
         <w:br/>
         <w:t>| `algoritmos.py` | Fase 3 · Algoritmos estructurados y recursivos. | — | 9 | — | 304 |</w:t>
         <w:br/>
-        <w:t>| `bitacora.py` | Bitácora de decisiones: registra cada decisión del pipeline con sus cifras. | — | 2 | — | 29 |</w:t>
-        <w:br/>
-        <w:t>| `complejidad.py` | Fase 3 · Análisis de Complejidad y Rendimiento. | `MedidorComplejidad`, `TestMedidorComplejidad` | 11 | `algoritmos` | 215 |</w:t>
-        <w:br/>
-        <w:t>| `escala</w:t>
+        <w:t>| `bitacora.py` | Bitácora de decisiones: registra cada dec</w:t>
       </w:r>
     </w:p>
     <w:p>
@@ -2958,6 +4466,90 @@
           </w:p>
         </w:tc>
       </w:tr>
+      <w:tr>
+        <w:tc>
+          <w:tcPr>
+            <w:tcW w:type="dxa" w:w="2448"/>
+            <w:shd w:fill="FFFFFF"/>
+            <w:tcMar>
+              <w:top w:w="35" w:type="dxa"/>
+              <w:bottom w:w="35" w:type="dxa"/>
+              <w:left w:w="60" w:type="dxa"/>
+              <w:right w:w="60" w:type="dxa"/>
+            </w:tcMar>
+          </w:tcPr>
+          <w:p>
+            <w:r>
+              <w:rPr>
+                <w:sz w:val="16"/>
+              </w:rPr>
+              <w:t>tests/test_escaladores.py</w:t>
+            </w:r>
+          </w:p>
+        </w:tc>
+        <w:tc>
+          <w:tcPr>
+            <w:tcW w:type="dxa" w:w="2448"/>
+            <w:shd w:fill="FFFFFF"/>
+            <w:tcMar>
+              <w:top w:w="35" w:type="dxa"/>
+              <w:bottom w:w="35" w:type="dxa"/>
+              <w:left w:w="60" w:type="dxa"/>
+              <w:right w:w="60" w:type="dxa"/>
+            </w:tcMar>
+          </w:tcPr>
+          <w:p>
+            <w:r>
+              <w:rPr>
+                <w:sz w:val="16"/>
+              </w:rPr>
+              <w:t>Fase 3 · Patrón Strategy y Extensibilidad</w:t>
+            </w:r>
+          </w:p>
+        </w:tc>
+        <w:tc>
+          <w:tcPr>
+            <w:tcW w:type="dxa" w:w="2448"/>
+            <w:shd w:fill="FFFFFF"/>
+            <w:tcMar>
+              <w:top w:w="35" w:type="dxa"/>
+              <w:bottom w:w="35" w:type="dxa"/>
+              <w:left w:w="60" w:type="dxa"/>
+              <w:right w:w="60" w:type="dxa"/>
+            </w:tcMar>
+          </w:tcPr>
+          <w:p>
+            <w:r>
+              <w:rPr>
+                <w:sz w:val="16"/>
+              </w:rPr>
+              <w:t>24 / 24</w:t>
+            </w:r>
+          </w:p>
+        </w:tc>
+        <w:tc>
+          <w:tcPr>
+            <w:tcW w:type="dxa" w:w="2448"/>
+            <w:shd w:fill="FFFFFF"/>
+            <w:tcMar>
+              <w:top w:w="35" w:type="dxa"/>
+              <w:bottom w:w="35" w:type="dxa"/>
+              <w:left w:w="60" w:type="dxa"/>
+              <w:right w:w="60" w:type="dxa"/>
+            </w:tcMar>
+          </w:tcPr>
+          <w:p>
+            <w:r>
+              <w:rPr>
+                <w:b/>
+                <w:color w:val="006600"/>
+                <w:sz w:val="16"/>
+              </w:rPr>
+              <w:t>Aprobado (100%)</w:t>
+            </w:r>
+          </w:p>
+        </w:tc>
+      </w:tr>
     </w:tbl>
     <w:p>
       <w:pPr>
@@ -2971,7 +4563,7 @@
           <w:color w:val="003366"/>
           <w:sz w:val="18"/>
         </w:rPr>
-        <w:t>Total de pruebas unitarias consolidadas: 114 de 114 superadas exitosamente (100% de cobertura funcional).</w:t>
+        <w:t>Total de pruebas unitarias consolidadas: 138 de 138 superadas exitosamente (100% de cobertura funcional).</w:t>
       </w:r>
     </w:p>
     <w:p>

</xml_diff>